<commit_message>
Highlight recently modified academic content in red
Made-with: Cursor
</commit_message>
<xml_diff>
--- a/第二章_杂技历史书写（汉至隋唐）_格式统一版.docx
+++ b/第二章_杂技历史书写（汉至隋唐）_格式统一版.docx
@@ -38,6 +38,7 @@
         <w:rPr>
           <w:rFonts w:ascii="宋体" w:hAnsi="宋体"/>
           <w:sz w:val="24"/>
+          <w:color w:val="FF0000"/>
         </w:rPr>
         <w:t>秦汉文献中常将“角抵”与“百戏”混用或并提。随着演艺形态的发展，汉代以后“角抵”范畴逐渐内缩，单指力量相较的竞技；而“百戏”则由最初的数量修饰词，演变为涵盖杂技、幻术、动物戏等综合性演出的总称。《隋书·音乐志》将百戏定性为“秦角抵之流”，这种名实的消长与界定，本身即构成了历代乐志书写的重要线索。</w:t>
       </w:r>
@@ -97,7 +98,7 @@
       <w:r>
         <w:rPr>
           <w:rFonts w:ascii="楷体" w:eastAsia="楷体" w:hAnsi="楷体"/>
-          <w:color w:val="000000"/>
+          <w:color w:val="FF0000"/>
           <w:sz w:val="24"/>
         </w:rPr>
         <w:t>（一）政治仪轨与杂技书写的依附性</w:t>
@@ -156,7 +157,7 @@
       <w:r>
         <w:rPr>
           <w:rFonts w:ascii="楷体" w:eastAsia="楷体" w:hAnsi="楷体"/>
-          <w:color w:val="000000"/>
+          <w:color w:val="FF0000"/>
           <w:sz w:val="24"/>
         </w:rPr>
         <w:t>（二）朝贡语境与域外技艺的政治化书写</w:t>
@@ -261,7 +262,7 @@
       <w:r>
         <w:rPr>
           <w:rFonts w:ascii="楷体" w:eastAsia="楷体" w:hAnsi="楷体"/>
-          <w:color w:val="000000"/>
+          <w:color w:val="FF0000"/>
           <w:sz w:val="24"/>
         </w:rPr>
         <w:t>（三）宴享空间与仪典百戏的实录性记录</w:t>
@@ -342,6 +343,7 @@
         <w:rPr>
           <w:rFonts w:ascii="宋体" w:hAnsi="宋体"/>
           <w:sz w:val="24"/>
+          <w:color w:val="FF0000"/>
         </w:rPr>
         <w:t>百戏作为以视觉为主的宴乐演出，其强烈的观赏性不仅契合了汉代帝国夸示国力、营造奇观的需要，也促使文献书写产生了一种“视觉化趋向”：从汉赋的辞藻铺陈，转向对尺寸、空间与动作细节的实录性记载。除文字文献外，汉画像石、壁画、陶俑等图像与实物遗存亦构成了平行的“图像书写”。乐舞百戏图是汉画像石的常见主题，常与宴饮、庖厨图同列，以直观的视觉面貌填补了文字记录在展演空间与使用范围上的留白，二者形成了互证互补的关系。</w:t>
       </w:r>
@@ -355,6 +357,7 @@
         <w:rPr>
           <w:rFonts w:ascii="宋体" w:hAnsi="宋体"/>
           <w:sz w:val="24"/>
+          <w:color w:val="FF0000"/>
         </w:rPr>
         <w:t xml:space="preserve">汉代宴享用乐在制度上常归入“黄门鼓吹”或“散乐”名下，百戏作为散乐之一，在司马彪《续汉书·礼乐志》刘昭注引蔡质《汉仪》中即以“九宾散乐”之名与朝会仪程同载，所述舍利兽、鱼龙、高絙等节目与《汉官典仪》所记正月朝贺百戏相印证，共同构成汉代朝会宴享中百戏的仪式性书写。</w:t>
       </w:r>
@@ -394,7 +397,7 @@
       <w:r>
         <w:rPr>
           <w:rFonts w:ascii="楷体" w:eastAsia="楷体" w:hAnsi="楷体"/>
-          <w:color w:val="000000"/>
+          <w:color w:val="FF0000"/>
           <w:sz w:val="24"/>
         </w:rPr>
         <w:t>（一）官署乐制与百戏的制度化接纳</w:t>
@@ -493,7 +496,7 @@
       <w:r>
         <w:rPr>
           <w:rFonts w:ascii="楷体" w:eastAsia="楷体" w:hAnsi="楷体"/>
-          <w:color w:val="000000"/>
+          <w:color w:val="FF0000"/>
           <w:sz w:val="24"/>
         </w:rPr>
         <w:t>（二）禁令与实践：杂技在宫廷宴享中的矛盾书写</w:t>
@@ -623,7 +626,7 @@
       <w:r>
         <w:rPr>
           <w:rFonts w:ascii="楷体" w:eastAsia="楷体" w:hAnsi="楷体"/>
-          <w:color w:val="000000"/>
+          <w:color w:val="FF0000"/>
           <w:sz w:val="24"/>
         </w:rPr>
         <w:t>（三）物质文化视角下的百戏衣饰书写</w:t>
@@ -725,6 +728,7 @@
         <w:rPr>
           <w:rFonts w:ascii="宋体" w:hAnsi="宋体"/>
           <w:sz w:val="24"/>
+          <w:color w:val="FF0000"/>
         </w:rPr>
         <w:t xml:space="preserve">隋唐时百戏在宴乐中的“重兴”除正史与《教坊记》外，亦见于《明皇杂录》《乐府杂录》等对酺宴、广场百戏的记载，杂技书写的载体与层次更为丰富。</w:t>
       </w:r>
@@ -737,7 +741,7 @@
       <w:r>
         <w:rPr>
           <w:rFonts w:ascii="楷体" w:eastAsia="楷体" w:hAnsi="楷体"/>
-          <w:color w:val="000000"/>
+          <w:color w:val="FF0000"/>
           <w:sz w:val="24"/>
         </w:rPr>
         <w:t>（一）节庆宴享与百戏的宏大叙事</w:t>
@@ -904,7 +908,15 @@
           <w:rFonts w:ascii="宋体" w:hAnsi="宋体"/>
           <w:sz w:val="24"/>
         </w:rPr>
-        <w:t>长了悬停的时间感，使旁观者的紧张感随之积累，而后“垂手抱竿，翻身而下”以干脆利落的动作结束全程；最后写反响：乐人放下手中乐器伏地欢呼，百官拜庆，中使宣旨揭开谜底：“其实乃小儿也。”书写者有意将小儿的真实身份保留到最后一句才予以揭示，使整段叙述形成了“设悬、展演、揭晓”的完整结构。小儿体态轻便、身形灵活，适合在竿顶完成倒立和无手悬停等对平衡能力要求极高的动作，而教坊特意将其装扮为成年女妓的样貌混入队列，本身就是一种经过设计的表演策略；观众在不知情的状态下观看高难技艺，等到谜底揭开，得知表演者竟是年幼孩童，惊叹之情随之加倍。这种叙述方式已不再是对演出事实的简单记录，而是带有明确的写作构思和情感引导，说明杂技书写在盛唐时期已从单纯的制度性记录发展为兼具文学性与现场感的叙事，这种带有明确写作构思与情感引导的记述表明，盛唐时期的杂技书写已深刻介入了观演双方的心理互动，从单纯的制度性记录蜕变为兼具文学性与现场感的叙事。</w:t>
+        <w:t>长了悬停的时间感，使旁观者的紧张感随之积累，而后“垂手抱竿，翻身而下”以干脆利落的动作结束全程；最后写反响：乐人放下手中乐器伏地欢呼，百官拜庆，中使宣旨揭开谜底：“其实乃小儿也。”书写者有意将小儿的真实身份保留到最后一句才予以揭示，使整段叙述形成了“设悬、展演、揭晓”的完整结构。小儿体态轻便、身形灵活，适合在竿顶完成倒立和无手悬停等对平衡能力要求极高的动作，而教坊特意将其装扮为成年女妓的样貌混入队列，本身就是一种经过设计的表演策略；观众在不知情的状态下观看高难技艺，等到谜底揭开，得知表演者竟是年幼孩童，惊叹之情随之加倍。这种叙述方式已不再是对演出事实的简单记录，而是带有明确的写作构思和情感引导，说明杂技书写在盛唐时期已从单纯的制度性记录发展为兼具文学性与现场感的叙事，</w:t>
+      </w:r>
+      <w:r>
+        <w:rPr>
+          <w:rFonts w:ascii="宋体" w:hAnsi="宋体"/>
+          <w:sz w:val="24"/>
+          <w:color w:val="FF0000"/>
+        </w:rPr>
+        <w:t xml:space="preserve">这种带有明确写作构思与情感引导的记述表明，盛唐时期的杂技书写已深刻介入了观演双方的心理互动，从单纯的制度性记录蜕变为兼具文学性与现场感的叙事。</w:t>
       </w:r>
     </w:p>
     <w:p>
@@ -954,7 +966,7 @@
       <w:r>
         <w:rPr>
           <w:rFonts w:ascii="楷体" w:eastAsia="楷体" w:hAnsi="楷体"/>
-          <w:color w:val="000000"/>
+          <w:color w:val="FF0000"/>
           <w:sz w:val="24"/>
         </w:rPr>
         <w:t>（二）国家衰落与杂技书写的情感转向</w:t>

</xml_diff>

<commit_message>
Add 3 new red-highlighted paragraphs from Wei Yunjie reference
1. Han dynasty: 《史记·大宛列传》"自此始" as institutional origin
2. Wei-Jin: Liang Wu Di court百戏 program list as evidence
3. Sui dynasty: escalation from 大业三年 to 大业六年 "振古无比"

Made-with: Cursor
</commit_message>
<xml_diff>
--- a/第二章_杂技历史书写（汉至隋唐）_格式统一版.docx
+++ b/第二章_杂技历史书写（汉至隋唐）_格式统一版.docx
@@ -156,6 +156,20 @@
       </w:pPr>
       <w:r>
         <w:rPr>
+          <w:rFonts w:ascii="宋体" w:hAnsi="宋体"/>
+          <w:sz w:val="24"/>
+          <w:color w:val="FF0000"/>
+        </w:rPr>
+        <w:t xml:space="preserve">《史记·大宛列传》的记载则为汉代百戏书写提供了另一重要线索。司马迁载武帝招待外国宾客时，“大角抵，出奇戏诸怪物，多聚观者……而觳抵奇戏岁增变，甚盛益兴，自此始”。“自此始”三字值得注意：它标志着正史首次以编年的方式，为百戏演出的制度化兴盛确立了一个明确的时间起点。武帝朝以百戏夸示外宾的做法自此成为常例，并被后世史家反复援引，成为汉代杂技书写中被征引频率最高的文本之一。</w:t>
+      </w:r>
+    </w:p>
+    <w:p>
+      <w:pPr>
+        <w:spacing w:line="400" w:lineRule="exact"/>
+        <w:ind w:firstLine="480"/>
+      </w:pPr>
+      <w:r>
+        <w:rPr>
           <w:rFonts w:ascii="楷体" w:eastAsia="楷体" w:hAnsi="楷体"/>
           <w:color w:val="FF0000"/>
           <w:sz w:val="24"/>
@@ -561,6 +575,20 @@
       </w:pPr>
       <w:r>
         <w:rPr>
+          <w:rFonts w:ascii="楷体" w:eastAsia="楷体" w:hAnsi="楷体"/>
+          <w:sz w:val="24"/>
+          <w:color w:val="FF0000"/>
+        </w:rPr>
+        <w:t xml:space="preserve">南梁武帝朝会宴的百戏曲目可为这种“禁而不止”提供更直接的佐证。据《隋书·音乐志》所载，梁元会宴乐除鞦、铎、拂、巾四种杂舞与白综外，其余演出项目几乎全为百戏，包括舞盘伎、舞轮伎、须弥山伎、跳铃伎、跳剑伎、掷倒伎、猕猴幢伎、缘高絘伎、变黄龙弄龟伎等三十余种，是现存文献中对单次朝会百戏节目记录最为完整的清单。这份清单的史料价值在于：它以条列的方式逐一标明每项伎艺的名目，使后人得以窥见南朝宫廷百戏在节目编排上已具有高度的组织性与多样性，其制度化程度远非零散的禁令所能遏止。</w:t>
+      </w:r>
+    </w:p>
+    <w:p>
+      <w:pPr>
+        <w:spacing w:line="400" w:lineRule="exact"/>
+        <w:ind w:firstLine="480"/>
+      </w:pPr>
+      <w:r>
+        <w:rPr>
           <w:rFonts w:ascii="宋体" w:hAnsi="宋体"/>
           <w:sz w:val="24"/>
         </w:rPr>
@@ -804,6 +832,20 @@
           <w:sz w:val="24"/>
         </w:rPr>
         <w:t>从演出背景来看，此次百戏汇演的直接目的是“夸之”，即炀帝意图以百戏的宏大场面向突厥来使展示国力。“总追四方散乐，大集东都”一句点明了演出人员的来源：并非仅依靠东都洛阳本地的太常乐署班底，而是将分散在各地的民间散乐全部征集而来。这一做法本身说明了隋代散乐百戏的存在方式：大量技艺精湛的杂技艺人平时分散于各地，并不完全依附于宫廷乐署体制，只有朝廷以行政力量统一征召，才能汇聚成如此大的演出规模。也就是说，宫廷百戏的兴盛并非单纯依靠官方机构的内部培养，而是建立在广泛的民间技艺基础之上。</w:t>
+      </w:r>
+    </w:p>
+    <w:p>
+      <w:pPr>
+        <w:spacing w:line="400" w:lineRule="exact"/>
+        <w:ind w:firstLine="480"/>
+      </w:pPr>
+      <w:r>
+        <w:rPr>
+          <w:rFonts w:ascii="宋体" w:hAnsi="宋体"/>
+          <w:sz w:val="24"/>
+          <w:color w:val="FF0000"/>
+        </w:rPr>
+        <w:t xml:space="preserve">此后数年间，隋炀帝以百戏宴外蓩的规模持续升级。大业三年秋，宴启民及其部落三千五百人，奏百戏之乐；五年六月，于观风行殿盛陈文物，奏九部乐，设鱼龙蔓延，蛮夷陪列者三十余国；六年正月，诸夷大献方物，突厥启民以下皆国主亲来朝贺，“乃于天津街盛陈百戏，自海内凡有奇伎，无不总萃……金石匈革之声，闻数十里外。弹弦擫管以上，一万八千人。大列炬火，光烛天地，百戏之盛，振古无比。自是每年以为常”。“振古无比”四字是史家对百戏演出规模所作的绝对化评价，它不仅标示了隋代百戏在演出史上的巅峰地位，也折射出书写者面对这一前所未有的盛况时难以自抑的惊叹——杂技书写在此已不止于客观记录，而开始带有鲜明的情感色彩。</w:t>
       </w:r>
     </w:p>
     <w:p>

</xml_diff>

<commit_message>
Remove explanatory colons and unnecessary emphasis quotes
- Replaced ~30 explanatory colons (：) with commas or periods in analytical sentences
- Kept colons only before direct quotations and classical text citations
- Removed ~22 unnecessary emphasis quotes around concepts like 视觉化趋向、图像书写、借艺言政、禁而不止、重兴 etc.
- Kept quotes around ancient text citations, technical terms, and proper nouns
- Fixed heading: （二）禁令与实践：杂技在宫廷宴享中的矛盾书写 → （二）禁令与实践之间的矛盾书写

Made-with: Cursor
</commit_message>
<xml_diff>
--- a/第二章_杂技历史书写（汉至隋唐）_格式统一版.docx
+++ b/第二章_杂技历史书写（汉至隋唐）_格式统一版.docx
@@ -87,7 +87,7 @@
           <w:rFonts w:ascii="宋体" w:hAnsi="宋体"/>
           <w:sz w:val="24"/>
         </w:rPr>
-        <w:t>汉代是中国杂技制度化发展的肇始阶段。这一时期，杂技的相关记载散见于正史纪传、注疏及政书之中，从未以独立篇章的形式出现，而是附着于朝贡往来、宫廷宴飨、朝会仪典等政治事件的记录之中。这一文献现象本身即具有重要的认识价值：它既说明杂技在时人的知识分类体系中尚未获得自足的门类地位，也表明彼时书写者关注的并非技艺本身，而是技艺在特定政治情境中被展演这一事实及其所承载的礼仪与外交功能。与后世魏晋南北朝禁而不止的矛盾性记载、隋唐全景铺陈式的盛况描写不同，汉代杂技的书写始终围绕国家礼仪与对外交流两条线索展开，呈现出鲜明的制度化特征。</w:t>
+        <w:t>汉代是中国杂技制度化发展的肇始阶段。这一时期，杂技的相关记载散见于正史纪传、注疏及政书之中，从未以独立篇章的形式出现，而是附着于朝贡往来、宫廷宴飨、朝会仪典等政治事件的记录之中。这一文献现象本身即具有重要的认识价值，它既说明杂技在时人的知识分类体系中尚未获得自足的门类地位，也表明彼时书写者关注的并非技艺本身，而是技艺在特定政治情境中被展演这一事实及其所承载的礼仪与外交功能。与后世魏晋南北朝禁而不止的矛盾性记载、隋唐全景铺陈式的盛况描写不同，汉代杂技的书写始终围绕国家礼仪与对外交流两条线索展开，呈现出鲜明的制度化特征。</w:t>
       </w:r>
     </w:p>
     <w:p>
@@ -127,7 +127,7 @@
           <w:rFonts w:ascii="宋体" w:hAnsi="宋体"/>
           <w:sz w:val="24"/>
         </w:rPr>
-        <w:t>《史记·李斯列传》载秦二世“居甘泉宫，方作觳抵优俳之观”，是较早将杂技纳入正史的记录。细审文脉可知，此条记载的叙事重心并非觳抵表演的具体内容。太史公不曾描摹任何技艺细节，其着意之处在于以秦二世沉溺声色的行为，映衬其荒于朝政、终至亡国的结局。杂技在此仅充当政治评价的注脚，是正史“借艺言政”笔法的早期范例。</w:t>
+        <w:t>《史记·李斯列传》载秦二世“居甘泉宫，方作觳抵优俳之观”，是较早将杂技纳入正史的记录。细审文脉可知，此条记载的叙事重心并非觳抵表演的具体内容。太史公不曾描摹任何技艺细节，其着意之处在于以秦二世沉溺声色的行为，映衬其荒于朝政、终至亡国的结局。杂技在此仅充当政治评价的注脚，是正史借艺言政笔法的早期范例。</w:t>
       </w:r>
       <w:r>
         <w:rPr>
@@ -146,7 +146,7 @@
           <w:rFonts w:ascii="宋体" w:hAnsi="宋体"/>
           <w:sz w:val="24"/>
         </w:rPr>
-        <w:t>至《汉书》，百戏的相关记载明显增多，但这种依附性并未改变，反而更加鲜明。汉武帝以降，大一统王朝日趋稳固，宫廷朝贺与宴飨活动成为彰显国力、接待外邦的重要场合，杂技作为百戏之核心内容被纳入其中。《汉书》对这些场景的记录，本质上是对礼乐制度与政治秩序的文本建构：史家之所以提及百戏，是因为它构成了朝会仪程的实际环节；记百戏即记礼仪，记礼仪即记制度。杂技的技艺本身并非书写重心，其作为国家仪典组成部分的制度功能，才是史家措意所在。</w:t>
+        <w:t>至《汉书》，百戏的相关记载明显增多，但这种依附性并未改变，反而更加鲜明。汉武帝以降，大一统王朝日趋稳固，宫廷朝贺与宴飨活动成为彰显国力、接待外邦的重要场合，杂技作为百戏之核心内容被纳入其中。《汉书》对这些场景的记录，本质上是对礼乐制度与政治秩序的文本建构，史家之所以提及百戏，是因为它构成了朝会仪程的实际环节；记百戏即记礼仪，记礼仪即记制度。杂技的技艺本身并非书写重心，其作为国家仪典组成部分的制度功能，才是史家措意所在。</w:t>
       </w:r>
     </w:p>
     <w:p>
@@ -160,7 +160,7 @@
           <w:sz w:val="24"/>
           <w:color w:val="FF0000"/>
         </w:rPr>
-        <w:t xml:space="preserve">《史记·大宛列传》的记载则为汉代百戏书写提供了另一重要线索。司马迁载武帝招待外国宾客时，“大角抵，出奇戏诸怪物，多聚观者……而觳抵奇戏岁增变，甚盛益兴，自此始”。“自此始”三字值得注意：它标志着正史首次以编年的方式，为百戏演出的制度化兴盛确立了一个明确的时间起点。武帝朝以百戏夸示外宾的做法自此成为常例，并被后世史家反复援引，成为汉代杂技书写中被征引频率最高的文本之一。</w:t>
+        <w:t>《史记·大宛列传》的记载则为汉代百戏书写提供了另一重要线索。司马迁载武帝招待外国宾客时，“大角抵，出奇戏诸怪物，多聚观者……而觳抵奇戏岁增变，甚盛益兴，自此始”。“自此始”三字值得注意，它标志着正史首次以编年的方式，为百戏演出的制度化兴盛确立了一个明确的时间起点。武帝朝以百戏夸示外宾的做法自此成为常例，并被后世史家反复援引，成为汉代杂技书写中被征引频率最高的文本之一。</w:t>
       </w:r>
     </w:p>
     <w:p>
@@ -226,7 +226,7 @@
           <w:rFonts w:ascii="宋体" w:hAnsi="宋体"/>
           <w:sz w:val="24"/>
         </w:rPr>
-        <w:t>此条虽出自三国人鱼豢之手，所述却是汉代已有流传的域外技艺。“奇幻”“巧妙”的措辞，体现了中原人对这类技艺的基本认知。而《后汉书·南蛮·西南夷列传第七十六》则提供了更为完整的史实：</w:t>
+        <w:t>此条虽出自三国人鱼豢之手，所述却是汉代已有流传的域外技艺。奇幻巧妙的措辞，体现了中原人对这类技艺的基本认知。而《后汉书·南蛮·西南夷列传第七十六》则提供了更为完整的史实：</w:t>
       </w:r>
     </w:p>
     <w:p>
@@ -252,20 +252,20 @@
           <w:rFonts w:ascii="宋体" w:hAnsi="宋体"/>
           <w:sz w:val="24"/>
         </w:rPr>
-        <w:t>两处记载可以互证：掸国使者所献的吐火、自支解、跳丸等技艺，系经由西域辗转传入的域外杂技。值得注意的是，《后汉书》这段记载的叙事结构并非单纯罗列技艺，而是将幻术表演与掸国朝贡、安帝元会作乐、封赏赐印等政治事件编织为一体。“自言我海西人。海西即大秦也，掸国西南通大秦”，史家特意交代幻人的身份来源与地理路线，为这批域外技艺标注了空间坐标；“明年元会，安帝作乐于庭”则说明掸国所献幻人已被纳入次年元旦朝会的演出仪程，其在宫廷中的地位由此可见。</w:t>
-      </w:r>
-    </w:p>
-    <w:p>
-      <w:pPr>
-        <w:spacing w:line="400" w:lineRule="exact"/>
-        <w:ind w:firstLine="480"/>
-      </w:pPr>
-      <w:r>
-        <w:rPr>
-          <w:rFonts w:ascii="宋体" w:hAnsi="宋体"/>
-          <w:sz w:val="24"/>
-        </w:rPr>
-        <w:t>换言之，域外杂技在正史中并非作为奇闻逸事被记录，而是被置于朝贡与外交的叙事框架之下。幻人技艺越是“奇幻”“巧妙”，便越能衬托汉王朝吸引远方、威服殊俗的文化辐射力。这种将域外文化元素编入官方叙事的做法，既保存了杂技东传的具体史实，客观上也成为汉代大一统格局与对外开放态势的文本印记。</w:t>
+        <w:t>两处记载可以互证，掸国使者所献的吐火、自支解、跳丸等技艺，系经由西域辗转传入的域外杂技。值得注意的是，《后汉书》这段记载的叙事结构并非单纯罗列技艺，而是将幻术表演与掸国朝贡、安帝元会作乐、封赏赐印等政治事件编织为一体。“自言我海西人。海西即大秦也，掸国西南通大秦”，史家特意交代幻人的身份来源与地理路线，为这批域外技艺标注了空间坐标；“明年元会，安帝作乐于庭”则说明掸国所献幻人已被纳入次年元旦朝会的演出仪程，其在宫廷中的地位由此可见。</w:t>
+      </w:r>
+    </w:p>
+    <w:p>
+      <w:pPr>
+        <w:spacing w:line="400" w:lineRule="exact"/>
+        <w:ind w:firstLine="480"/>
+      </w:pPr>
+      <w:r>
+        <w:rPr>
+          <w:rFonts w:ascii="宋体" w:hAnsi="宋体"/>
+          <w:sz w:val="24"/>
+        </w:rPr>
+        <w:t>换言之，域外杂技在正史中并非作为奇闻逸事被记录，而是被置于朝贡与外交的叙事框架之下。幻人技艺越是奇幻巧妙，便越能衬托汉王朝吸引远方、威服殊俗的文化辐射力。这种将域外文化元素编入官方叙事的做法，既保存了杂技东传的具体史实，客观上也成为汉代大一统格局与对外开放态势的文本印记。</w:t>
       </w:r>
     </w:p>
     <w:p>
@@ -332,20 +332,20 @@
           <w:rFonts w:ascii="宋体" w:hAnsi="宋体"/>
           <w:sz w:val="24"/>
         </w:rPr>
-        <w:t>这段文献的价值在于它完整呈现了一次正月朝贺中百戏演出的先后流程：自天子临轩、百官朝贺起，依次为舍利兽戏、激水化鱼、黄龙出水等大型鱼龙变幻之戏，最后以高絙走索收束。就技艺细节而言，“以两大丝绳系两柱间，相去数丈”交代了道具布设与空间规模；“两倡女对舞，行于绳上”点明表演者为女性，且系双人对舞而非单人独技；“对面道逢，切肩不倾”八字尤为传神，两位女伎在悬空绳索上迎面而行，交错时肩臂几乎相触而不失平衡，技艺之精与配合之默契，一览无余。</w:t>
-      </w:r>
-    </w:p>
-    <w:p>
-      <w:pPr>
-        <w:spacing w:line="400" w:lineRule="exact"/>
-        <w:ind w:firstLine="480"/>
-      </w:pPr>
-      <w:r>
-        <w:rPr>
-          <w:rFonts w:ascii="宋体" w:hAnsi="宋体"/>
-          <w:sz w:val="24"/>
-        </w:rPr>
-        <w:t>更需指出的是，高絙在此并非孤立的技艺展示，而是整套朝贺百戏中的一个环节。其前有舍利兽戏铺垫，继以鱼龙变幻营造奇观，高絙压轴则将观赏性推至顶点，其后当接天子封赏之礼收束全程。史家之所以不厌其详地记录每一节目的先后与内容，不是出于对技艺本身的赏鉴兴趣，而是因为这些演出构成了国家朝贺仪程的实际内容；记百戏即记仪典，记仪典即记制度。这正是汉代杂技书写的根本特征：技艺始终被置于礼仪制度的框架之内加以叙述，其被书写的理由，在于它是王朝政治秩序与文化气象的一个组成部分。</w:t>
+        <w:t>这段文献的价值在于它完整呈现了一次正月朝贺中百戏演出的先后流程。自天子临轩、百官朝贺起，依次为舍利兽戏、激水化鱼、黄龙出水等大型鱼龙变幻之戏，最后以高絙走索收束。就技艺细节而言，“以两大丝绳系两柱间，相去数丈”交代了道具布设与空间规模；“两倡女对舞，行于绳上”点明表演者为女性，且系双人对舞而非单人独技；“对面道逢，切肩不倾”八字尤为传神，两位女伎在悬空绳索上迎面而行，交错时肩臂几乎相触而不失平衡，技艺之精与配合之默契，一览无余。</w:t>
+      </w:r>
+    </w:p>
+    <w:p>
+      <w:pPr>
+        <w:spacing w:line="400" w:lineRule="exact"/>
+        <w:ind w:firstLine="480"/>
+      </w:pPr>
+      <w:r>
+        <w:rPr>
+          <w:rFonts w:ascii="宋体" w:hAnsi="宋体"/>
+          <w:sz w:val="24"/>
+        </w:rPr>
+        <w:t>更需指出的是，高絙在此并非孤立的技艺展示，而是整套朝贺百戏中的一个环节。其前有舍利兽戏铺垫，继以鱼龙变幻营造奇观，高絙压轴则将观赏性推至顶点，其后当接天子封赏之礼收束全程。史家之所以不厌其详地记录每一节目的先后与内容，不是出于对技艺本身的赏鉴兴趣，而是因为这些演出构成了国家朝贺仪程的实际内容；记百戏即记仪典，记仪典即记制度。这正是汉代杂技书写的根本特征，即技艺始终被置于礼仪制度的框架之内加以叙述，其被书写的理由，在于它是王朝政治秩序与文化气象的一个组成部分。</w:t>
       </w:r>
     </w:p>
     <w:p>
@@ -359,7 +359,7 @@
           <w:sz w:val="24"/>
           <w:color w:val="FF0000"/>
         </w:rPr>
-        <w:t>百戏作为以视觉为主的宴乐演出，其强烈的观赏性不仅契合了汉代帝国夸示国力、营造奇观的需要，也促使文献书写产生了一种“视觉化趋向”：从汉赋的辞藻铺陈，转向对尺寸、空间与动作细节的实录性记载。除文字文献外，汉画像石、壁画、陶俑等图像与实物遗存亦构成了平行的“图像书写”。乐舞百戏图是汉画像石的常见主题，常与宴饮、庖厨图同列，以直观的视觉面貌填补了文字记录在展演空间与使用范围上的留白，二者形成了互证互补的关系。</w:t>
+        <w:t>百戏作为以视觉为主的宴乐演出，其强烈的观赏性不仅契合了汉代帝国夸示国力、营造奇观的需要，也促使文献书写产生了一种视觉化趋向，从汉赋的辞藻铺陈，转向对尺寸、空间与动作细节的实录性记载。除文字文献外，汉画像石、壁画、陶俑等图像与实物遗存亦构成了平行的图像书写。乐舞百戏图是汉画像石的常见主题，常与宴饮、庖厨图同列，以直观的视觉面貌填补了文字记录在展演空间与使用范围上的留白，二者形成了互证互补的关系。</w:t>
       </w:r>
     </w:p>
     <w:p>
@@ -400,7 +400,7 @@
           <w:rFonts w:ascii="宋体" w:hAnsi="宋体"/>
           <w:sz w:val="24"/>
         </w:rPr>
-        <w:t>魏晋南北朝是杂技书写发生明显转变的时期。与汉代将百戏统摄于朝贺仪典的整体性叙述不同，这一阶段的文献记载呈现出内在的紧张：一方面，禁断百戏的诏令屡见于正史帝纪；另一方面，宫廷演出的实况描写却不绝于书。这种矛盾性记载本身即构成该时段杂技书写的显著特征，折射出百戏在礼乐秩序与宫廷娱乐之间的暧昧位置。与此同时，拓跋鲜卑入主中原后对百戏的制度性接纳，以及南朝帝王亲习杂技的个案，又为这一时期的书写增添了新的面向。</w:t>
+        <w:t>魏晋南北朝是杂技书写发生明显转变的时期。与汉代将百戏统摄于朝贺仪典的整体性叙述不同，这一阶段的文献记载呈现出内在的紧张。一方面，禁断百戏的诏令屡见于正史帝纪；另一方面，宫廷演出的实况描写却不绝于书。这种矛盾性记载本身即构成该时段杂技书写的显著特征，折射出百戏在礼乐秩序与宫廷娱乐之间的暧昧位置。与此同时，拓跋鲜卑入主中原后对百戏的制度性接纳，以及南朝帝王亲习杂技的个案，又为这一时期的书写增添了新的面向。</w:t>
       </w:r>
     </w:p>
     <w:p>
@@ -473,7 +473,7 @@
           <w:rFonts w:ascii="宋体" w:hAnsi="宋体"/>
           <w:sz w:val="24"/>
         </w:rPr>
-        <w:t>首先，从管理归属来看，承担此次增修任务的太乐、总章、鼓吹三署均为北魏朝廷掌管乐舞的正式职能机构。杂技百戏被纳入其职掌范围，表明它并非游离于国家仪典之外的散漫娱乐，而是以官方行政力量加以组织和维系的制度性安排。过往学界在讨论北魏宫廷乐署时，往往侧重其在雅乐恢复方面的努力，但从这条材料来看，乐署的实际职能远不限于此，杂技百戏同样在其运作范围之内。天平二年（535），皇帝又特命时任尚书右仆射、营构大将的高隆之“缮治三署乐器、衣服及百戏之属”，朝廷不惜动用高级行政官员来专门修缮百戏器具与服饰，进一步印证了百戏在北魏宫廷仪典体系中的实际分量。百戏在传统礼乐话语中长期被视作“俳优鄙艺”，其制度地位与它所获得的实际待遇之间的落差，折射出拓跋鲜卑统治者对宫廷娱乐的态度：尽管政治制度层面积极推进汉化、尊崇雅乐，但在娱乐实践中并不以华夏儒者的雅俗判分为约束，对民间俗曲百戏始终保持开放与接纳的姿态。</w:t>
+        <w:t>首先，从管理归属来看，承担此次增修任务的太乐、总章、鼓吹三署均为北魏朝廷掌管乐舞的正式职能机构。杂技百戏被纳入其职掌范围，表明它并非游离于国家仪典之外的散漫娱乐，而是以官方行政力量加以组织和维系的制度性安排。过往学界在讨论北魏宫廷乐署时，往往侧重其在雅乐恢复方面的努力，但从这条材料来看，乐署的实际职能远不限于此，杂技百戏同样在其运作范围之内。天平二年（535），皇帝又特命时任尚书右仆射、营构大将的高隆之“缮治三署乐器、衣服及百戏之属”，朝廷不惜动用高级行政官员来专门修缮百戏器具与服饰，进一步印证了百戏在北魏宫廷仪典体系中的实际分量。百戏在传统礼乐话语中长期被视作俳优鄙艺，其制度地位与它所获得的实际待遇之间的落差，折射出拓跋鲜卑统治者对宫廷娱乐的态度，尽管政治制度层面积极推进汉化、尊崇雅乐，但在娱乐实践中并不以华夏儒者的雅俗判分为约束，对民间俗曲百戏始终保持开放与接纳的姿态。</w:t>
       </w:r>
     </w:p>
     <w:p>
@@ -513,7 +513,7 @@
           <w:color w:val="FF0000"/>
           <w:sz w:val="24"/>
         </w:rPr>
-        <w:t>（二）禁令与实践：杂技在宫廷宴享中的矛盾书写</w:t>
+        <w:t>（二）禁令与实践之间的矛盾书写</w:t>
       </w:r>
     </w:p>
     <w:p>
@@ -579,20 +579,20 @@
           <w:sz w:val="24"/>
           <w:color w:val="FF0000"/>
         </w:rPr>
-        <w:t xml:space="preserve">南梁武帝朝会宴的百戏曲目可为这种“禁而不止”提供更直接的佐证。据《隋书·音乐志》所载，梁元会宴乐除鞦、铎、拂、巾四种杂舞与白综外，其余演出项目几乎全为百戏，包括舞盘伎、舞轮伎、须弥山伎、跳铃伎、跳剑伎、掷倒伎、猕猴幢伎、缘高絘伎、变黄龙弄龟伎等三十余种，是现存文献中对单次朝会百戏节目记录最为完整的清单。这份清单的史料价值在于：它以条列的方式逐一标明每项伎艺的名目，使后人得以窥见南朝宫廷百戏在节目编排上已具有高度的组织性与多样性，其制度化程度远非零散的禁令所能遏止。</w:t>
-      </w:r>
-    </w:p>
-    <w:p>
-      <w:pPr>
-        <w:spacing w:line="400" w:lineRule="exact"/>
-        <w:ind w:firstLine="480"/>
-      </w:pPr>
-      <w:r>
-        <w:rPr>
-          <w:rFonts w:ascii="宋体" w:hAnsi="宋体"/>
-          <w:sz w:val="24"/>
-        </w:rPr>
-        <w:t>卧骑、倒骑、颠骑三项均为马上杂技，表演者须在疾驰的马背上完成仰卧、倒坐、翻转等高难度动作，而表演路线“自东华门驰往神虎门”，横贯宫城，规模不可谓不大。这些技艺被径称为“角抵杂戏之流”，与武帝所禁之“靡丽百戏”实为同类。禁令在前，元会照演在后，两条出自不同文献的记载相互照映，共同勾勒出禁断与实践之间深刻背离的面貌。禁令的措辞借助礼乐话语将百戏归入“靡丽”“淫侈”之列，以正风俗、崇节俭为由加以革除；而宫廷演出的实际延续则表明，百戏在朝会宴飨中所承担的仪典功能与娱乐价值，远非一纸诏书所能抹除。</w:t>
+        <w:t>南梁武帝朝会宴的百戏曲目可为这种禁而不止提供更直接的佐证。据《隋书·音乐志》所载，梁元会宴乐除鞦、铎、拂、巾四种杂舞与白综外，其余演出项目几乎全为百戏，包括舞盘伎、舞轮伎、须弥山伎、跳铃伎、跳剑伎、掷倒伎、猕猴幢伎、缘高絘伎、变黄龙弄龟伎等三十余种，是现存文献中对单次朝会百戏节目记录最为完整的清单。这份清单的史料价值在于，它以条列的方式逐一标明每项伎艺的名目，使后人得以窥见南朝宫廷百戏在节目编排上已具有高度的组织性与多样性，其制度化程度远非零散的禁令所能遏止。</w:t>
+      </w:r>
+    </w:p>
+    <w:p>
+      <w:pPr>
+        <w:spacing w:line="400" w:lineRule="exact"/>
+        <w:ind w:firstLine="480"/>
+      </w:pPr>
+      <w:r>
+        <w:rPr>
+          <w:rFonts w:ascii="宋体" w:hAnsi="宋体"/>
+          <w:sz w:val="24"/>
+        </w:rPr>
+        <w:t>卧骑、倒骑、颠骑三项均为马上杂技，表演者须在疾驰的马背上完成仰卧、倒坐、翻转等高难度动作，而表演路线“自东华门驰往神虎门”，横贯宫城，规模不可谓不大。这些技艺被径称为角抵杂戏之流，与武帝所禁之靡丽百戏实为同类。禁令在前，元会照演在后，两条出自不同文献的记载相互照映，共同勾勒出禁断与实践之间深刻背离的面貌。禁令的措辞借助礼乐话语将百戏归入靡丽淫侈之列，以正风俗、崇节俭为由加以革除；而宫廷演出的实际延续则表明，百戏在朝会宴飨中所承担的仪典功能与娱乐价值，远非一纸诏书所能抹除。</w:t>
       </w:r>
     </w:p>
     <w:p>
@@ -704,7 +704,7 @@
           <w:rFonts w:ascii="宋体" w:hAnsi="宋体"/>
           <w:sz w:val="24"/>
         </w:rPr>
-        <w:t>出帝一望即辨出忠所穿为“百戏衣”，可知百戏服饰在当时已形成相对固定且辨识度极高的形制特征，与日常冠服迥然有别。据文中所述，忠身上所穿为红罗短襦、绣花衣领、碧色细布、锦缎滚边，红与碧大胆并置，锦、绣、罗等不同质地的面料拼合使用，整体效果浓艳纷繁、华丽夺目。这与朝廷冠服强调等级有序、色彩节制的规制截然不同。出帝斥之以“朝廷衣冠，应有常式”，恰好从反面勾勒出百戏衣的特殊定位：它自外于朝廷服制的等级序列，遵循的是另一套以色彩张力和视觉效果为导向的审美逻辑，服务于舞台表演中远距离观赏的需要。忠以“歌衣舞服，是臣所愿”作答，语虽戏谑，却也折射出百戏服饰在当时社会中的某种感染力，其绮丽绚烂的视觉效果足以令人心生向往，甚至不惜逾越服制。</w:t>
+        <w:t>出帝一望即辨出忠所穿为“百戏衣”，可知百戏服饰在当时已形成相对固定且辨识度极高的形制特征，与日常冠服迥然有别。据文中所述，忠身上所穿为红罗短襦、绣花衣领、碧色细布、锦缎滚边，红与碧大胆并置，锦、绣、罗等不同质地的面料拼合使用，整体效果浓艳纷繁、华丽夺目。这与朝廷冠服强调等级有序、色彩节制的规制截然不同。出帝斥之以“朝廷衣冠，应有常式”，恰好从反面勾勒出百戏衣的特殊定位，它自外于朝廷服制的等级序列，遵循的是另一套以色彩张力和视觉效果为导向的审美逻辑，服务于舞台表演中远距离观赏的需要。忠以“歌衣舞服，是臣所愿”作答，语虽戏谑，却也折射出百戏服饰在当时社会中的某种感染力，其绮丽绚烂的视觉效果足以令人心生向往，甚至不惜逾越服制。</w:t>
       </w:r>
     </w:p>
     <w:p>
@@ -744,7 +744,7 @@
           <w:rFonts w:ascii="宋体" w:hAnsi="宋体"/>
           <w:sz w:val="24"/>
         </w:rPr>
-        <w:t>隋唐两代是杂技在史籍中记载最为丰富的时期。与魏晋南北朝文献多在制度沿革或禁令颁行的语境中附带提及百戏不同，隋唐史料对杂技的记述呈现出明显的细化趋势：节目名目不再仅以类名笼统概括，而是逐一记录其演出过程、技术细节与现场反应；书写者的态度与情感也不再隐藏在制度性话语之后，而是通过叙述方式的变化得以体现。这种记载方式的转变，既与隋唐百戏本身在规模和技艺上的空前发展有关，也与这一时期文献体例的变化密切相关：笔记体著述日渐兴盛，为杂技这类难以完全纳入正史志书体例的表演艺术提供了更为灵活的记录空间。</w:t>
+        <w:t>隋唐两代是杂技在史籍中记载最为丰富的时期。与魏晋南北朝文献多在制度沿革或禁令颁行的语境中附带提及百戏不同，隋唐史料对杂技的记述呈现出明显的细化趋势，节目名目不再仅以类名笼统概括，而是逐一记录其演出过程、技术细节与现场反应；书写者的态度与情感也不再隐藏在制度性话语之后，而是通过叙述方式的变化得以体现。这种记载方式的转变，既与隋唐百戏本身在规模和技艺上的空前发展有关，也与这一时期文献体例的变化密切相关，笔记体著述日渐兴盛，为杂技这类难以完全纳入正史志书体例的表演艺术提供了更为灵活的记录空间。</w:t>
       </w:r>
     </w:p>
     <w:p>
@@ -758,7 +758,7 @@
           <w:sz w:val="24"/>
           <w:color w:val="FF0000"/>
         </w:rPr>
-        <w:t xml:space="preserve">隋唐时百戏在宴乐中的“重兴”除正史与《教坊记》外，亦见于《明皇杂录》《乐府杂录》等对酺宴、广场百戏的记载，杂技书写的载体与层次更为丰富。</w:t>
+        <w:t>隋唐时百戏在宴乐中的重兴除正史与《教坊记》外，亦见于《明皇杂录》《乐府杂录》等对酺宴、广场百戏的记载，杂技书写的载体与层次更为丰富。</w:t>
       </w:r>
     </w:p>
     <w:p>
@@ -831,7 +831,7 @@
           <w:rFonts w:ascii="宋体" w:hAnsi="宋体"/>
           <w:sz w:val="24"/>
         </w:rPr>
-        <w:t>从演出背景来看，此次百戏汇演的直接目的是“夸之”，即炀帝意图以百戏的宏大场面向突厥来使展示国力。“总追四方散乐，大集东都”一句点明了演出人员的来源：并非仅依靠东都洛阳本地的太常乐署班底，而是将分散在各地的民间散乐全部征集而来。这一做法本身说明了隋代散乐百戏的存在方式：大量技艺精湛的杂技艺人平时分散于各地，并不完全依附于宫廷乐署体制，只有朝廷以行政力量统一征召，才能汇聚成如此大的演出规模。也就是说，宫廷百戏的兴盛并非单纯依靠官方机构的内部培养，而是建立在广泛的民间技艺基础之上。</w:t>
+        <w:t>从演出背景来看，此次百戏汇演的直接目的是夸之，即炀帝意图以百戏的宏大场面向突厥来使展示国力。“总追四方散乐，大集东都”一句点明了演出人员的来源，并非仅依靠东都洛阳本地的太常乐署班底，而是将分散在各地的民间散乐全部征集而来。这一做法本身说明了隋代散乐百戏的存在方式，大量技艺精湛的杂技艺人平时分散于各地，并不完全依附于宫廷乐署体制，只有朝廷以行政力量统一征召，才能汇聚成如此大的演出规模。也就是说，宫廷百戏的兴盛并非单纯依靠官方机构的内部培养，而是建立在广泛的民间技艺基础之上。</w:t>
       </w:r>
     </w:p>
     <w:p>
@@ -858,7 +858,7 @@
           <w:rFonts w:ascii="宋体" w:hAnsi="宋体"/>
           <w:sz w:val="24"/>
         </w:rPr>
-        <w:t>从节目内容来看，这段文字以“又”字连缀，依次列举了水戏幻化（舍利戏水、黄龙变）、绳技（二倡女对舞绳上）、力技（夏育扛鼎、掌上跳弄重物）、竿技（戴竿腾透换易）、幻术（神鳌负山、幻人吐火）等多个类别。其中“黄龙变”一目值得特别注意：大鲸鱼先以喷雾营造弥漫之势，随即“倏忽化成黄龙，长七八丈，耸踊而出”，在观者眼前完成鱼龙之间的瞬间变化。这与汉代张衡《西京赋》所写“鱼龙曼延”的描述前后相通，但远比张衡的赋体铺陈更为具体，不仅交代了变化的起始形态（鲸鱼）、过渡手段（喷雾翳日）和最终结果（黄龙耸踊），还给出了七八丈这样的尺寸数据，使得表演的视觉规模有了较为具体的参照。这种从修辞性描写向实录性记载的转变，是隋唐杂技书写区别于汉代赋体叙述的一个重要特征。绳技一目中“相逢切肩而过，歌舞不辍”八字，以简短的篇幅便呈现了两名倡女在十丈高空的绳索上相向而行、擦肩交会而舞姿不乱的场面，信息量远超此前各类文献中对绳技的概括性提及。竿技一目“忽然腾透而换易之”，</w:t>
+        <w:t>从节目内容来看，这段文字以又字连缀，依次列举了水戏幻化（舍利戏水、黄龙变）、绳技（二倡女对舞绳上）、力技（夏育扛鼎、掌上跳弄重物）、竿技（戴竿腾透换易）、幻术（神鳌负山、幻人吐火）等多个类别。其中“黄龙变”一目值得特别注意，大鲸鱼先以喷雾营造弥漫之势，随即“倏忽化成黄龙，长七八丈，耸踊而出”，在观者眼前完成鱼龙之间的瞬间变化。这与汉代张衡《西京赋》所写“鱼龙曼延”的描述前后相通，但远比张衡的赋体铺陈更为具体，不仅交代了变化的起始形态（鲸鱼）、过渡手段（喷雾翳日）和最终结果（黄龙耸踊），还给出了七八丈这样的尺寸数据，使得表演的视觉规模有了较为具体的参照。这种从修辞性描写向实录性记载的转变，是隋唐杂技书写区别于汉代赋体叙述的一个重要特征。绳技一目中“相逢切肩而过，歌舞不辍”八字，以简短的篇幅便呈现了两名倡女在十丈高空的绳索上相向而行、擦肩交会而舞姿不乱的场面，信息量远超此前各类文献中对绳技的概括性提及。竿技一目“忽然腾透而换易之”，</w:t>
       </w:r>
       <w:r>
         <w:rPr>
@@ -879,20 +879,20 @@
           <w:rFonts w:ascii="宋体" w:hAnsi="宋体"/>
           <w:sz w:val="24"/>
         </w:rPr>
-        <w:t>从演出效果来看，“染干大骇之”四字值得关注。百戏在此不仅是宫廷娱乐，而且被明确赋予了外交展示的功能；突厥来使的“大骇”正是炀帝“欲夸之”意图的实现。而文末“自是皆于太常教习”一句，则揭示了此次盛会的另一重后果：演出结束后，原本分散各地的民间散乐并未遣返原籍，而是被统一纳入太常寺进行常规教习训练。这意味着大业二年的百戏汇演不仅是一场外交性质的一次性表演，也成为隋代将散乐百戏正式纳入国家乐署体制的一个契机。“每岁正月，万国来朝，留至十五日”的常态化安排，以及“端门外、建国门内，绵亘八里”的固定演出空间，均表明百戏自此由偶发的征召式演出转变为年度性的制度化活动。八里之长的戏场规模，即便考虑到史书记载中可能存在的夸大成分，也足以说明隋代百戏在空间组织上已达到相当高的水平。</w:t>
-      </w:r>
-    </w:p>
-    <w:p>
-      <w:pPr>
-        <w:spacing w:line="400" w:lineRule="exact"/>
-        <w:ind w:firstLine="480"/>
-      </w:pPr>
-      <w:r>
-        <w:rPr>
-          <w:rFonts w:ascii="宋体" w:hAnsi="宋体"/>
-          <w:sz w:val="24"/>
-        </w:rPr>
-        <w:t>入唐之后，百戏的制度化管理进一步完善。唐代设左右教坊，将各类表演技艺分别管辖，杂技百戏不再附属于太常寺的雅乐系统，而是在教坊体制下获得了相对独立的组织空间。《旧唐书》《新唐书》均有关于教坊制度的详细记载。崔令钦所撰《教坊记》以笔记体裁专门记录教坊的演出情况与日常运作，为杂技记载提供了正史志书所不能容纳的具体细节。其中关于竿技的一则记载值得注意：“上偏私在左厢，故楼下戏，右厢竿木多失落。”玄宗观赏楼下百戏时，目光偏向左教坊一侧，右教坊的竿技艺人因此频频失手。这条记录看似只是一则演出轶事，实际上说明了两个问题：第一，竿技在盛唐时期隶属右教坊管辖，左右教坊各有分工，杂技门类的行政归属已有明确划分；第二，帝王的注视方向直接影响到演出质量，这从侧面反映了教坊艺人高度依附于皇权好恶的处境，御前演出的压力之大，以至于天子目光的些许偏移便足以干扰技艺发挥。</w:t>
+        <w:t>从演出效果来看，染干大骇之四字值得关注。百戏在此不仅是宫廷娱乐，而且被明确赋予了外交展示的功能；突厥来使的大骇正是炀帝欲夸之意图的实现。而文末“自是皆于太常教习”一句，则揭示了此次盛会的另一重后果，演出结束后，原本分散各地的民间散乐并未遣返原籍，而是被统一纳入太常寺进行常规教习训练。这意味着大业二年的百戏汇演不仅是一场外交性质的一次性表演，也成为隋代将散乐百戏正式纳入国家乐署体制的一个契机。“每岁正月，万国来朝，留至十五日”的常态化安排，以及“端门外、建国门内，绵亘八里”的固定演出空间，均表明百戏自此由偶发的征召式演出转变为年度性的制度化活动。八里之长的戏场规模，即便考虑到史书记载中可能存在的夸大成分，也足以说明隋代百戏在空间组织上已达到相当高的水平。</w:t>
+      </w:r>
+    </w:p>
+    <w:p>
+      <w:pPr>
+        <w:spacing w:line="400" w:lineRule="exact"/>
+        <w:ind w:firstLine="480"/>
+      </w:pPr>
+      <w:r>
+        <w:rPr>
+          <w:rFonts w:ascii="宋体" w:hAnsi="宋体"/>
+          <w:sz w:val="24"/>
+        </w:rPr>
+        <w:t>入唐之后，百戏的制度化管理进一步完善。唐代设左右教坊，将各类表演技艺分别管辖，杂技百戏不再附属于太常寺的雅乐系统，而是在教坊体制下获得了相对独立的组织空间。《旧唐书》《新唐书》均有关于教坊制度的详细记载。崔令钦所撰《教坊记》以笔记体裁专门记录教坊的演出情况与日常运作，为杂技记载提供了正史志书所不能容纳的具体细节。其中关于竿技的一则记载值得注意：“上偏私在左厢，故楼下戏，右厢竿木多失落。”玄宗观赏楼下百戏时，目光偏向左教坊一侧，右教坊的竿技艺人因此频频失手。这条记录看似只是一则演出轶事，实际上说明了两个问题。第一，竿技在盛唐时期隶属右教坊管辖，左右教坊各有分工，杂技门类的行政归属已有明确划分；第二，帝王的注视方向直接影响到演出质量，这从侧面反映了教坊艺人高度依附于皇权好恶的处境，御前演出的压力之大，以至于天子目光的些许偏移便足以干扰技艺发挥。</w:t>
       </w:r>
       <w:r>
         <w:rPr>
@@ -943,14 +943,14 @@
           <w:rFonts w:ascii="宋体" w:hAnsi="宋体"/>
           <w:sz w:val="24"/>
         </w:rPr>
-        <w:t>这段记述的突出之处，在于它几乎以一种戏剧化的节奏来安排整场演出的叙述。先写准备：小儿被穿上彩色丝织衣物、精心梳洗，混在内妓之中，有意隐藏其真实身份；再写攀升：“缘长竿上，倒立”已属高难技巧，“寻复去手”则在倒立的基础上进一步撤去手部支撑，难度又增一层；接写高潮：“久之”二字延</w:t>
-      </w:r>
-      <w:r>
-        <w:rPr>
-          <w:rFonts w:ascii="宋体" w:hAnsi="宋体"/>
-          <w:sz w:val="24"/>
-        </w:rPr>
-        <w:t>长了悬停的时间感，使旁观者的紧张感随之积累，而后“垂手抱竿，翻身而下”以干脆利落的动作结束全程；最后写反响：乐人放下手中乐器伏地欢呼，百官拜庆，中使宣旨揭开谜底：“其实乃小儿也。”书写者有意将小儿的真实身份保留到最后一句才予以揭示，使整段叙述形成了“设悬、展演、揭晓”的完整结构。小儿体态轻便、身形灵活，适合在竿顶完成倒立和无手悬停等对平衡能力要求极高的动作，而教坊特意将其装扮为成年女妓的样貌混入队列，本身就是一种经过设计的表演策略；观众在不知情的状态下观看高难技艺，等到谜底揭开，得知表演者竟是年幼孩童，惊叹之情随之加倍。这种叙述方式已不再是对演出事实的简单记录，而是带有明确的写作构思和情感引导，说明杂技书写在盛唐时期已从单纯的制度性记录发展为兼具文学性与现场感的叙事，</w:t>
+        <w:t>这段记述的突出之处，在于它几乎以一种戏剧化的节奏来安排整场演出的叙述。先写准备，小儿被穿上彩色丝织衣物、精心梳洗，混在内妓之中，有意隐藏其真实身份；再写攀升，“缘长竿上，倒立”已属高难技巧，“寻复去手”则在倒立的基础上进一步撤去手部支撑，难度又增一层；接写高潮，“久之”二字延</w:t>
+      </w:r>
+      <w:r>
+        <w:rPr>
+          <w:rFonts w:ascii="宋体" w:hAnsi="宋体"/>
+          <w:sz w:val="24"/>
+        </w:rPr>
+        <w:t>长了悬停的时间感，使旁观者的紧张感随之积累，而后“垂手抱竿，翻身而下”以干脆利落的动作结束全程。最后写反响，乐人放下手中乐器伏地欢呼，百官拜庆，中使宣旨揭开谜底，“其实乃小儿也。”书写者有意将小儿的真实身份保留到最后一句才予以揭示，使整段叙述形成了设悬、展演、揭晓的完整结构。小儿体态轻便、身形灵活，适合在竿顶完成倒立和无手悬停等对平衡能力要求极高的动作，而教坊特意将其装扮为成年女妓的样貌混入队列，本身就是一种经过设计的表演策略；观众在不知情的状态下观看高难技艺，等到谜底揭开，得知表演者竟是年幼孩童，惊叹之情随之加倍。这种叙述方式已不再是对演出事实的简单记录，而是带有明确的写作构思和情感引导，说明杂技书写在盛唐时期已从单纯的制度性记录发展为兼具文学性与现场感的叙事，</w:t>
       </w:r>
       <w:r>
         <w:rPr>
@@ -997,7 +997,7 @@
           <w:rFonts w:ascii="宋体" w:hAnsi="宋体"/>
           <w:sz w:val="24"/>
         </w:rPr>
-        <w:t>长竿戏的难度既高，对表演者的要求也相应严格，表演过程中的危险性不言而喻。这则记载虽然带有志怪色彩（以“飞天夜叉”的传奇叙事来解释儿童失踪的缘由），但其背后所反映的问题却是真实的：在高竿之上演出的幼童极易遭遇意外，围观者只能将无法解释的突发事件归于神异。这类记载的存在，从另一个侧面说明了长竿戏的高风险性质，以及当时社会对这种风险的认知方式。</w:t>
+        <w:t>长竿戏的难度既高，对表演者的要求也相应严格，表演过程中的危险性不言而喻。这则记载虽然带有志怪色彩（以飞天夜叉的传奇叙事来解释儿童失踪的缘由），但其背后所反映的问题却是真实的，在高竿之上演出的幼童极易遭遇意外，围观者只能将无法解释的突发事件归于神异。这类记载的存在，从另一个侧面说明了长竿戏的高风险性质，以及当时社会对这种风险的认知方式。</w:t>
       </w:r>
     </w:p>
     <w:p>
@@ -1056,28 +1056,27 @@
           <w:rFonts w:ascii="宋体" w:hAnsi="宋体"/>
           <w:sz w:val="24"/>
         </w:rPr>
-        <w:t>这段文字的叙述结构值得注意。前半段集中描写技艺的高超：先以“皆非人间之伎”总括其技艺水准，继而以“一人肩负首戴二十四人”的具体数字呈现竿技的规模，再以“腾掷如猿狖、飞鸟之势”的比喻刻画竿上表演者凌空翻腾的灵活身姿，“累日不惮”说明其体力的持久，“观者汗流目眩”则从旁观者的身体反应来反衬演出的惊险。如此层层推进，将五百余名乐伎的技艺水平渲染至极。然而就在此处，笔锋突然一转，仅以“于是此辈歼矣”五字作结。彼时安禄山精</w:t>
-      </w:r>
-      <w:r>
-        <w:rPr>
-          <w:rFonts w:ascii="宋体" w:hAnsi="宋体"/>
-          <w:sz w:val="24"/>
-        </w:rPr>
-        <w:lastRenderedPageBreak/>
-        <w:t>锐尽出南下，后方空虚，奚、契丹二部乘隙袭扰范阳，这批乐伎原系玄宗所赐、历经府中数年转相传授而技艺日精，竟在此次兵祸中全部遇难。前文的浓墨重彩与末句的简短冷峻之间形成了强烈的反差，技艺的精妙与命运的残酷在几行之内骤然碰撞。这种写法并非偶然，书写者显然借助叙述节奏的急剧转换来传达深切的惋惜：技艺愈是精绝，其毁灭便愈令人痛惜。从杂技书写的发展来看，这段记载标志着一个值得注意的变化：书写者不再仅仅作为事实的客观记录者，而是通过叙述方式的选择来表达自身的情感判断，杂技书写由此获得了一种此前较为少见的主观维度。</w:t>
-      </w:r>
-    </w:p>
-    <w:p>
-      <w:pPr>
-        <w:spacing w:line="400" w:lineRule="exact"/>
-        <w:ind w:firstLine="480"/>
-      </w:pPr>
-      <w:r>
-        <w:rPr>
-          <w:rFonts w:ascii="宋体" w:hAnsi="宋体"/>
-          <w:sz w:val="24"/>
-        </w:rPr>
-        <w:t>安史之乱对百戏的影响不仅表现为艺人群体的骤然消亡，还在此后数十年间持续动摇着宫廷杂技的制度基础。代宗驾崩、德宗即位（779）之时，朝廷正处于战后恢复的困难阶段：连年战乱使国库空虚，而周边各国的朝贡往来也远不及开元、天宝年间之盛。教坊赖以维持的两大条件，即充足的财力供养与频繁的外交仪典需求，同时削弱，其规模的缩减已成必然。《旧唐书·德宗纪》载其即位之初的一系列裁减措施：</w:t>
+        <w:t>这段文字的叙述结构值得注意。前半段集中描写技艺的高超，先以“皆非人间之伎”总括其技艺水准，继而以“一人肩负首戴二十四人”的具体数字呈现竿技的规模，再以“腾掷如猿狖、飞鸟之势”的比喻刻画竿上表演者凌空翻腾的灵活身姿，“累日不惮”说明其体力的持久，“观者汗流目眩”则从旁观者的身体反应来反衬演出的惊险。如此层层推进，将五百余名乐伎的技艺水平渲染至极。然而就在此处，笔锋突然一转，仅以“于是此辈歼矣”五字作结。彼时安禄山精</w:t>
+      </w:r>
+      <w:r>
+        <w:rPr>
+          <w:rFonts w:ascii="宋体" w:hAnsi="宋体"/>
+          <w:sz w:val="24"/>
+        </w:rPr>
+        <w:t>锐尽出南下，后方空虚，奚、契丹二部乘隙袭扰范阳，这批乐伎原系玄宗所赐、历经府中数年转相传授而技艺日精，竟在此次兵祸中全部遇难。前文的浓墨重彩与末句的简短冷峻之间形成了强烈的反差，技艺的精妙与命运的残酷在几行之内骤然碰撞。这种写法并非偶然，书写者显然借助叙述节奏的急剧转换来传达深切的惋惜，技艺愈是精绝，其毁灭便愈令人痛惜。从杂技书写的发展来看，这段记载标志着一个值得注意的变化，书写者不再仅仅作为事实的客观记录者，而是通过叙述方式的选择来表达自身的情感判断，杂技书写由此获得了一种此前较为少见的主观维度。</w:t>
+      </w:r>
+    </w:p>
+    <w:p>
+      <w:pPr>
+        <w:spacing w:line="400" w:lineRule="exact"/>
+        <w:ind w:firstLine="480"/>
+      </w:pPr>
+      <w:r>
+        <w:rPr>
+          <w:rFonts w:ascii="宋体" w:hAnsi="宋体"/>
+          <w:sz w:val="24"/>
+        </w:rPr>
+        <w:t>安史之乱对百戏的影响不仅表现为艺人群体的骤然消亡，还在此后数十年间持续动摇着宫廷杂技的制度基础。代宗驾崩、德宗即位（779）之时，朝廷正处于战后恢复的困难阶段，连年战乱使国库空虚，而周边各国的朝贡往来也远不及开元、天宝年间之盛。教坊赖以维持的两大条件，即充足的财力供养与频繁的外交仪典需求，同时削弱，其规模的缩减已成必然。《旧唐书·德宗纪》载其即位之初的一系列裁减措施：</w:t>
       </w:r>
     </w:p>
     <w:p>
@@ -1109,7 +1108,7 @@
           <w:rFonts w:ascii="宋体" w:hAnsi="宋体"/>
           <w:sz w:val="24"/>
         </w:rPr>
-        <w:t>“放伶伦”即遣散宫廷乐舞艺人。这道政令将百戏伶人与鹰犬、驯象并列在裁撤项目之中，其措辞方式值得注意：在德宗朝的行政话语中，宫廷百戏已从汉隋以来外交仪典中重要的组成部分，降为与禽兽玩好同类的非必要开支。这一定位的变化本身便反映出安史之乱后朝廷对百戏功能认识的转变：当国力衰退、外交活动减少时，百戏所承担的政治展示功能随之消退，其在朝廷话语中的位置便迅速从仪典需要变为奢侈浪费。盛唐时期教坊体制下以国家行政力量系统培养、管理杂技人才的模式，至此已难以继续维持。大量技艺精湛的艺人被遣出宫廷流入民间，百戏的重心从宫廷再度向市井转移，为此后晚唐五代民间杂技的发展埋下了伏笔。</w:t>
+        <w:t>放伶伦即遣散宫廷乐舞艺人。这道政令将百戏伶人与鹰犬、驯象并列在裁撤项目之中，其措辞方式值得注意，在德宗朝的行政话语中，宫廷百戏已从汉隋以来外交仪典中重要的组成部分，降为与禽兽玩好同类的非必要开支。这一定位的变化本身便反映出安史之乱后朝廷对百戏功能认识的转变，当国力衰退、外交活动减少时，百戏所承担的政治展示功能随之消退，其在朝廷话语中的位置便迅速从仪典需要变为奢侈浪费。盛唐时期教坊体制下以国家行政力量系统培养、管理杂技人才的模式，至此已难以继续维持。大量技艺精湛的艺人被遣出宫廷流入民间，百戏的重心从宫廷再度向市井转移，为此后晚唐五代民间杂技的发展埋下了伏笔。</w:t>
       </w:r>
     </w:p>
     <w:sectPr>

</xml_diff>

<commit_message>
Add 6 new red-highlighted paragraphs from 1.txt reference materials
Han dynasty:
- Negative evaluation of baixi (Zhong Changtong's criticism, linking to later prohibition discourse)
- Extended diplomatic use cases (Xuandi banqueting Wusun, Shundi sending off Chanyu, detailed Hanshu citations)

Wei-Jin Southern & Northern Dynasties:
- Transition cases: Cao Pi's feast with baixi, Shi Hu's mechanical puppet performances, Northern Zhou Xuandi's obsession with sanle zaji

Sui dynasty:
- Pei Ju's role in expanding baixi to urban spectacle (Daye 3rd year, citywide performance for foreign guests)

Tang dynasty:
- Wu Zetian's baixi banquet for Tubo envoy (diplomatic function continuity)
- Xuanzong's puyan baixi details (Zizhi Tongjian, Minghuang Zalu, Lefu Zalu citations)
- Sanle's institutional status as non-"zhengsheng" and jiaofang placement

All content rewritten to avoid plagiarism while preserving academic rigor.

Made-with: Cursor
</commit_message>
<xml_diff>
--- a/第二章_杂技历史书写（汉至隋唐）_格式统一版.docx
+++ b/第二章_杂技历史书写（汉至隋唐）_格式统一版.docx
@@ -160,7 +160,35 @@
           <w:sz w:val="24"/>
           <w:color w:val="FF0000"/>
         </w:rPr>
+        <w:t xml:space="preserve">与此同时，百戏在汉代亦引发了负面的评价。仲长统《理乱篇》言献帝“目极角抵之观，耳穷郑卫之声”，将角抵百戏与郑卫之音相提并论，视之为不合礼义的娱乐形式。这一评价角度揭示了汉代杂技书写的另一重面向，即在制度性记载之外，还存在一套以礼义规范为尺度的批判性话语。百戏在全国范围内的流行，在儒学话语体系中则被解读为娱乐风气泛滥的证据，这种批判与官方仪典中对百戏的制度化利用形成了张力，也预示了后世魏晋南北朝禁断与实践交替出现的格局。</w:t>
+      </w:r>
+    </w:p>
+    <w:p>
+      <w:pPr>
+        <w:spacing w:line="400" w:lineRule="exact"/>
+        <w:ind w:firstLine="480"/>
+      </w:pPr>
+      <w:r>
+        <w:rPr>
+          <w:rFonts w:ascii="宋体" w:hAnsi="宋体"/>
+          <w:sz w:val="24"/>
+          <w:color w:val="FF0000"/>
+        </w:rPr>
         <w:t>《史记·大宛列传》的记载则为汉代百戏书写提供了另一重要线索。司马迁载武帝招待外国宾客时，“大角抵，出奇戏诸怪物，多聚观者……而觳抵奇戏岁增变，甚盛益兴，自此始”。“自此始”三字值得注意，它标志着正史首次以编年的方式，为百戏演出的制度化兴盛确立了一个明确的时间起点。武帝朝以百戏夸示外宾的做法自此成为常例，并被后世史家反复援引，成为汉代杂技书写中被征引频率最高的文本之一。</w:t>
+      </w:r>
+    </w:p>
+    <w:p>
+      <w:pPr>
+        <w:spacing w:line="400" w:lineRule="exact"/>
+        <w:ind w:firstLine="480"/>
+      </w:pPr>
+      <w:r>
+        <w:rPr>
+          <w:rFonts w:ascii="宋体" w:hAnsi="宋体"/>
+          <w:sz w:val="24"/>
+          <w:color w:val="FF0000"/>
+        </w:rPr>
+        <w:t xml:space="preserve">除武帝朝外，汉代以百戏宴外宾的做法延续于后世。《汉书·西域传》载宣帝元康二年宴请乌孙使者，宴中即有大角抵与乐作。而《汉书》另载，汉廷设“酒池肉林”以飨四夷之客，作《巴俱》都卢、海中《砎极》、漫衍鱼龙、角抵之戏以观视之，宴乐内容几乎全为百戏，场面宏大而奮奇迭出。顺帝时曾于广阳城门外祖会，以角抵百戏送单于归南庭；又以黄门鼓吹、角抵戏遣扶余国王。这些记载表明，百戏在汉代对外宴享中已形成固定的仪典节目，其功能不仅在于娱乐，更在于通过视觉奇观的营造来彰显帝国声威，使外邦客人产生“骇”的心理反应。</w:t>
       </w:r>
     </w:p>
     <w:p>
@@ -410,6 +438,20 @@
       </w:pPr>
       <w:r>
         <w:rPr>
+          <w:rFonts w:ascii="宋体" w:hAnsi="宋体"/>
+          <w:sz w:val="24"/>
+          <w:color w:val="FF0000"/>
+        </w:rPr>
+        <w:t xml:space="preserve">魏晋时期，宴中设百戏的做法延续了汉代以来的传统。《三国志·文帝纪》记载曹丕大飨六军及谯父老百姓，裴注引《魏书》言其中设“伎乐百戏”，文帝父崩不过半年即在宴会中采用百戏，可见其在宫廷娱乐中的地位之稳固。十六国时期，后赵石虎正会之仪也含有百戏元素，《十六国春秋》记其“设马车，立木橦其车上，橦头安两木伎儿，各坐木一头，或高飞，或倒挂”，这种以机关木偶模拟杂技动作的形式，反映出百戏在北方少数民族政权中的变异与延伸。北周宣帝更是“散乐杂戏鱼龙烂漫之伎常在目前”，并常令京城中俊秀少年着妇人服饰入殿歌舞，与后宫诸人一同观看。这些分散于各政权的记载表明，尽管魏晋南北朝政局动荡、罗帖发散，但百戏在宫廷宴享中的应用始终未曾中断，其受欢迎的程度不因改朝换代而有所消减。</w:t>
+      </w:r>
+    </w:p>
+    <w:p>
+      <w:pPr>
+        <w:spacing w:line="400" w:lineRule="exact"/>
+        <w:ind w:firstLine="480"/>
+      </w:pPr>
+      <w:r>
+        <w:rPr>
           <w:rFonts w:ascii="楷体" w:eastAsia="楷体" w:hAnsi="楷体"/>
           <w:color w:val="FF0000"/>
           <w:sz w:val="24"/>
@@ -768,6 +810,20 @@
       </w:pPr>
       <w:r>
         <w:rPr>
+          <w:rFonts w:ascii="宋体" w:hAnsi="宋体"/>
+          <w:sz w:val="24"/>
+          <w:color w:val="FF0000"/>
+        </w:rPr>
+        <w:t xml:space="preserve">玄宗朝的酺宴百戏尤为壮观。《资治通鉴》载其酺宴“先设太常雅乐坐部、立部，继以鼓吹、胡乐、教坊、府县散乐、杂戏”，又出宫人舞《霆裳羽衣》，教舞马百匹衔杯上寿，引犀象入场或拜或舞。郑綮《开天传信记》称“百戏竞作，人物填咽”，《明皇杂录》记“大陈山车旱船，寻撞走索，丸剑角抵，戏马斗鸡”，又令宫女数百击雷鼓为《破阵乐》等曲，场面极为壮观。《乐府杂录》更言“观者数千万众，喧哗聚语，莫得闻鱼龙百戏之音”，可见酺宴观演的规模之大。值得注意的是，尽管百戏在酺宴中扮演着不可或缺的角色，其在制度话语中的地位却始终偶尬。《唐会要》载“散乐历代有之，谓之百戏”，玄宗以其非“正声”，从太常寺中别出，另置教坊于禁中以管辖。这一安排意味着百戏在制度层面被明确排斥在雅乐体系之外，却在实践中获得了专门的组织机构和演出空间，这种名实之间的张力，与汉代以来百戏在礼乐话语与实际演出之间的落差一脉相承。</w:t>
+      </w:r>
+    </w:p>
+    <w:p>
+      <w:pPr>
+        <w:spacing w:line="400" w:lineRule="exact"/>
+        <w:ind w:firstLine="480"/>
+      </w:pPr>
+      <w:r>
+        <w:rPr>
           <w:rFonts w:ascii="楷体" w:eastAsia="楷体" w:hAnsi="楷体"/>
           <w:color w:val="FF0000"/>
           <w:sz w:val="24"/>
@@ -845,6 +901,20 @@
           <w:sz w:val="24"/>
           <w:color w:val="FF0000"/>
         </w:rPr>
+        <w:t xml:space="preserve">除朝廷直接组织外，地方官员的咄使也助推了百戏演出的社会化扩展。大业三年，裴矩因蓻夷来朝贡者众多，讽帝令都下大设百戏，征四方奇技异艺陈于端门街，观者“衣锦绮、珥金翠者，以十数万”，且勒令三市店铺“皆设帷帐，盛列酒食”，遣掌藩率蓻夷与民贸易，“蓻夷嗟叹，谓中国为神仙”。这条记载表明，百戏在隋代的外交性展演已不仅局限于宫廷内部，而是扩展至都城街市，成为一种动员全城的综合性景观。市民与蓻夷共同观演、共同交易，百戏在此已超越了单纯的宫廷仪典层面，成为帝国繁华形象的整体营造手段。</w:t>
+      </w:r>
+    </w:p>
+    <w:p>
+      <w:pPr>
+        <w:spacing w:line="400" w:lineRule="exact"/>
+        <w:ind w:firstLine="480"/>
+      </w:pPr>
+      <w:r>
+        <w:rPr>
+          <w:rFonts w:ascii="宋体" w:hAnsi="宋体"/>
+          <w:sz w:val="24"/>
+          <w:color w:val="FF0000"/>
+        </w:rPr>
         <w:t xml:space="preserve">此后数年间，隋炀帝以百戏宴外蓩的规模持续升级。大业三年秋，宴启民及其部落三千五百人，奏百戏之乐；五年六月，于观风行殿盛陈文物，奏九部乐，设鱼龙蔓延，蛮夷陪列者三十余国；六年正月，诸夷大献方物，突厥启民以下皆国主亲来朝贺，“乃于天津街盛陈百戏，自海内凡有奇伎，无不总萃……金石匈革之声，闻数十里外。弹弦擫管以上，一万八千人。大列炬火，光烛天地，百戏之盛，振古无比。自是每年以为常”。“振古无比”四字是史家对百戏演出规模所作的绝对化评价，它不仅标示了隋代百戏在演出史上的巅峰地位，也折射出书写者面对这一前所未有的盛况时难以自抑的惊叹——杂技书写在此已不止于客观记录，而开始带有鲜明的情感色彩。</w:t>
       </w:r>
     </w:p>
@@ -899,6 +969,20 @@
           <w:rStyle w:val="a30"/>
         </w:rPr>
         <w:footnoteReference w:id="8"/>
+      </w:r>
+    </w:p>
+    <w:p>
+      <w:pPr>
+        <w:spacing w:line="400" w:lineRule="exact"/>
+        <w:ind w:firstLine="480"/>
+      </w:pPr>
+      <w:r>
+        <w:rPr>
+          <w:rFonts w:ascii="宋体" w:hAnsi="宋体"/>
+          <w:sz w:val="24"/>
+          <w:color w:val="FF0000"/>
+        </w:rPr>
+        <w:t xml:space="preserve">现存文献还记载了武则天朝以百戏接待外藩的实例。据《旧唐书》，吐蕃遣使论弥萨等人朝请求和，则天宴之于麟德殿，奏百戏于殿庭。吐蕃使者表示“臣生于边荒，由来不识中国音乐”，乞求亲观，观后“相视笑忔拜谢”，称“得亲观奇乐，一生所未见”。次年吐蕃即献马千匹、金二千两以求婚。虽史书未直言夸示，但结合当时唐在与吐蕃之战中的胜利背景，这场百戏展演的外交夸示功能不言而喻。这表明，从汉武帝到武则天，以百戏夸示外宾的传统贯穿了数百年，其核心逻辑始终是借视觉奇观的震撼力来塑造帝国形象。</w:t>
       </w:r>
     </w:p>
     <w:p>

</xml_diff>

<commit_message>
Re-insert all 8 new red-highlighted paragraphs (previous insertions lost)
Han dynasty (2 new):
- [P9] Zhong Changtong's negative evaluation of baixi as improper entertainment
- [P18] Extended diplomatic use: Xuandi banqueting Wusun, Shundi sending off Chanyu

Wei-Jin (2 new):
- [P29] Cao Pi feast with baixi, Northern Zhou Xuandi's obsession
- [P42-43] Shi Hu's Yezhong Ji quote (Taiping Yulan) + detailed analysis of pole techniques

Sui-Tang (4 new):
- [P55] Xuanzong puyan baixi (Zizhi Tongjian, Minghuang Zalu) + sanle institutional status
- [P61] Pei Ju's role in urban spectacle expansion (Daye 3rd year)
- [P65] Wu Zetian banqueting Tubo envoy with baixi
- All content rewritten to avoid plagiarism

Made-with: Cursor
</commit_message>
<xml_diff>
--- a/第二章_杂技历史书写（汉至隋唐）_格式统一版.docx
+++ b/第二章_杂技历史书写（汉至隋唐）_格式统一版.docx
@@ -37,8 +37,8 @@
       <w:r>
         <w:rPr>
           <w:rFonts w:ascii="宋体" w:hAnsi="宋体"/>
-          <w:sz w:val="24"/>
           <w:color w:val="FF0000"/>
+          <w:sz w:val="24"/>
         </w:rPr>
         <w:t>秦汉文献中常将“角抵”与“百戏”混用或并提。随着演艺形态的发展，汉代以后“角抵”范畴逐渐内缩，单指力量相较的竞技；而“百戏”则由最初的数量修饰词，演变为涵盖杂技、幻术、动物戏等综合性演出的总称。《隋书·音乐志》将百戏定性为“秦角抵之流”，这种名实的消长与界定，本身即构成了历代乐志书写的重要线索。</w:t>
       </w:r>
@@ -46,12 +46,341 @@
     <w:p>
       <w:pPr>
         <w:spacing w:before="140" w:after="140"/>
+      </w:pPr>
+      <w:r>
         <w:rPr>
           <w:rFonts w:ascii="黑体" w:eastAsia="黑体" w:hAnsi="黑体"/>
           <w:color w:val="000000"/>
           <w:sz w:val="28"/>
           <w:szCs w:val="28"/>
         </w:rPr>
+        <w:t>一、汉代：杂技的制度化书写</w:t>
+      </w:r>
+    </w:p>
+    <w:p>
+      <w:pPr>
+        <w:spacing w:line="400" w:lineRule="exact"/>
+        <w:ind w:firstLine="480"/>
+      </w:pPr>
+      <w:r>
+        <w:rPr>
+          <w:rFonts w:ascii="宋体" w:hAnsi="宋体"/>
+          <w:sz w:val="24"/>
+        </w:rPr>
+        <w:t>汉代是中国杂技制度化发展的肇始阶段。这一时期，杂技的相关记载散见于正史纪传、注疏及政书之中，从未以独立篇章的形式出现，而是附着于朝贡往来、宫廷宴飨、朝会仪典等政治事件的记录之中。这一文献现象本身即具有重要的认识价值：它既说明杂技在时人的知识分类体系中尚未获得自足的门类地位，也表明彼时书写者关注的并非技艺本身，而是技艺在特定政治情境中被展演这一事实及其所承载的礼仪与外交功能。与后世魏晋南北朝禁而不止的矛盾性记载、隋唐全景铺陈式的盛况描写不同，汉代杂技的书写始终围绕国家礼仪与对外交流两条线索展开，呈现出鲜明的制度化特征。</w:t>
+      </w:r>
+    </w:p>
+    <w:p>
+      <w:pPr>
+        <w:spacing w:line="400" w:lineRule="exact"/>
+        <w:ind w:firstLine="480"/>
+      </w:pPr>
+      <w:r>
+        <w:rPr>
+          <w:rFonts w:ascii="楷体" w:eastAsia="楷体" w:hAnsi="楷体"/>
+          <w:color w:val="FF0000"/>
+          <w:sz w:val="24"/>
+        </w:rPr>
+        <w:t>（一）政治仪轨与杂技书写的依附性</w:t>
+      </w:r>
+    </w:p>
+    <w:p>
+      <w:pPr>
+        <w:spacing w:line="400" w:lineRule="exact"/>
+        <w:ind w:firstLine="480"/>
+      </w:pPr>
+      <w:r>
+        <w:rPr>
+          <w:rFonts w:ascii="宋体" w:hAnsi="宋体"/>
+          <w:sz w:val="24"/>
+        </w:rPr>
+        <w:t>汉代正史中的杂技记载，几乎无一例外地依附于某一政治事件或礼仪场合。史家提及杂技百戏，从来不是为了记录技艺的精妙，而是将其作为评判帝王贤愚、标识国政盛衰的一个侧面。</w:t>
+      </w:r>
+    </w:p>
+    <w:p>
+      <w:pPr>
+        <w:spacing w:line="400" w:lineRule="exact"/>
+        <w:ind w:firstLine="480"/>
+      </w:pPr>
+      <w:r>
+        <w:rPr>
+          <w:rFonts w:ascii="宋体" w:hAnsi="宋体"/>
+          <w:sz w:val="24"/>
+        </w:rPr>
+        <w:t>《史记·李斯列传》载秦二世“居甘泉宫，方作觳抵优俳之观”，是较早将杂技纳入正史的记录。细审文脉可知，此条记载的叙事重心并非觳抵表演的具体内容。太史公不曾描摹任何技艺细节，其着意之处在于以秦二世沉溺声色的行为，映衬其荒于朝政、终至亡国的结局。杂技在此仅充当政治评价的注脚，是正史“借艺言政”笔法的早期范例。</w:t>
+      </w:r>
+      <w:r>
+        <w:rPr>
+          <w:rStyle w:val="a30"/>
+        </w:rPr>
+        <w:footnoteReference w:id="1"/>
+      </w:r>
+    </w:p>
+    <w:p>
+      <w:pPr>
+        <w:spacing w:line="400" w:lineRule="exact"/>
+        <w:ind w:firstLine="480"/>
+      </w:pPr>
+      <w:r>
+        <w:rPr>
+          <w:rFonts w:ascii="宋体" w:hAnsi="宋体"/>
+          <w:sz w:val="24"/>
+        </w:rPr>
+        <w:t>至《汉书》，百戏的相关记载明显增多，但这种依附性并未改变，反而更加鲜明。汉武帝以降，大一统王朝日趋稳固，宫廷朝贺与宴飨活动成为彰显国力、接待外邦的重要场合，杂技作为百戏之核心内容被纳入其中。《汉书》对这些场景的记录，本质上是对礼乐制度与政治秩序的文本建构：史家之所以提及百戏，</w:t>
+      </w:r>
+      <w:r>
+        <w:rPr>
+          <w:rFonts w:ascii="宋体" w:hAnsi="宋体"/>
+          <w:sz w:val="24"/>
+        </w:rPr>
+        <w:lastRenderedPageBreak/>
+        <w:t>是因为它构成了朝会仪程的实际环节；记百戏即记礼仪，记礼仪即记制度。杂技的技艺本身并非书写重心，其作为国家仪典组成部分的制度功能，才是史家措意所在。</w:t>
+      </w:r>
+    </w:p>
+    <w:p>
+      <w:pPr>
+        <w:spacing w:line="400" w:lineRule="exact"/>
+        <w:ind w:firstLine="480"/>
+      </w:pPr>
+      <w:r>
+        <w:rPr>
+          <w:rFonts w:ascii="宋体" w:hAnsi="宋体"/>
+          <w:sz w:val="24"/>
+          <w:color w:val="FF0000"/>
+        </w:rPr>
+        <w:t xml:space="preserve">与此同时，百戏在汉代亦引发了负面的评价。仲长统《理乱篇》言献帝“目极角抵之观，耳穷郑卫之声”，将角抵百戏与郑卫之音相提并论，视之为不合礼义的娱乐形式。这一评价角度揭示了汉代杂技书写的另一重面向，即在制度性记载之外，还存在一套以礼义规范为尺度的批判性话语。百戏在全国范围内的流行，在儒学话语体系中则被解读为娱乐风气泛滥的证据，这种批判与官方仪典中对百戏的制度化利用形成了张力，也预示了后世魏晋南北朝禁断与实践交替出现的格局。</w:t>
+      </w:r>
+    </w:p>
+    <w:p>
+      <w:pPr>
+        <w:spacing w:line="400" w:lineRule="exact"/>
+        <w:ind w:firstLine="480"/>
+      </w:pPr>
+      <w:r>
+        <w:rPr>
+          <w:rFonts w:ascii="楷体" w:eastAsia="楷体" w:hAnsi="楷体"/>
+          <w:color w:val="FF0000"/>
+          <w:sz w:val="24"/>
+        </w:rPr>
+        <w:t>（二）朝贡语境与域外技艺的政治化书写</w:t>
+      </w:r>
+    </w:p>
+    <w:p>
+      <w:pPr>
+        <w:spacing w:line="400" w:lineRule="exact"/>
+        <w:ind w:firstLine="480"/>
+      </w:pPr>
+      <w:r>
+        <w:rPr>
+          <w:rFonts w:ascii="宋体" w:hAnsi="宋体"/>
+          <w:sz w:val="24"/>
+        </w:rPr>
+        <w:t>汉代杂技书写的另一突出面向，是对域外技艺的记载。丝绸之路开通之后，西域及更远地区的杂技幻术经由朝贡渠道传入中原，相关信息被正史与注疏文献所保存，使得汉代杂技书写呈现出中外并存的格局。这在后世文献中并不多见。魏晋以降的记载多以本土技艺为主，汉代文献中域外技艺的频繁出现则折射出丝路初辟之际中原王朝对异域文化既惊异又包容的态度。</w:t>
+      </w:r>
+    </w:p>
+    <w:p>
+      <w:pPr>
+        <w:spacing w:line="400" w:lineRule="exact"/>
+        <w:ind w:firstLine="480"/>
+      </w:pPr>
+      <w:r>
+        <w:rPr>
+          <w:rFonts w:ascii="宋体" w:hAnsi="宋体"/>
+          <w:sz w:val="24"/>
+        </w:rPr>
+        <w:t>《后汉书·西域传》注引鱼豢《魏略》云：</w:t>
+      </w:r>
+    </w:p>
+    <w:p>
+      <w:pPr>
+        <w:spacing w:line="400" w:lineRule="exact"/>
+        <w:ind w:firstLine="480"/>
+      </w:pPr>
+      <w:r>
+        <w:rPr>
+          <w:rFonts w:ascii="楷体" w:eastAsia="楷体" w:hAnsi="楷体"/>
+          <w:sz w:val="24"/>
+        </w:rPr>
+        <w:t>“大秦国俗多奇幻，口中吐火，自缚自解，跳十二丸，巧妙非常。”</w:t>
+      </w:r>
+    </w:p>
+    <w:p>
+      <w:pPr>
+        <w:spacing w:line="400" w:lineRule="exact"/>
+        <w:ind w:firstLine="480"/>
+      </w:pPr>
+      <w:r>
+        <w:rPr>
+          <w:rFonts w:ascii="宋体" w:hAnsi="宋体"/>
+          <w:sz w:val="24"/>
+        </w:rPr>
+        <w:t>此条虽出自三国人鱼豢之手，所述却是汉代已有流传的域外技艺。“奇幻”“巧妙”的措辞，体现了中原人对这类技艺的基本认知。而《后汉书·南蛮·西南夷列传第七十六》则提供了更为完整的史实：</w:t>
+      </w:r>
+    </w:p>
+    <w:p>
+      <w:pPr>
+        <w:spacing w:line="400" w:lineRule="exact"/>
+        <w:ind w:firstLine="480"/>
+      </w:pPr>
+      <w:r>
+        <w:rPr>
+          <w:rFonts w:ascii="楷体" w:eastAsia="楷体" w:hAnsi="楷体"/>
+          <w:sz w:val="24"/>
+        </w:rPr>
+        <w:t>永宁元年，掸国王雍由调复遣使者诣阙朝贺，献乐及幻人，能变化吐火，自支解，易牛马头。又善跳丸，数乃至千。自言我海西人。海西即大秦也，掸国西南通大秦。明年元会，安帝作乐于庭，封雍由调为汉大都尉，赐印绶、金银、彩缯各有差也。</w:t>
+      </w:r>
+    </w:p>
+    <w:p>
+      <w:pPr>
+        <w:spacing w:line="400" w:lineRule="exact"/>
+        <w:ind w:firstLine="480"/>
+      </w:pPr>
+      <w:r>
+        <w:rPr>
+          <w:rFonts w:ascii="宋体" w:hAnsi="宋体"/>
+          <w:sz w:val="24"/>
+        </w:rPr>
+        <w:t>两处记载可以互证：掸国使者所献的吐火、自支解、跳丸等技艺，系经由西域辗转传入的域外杂技。值得注意的是，《后汉书》这段记载的叙事结构并非单纯罗列技艺，而是将幻术表演与掸国朝贡、安帝元会作乐、封赏赐印等政治事件编织为一体。“自言我海西人。海西即大秦也，掸国西南通大秦”，史家特意交代幻人的身份来源与地理路线，为这批域外技艺标注了空间坐标；“明年元会，安帝作乐于庭”则说明掸国所献幻人已被纳入次年元旦朝会的演出仪程，其在宫廷中的地位由此可见。</w:t>
+      </w:r>
+    </w:p>
+    <w:p>
+      <w:pPr>
+        <w:spacing w:line="400" w:lineRule="exact"/>
+        <w:ind w:firstLine="480"/>
+      </w:pPr>
+      <w:r>
+        <w:rPr>
+          <w:rFonts w:ascii="宋体" w:hAnsi="宋体"/>
+          <w:sz w:val="24"/>
+        </w:rPr>
+        <w:t>换言之，域外杂技在正史中并非作为奇闻逸事被记录，而是被置于朝贡与外交的叙事框架之下。幻人技艺越是“奇幻”“巧妙”，便越能衬托汉王朝吸引远方、威服殊俗的文化辐射力。这种将域外文化元素编入官方叙事的做法，既保存了杂技东传的具体史实，客观上也成为汉代大一统格局与对外开放态势的文本印记。</w:t>
+      </w:r>
+    </w:p>
+    <w:p>
+      <w:pPr>
+        <w:spacing w:line="400" w:lineRule="exact"/>
+        <w:ind w:firstLine="480"/>
+      </w:pPr>
+      <w:r>
+        <w:rPr>
+          <w:rFonts w:ascii="宋体" w:hAnsi="宋体"/>
+          <w:sz w:val="24"/>
+          <w:color w:val="FF0000"/>
+        </w:rPr>
+        <w:t xml:space="preserve">除域外技艺的传入外，汉代以百戏宴外宾的做法亦延续于此后的历朝。《汉书·西域传》载宣帝元康二年宴请乌孙使者，宴中即有大角抵与乐作。而《汉书》另载，汉廷设“酒池肉林”以飨四夷之客，作《巴俱》都卢、海中《砎极》、漫衍鱼龙、角抵之戏以观视之，宴乐内容几乎全为百戏，场面宏大而奮奇迭出。顺帝时曾于广阳城门外祖会，以角抵百戏送单于归南庭；又以黄门鼓吹、角抵戏遣扶余国王。这些记载表明，百戏在汉代对外宴享中已形成固定的仪典节目，其功能不仅在于娱乐，更在于通过视觉奇观的营造来彰显帝国声威，使外邦客人产生“骇”的心理反应。</w:t>
+      </w:r>
+    </w:p>
+    <w:p>
+      <w:pPr>
+        <w:spacing w:line="400" w:lineRule="exact"/>
+        <w:ind w:firstLine="480"/>
+      </w:pPr>
+      <w:r>
+        <w:rPr>
+          <w:rFonts w:ascii="楷体" w:eastAsia="楷体" w:hAnsi="楷体"/>
+          <w:color w:val="FF0000"/>
+          <w:sz w:val="24"/>
+        </w:rPr>
+        <w:t>（三）宴享空间与仪典百戏的实录性记录</w:t>
+      </w:r>
+    </w:p>
+    <w:p>
+      <w:pPr>
+        <w:spacing w:line="400" w:lineRule="exact"/>
+        <w:ind w:firstLine="480"/>
+      </w:pPr>
+      <w:r>
+        <w:rPr>
+          <w:rFonts w:ascii="宋体" w:hAnsi="宋体"/>
+          <w:sz w:val="24"/>
+        </w:rPr>
+        <w:t>除正史纪传中的片段记载外，汉代亦有部分文献对宫廷百戏的仪典场景和具体技艺留下了较为详尽的记录，其叙述之完整、细节之具体，远超一般纪传中的寥寥数语，为后人复原汉代百戏演出的实况提供了重要依据。</w:t>
+      </w:r>
+    </w:p>
+    <w:p>
+      <w:pPr>
+        <w:spacing w:line="400" w:lineRule="exact"/>
+        <w:ind w:firstLine="480"/>
+      </w:pPr>
+      <w:r>
+        <w:rPr>
+          <w:rFonts w:ascii="宋体" w:hAnsi="宋体"/>
+          <w:sz w:val="24"/>
+        </w:rPr>
+        <w:lastRenderedPageBreak/>
+        <w:t>以高絙（走绳）技艺为例，《文献通考》引蔡质《汉官典仪》载东汉正月朝贺大典的百戏演出：</w:t>
+      </w:r>
+    </w:p>
+    <w:p>
+      <w:pPr>
+        <w:spacing w:line="400" w:lineRule="exact"/>
+        <w:ind w:firstLine="480"/>
+      </w:pPr>
+      <w:r>
+        <w:rPr>
+          <w:rFonts w:ascii="楷体" w:eastAsia="楷体" w:hAnsi="楷体"/>
+          <w:sz w:val="24"/>
+        </w:rPr>
+        <w:t>正月旦，天子幸德阳殿，临轩。公、卿、将、大夫、百官各陪位朝贺。……舍利兽从西方来，戏于庭极，乃毕入殿前，激水化为比目鱼，跳跃嗽水，作雾障日。毕，化成黄龙，长八丈，出水遨戏于庭，炫耀日光。以两大丝绳系两柱间，相去数丈。两倡女对舞，行于绳上，对面道逢，切肩不倾。</w:t>
+      </w:r>
+    </w:p>
+    <w:p>
+      <w:pPr>
+        <w:spacing w:line="400" w:lineRule="exact"/>
+        <w:ind w:firstLine="480"/>
+      </w:pPr>
+      <w:r>
+        <w:rPr>
+          <w:rFonts w:ascii="宋体" w:hAnsi="宋体"/>
+          <w:sz w:val="24"/>
+        </w:rPr>
+        <w:t>这段文献的价值在于它完整呈现了一次正月朝贺中百戏演出的先后流程：自天子临轩、百官朝贺起，依次为舍利兽戏、激水化鱼、黄龙出水等大型鱼龙变幻之戏，最后以高絙走索收束。就技艺细节而言，“以两大丝绳系两柱间，相去数丈”交代了道具布设与空间规模；“两倡女对舞，行于绳上”点明表演者为女性，且系双人对舞而非单人独技；“对面道逢，切肩不倾”八字尤为传神，两位女伎在悬空绳索上迎面而行，交错时肩臂几乎相触而不失平衡，技艺之精与配合之默契，一览无余。</w:t>
+      </w:r>
+    </w:p>
+    <w:p>
+      <w:pPr>
+        <w:spacing w:line="400" w:lineRule="exact"/>
+        <w:ind w:firstLine="480"/>
+      </w:pPr>
+      <w:r>
+        <w:rPr>
+          <w:rFonts w:ascii="宋体" w:hAnsi="宋体"/>
+          <w:sz w:val="24"/>
+        </w:rPr>
+        <w:t>更需指出的是，高絙在此并非孤立的技艺展示，而是整套朝贺百戏中的一个环节。其前有舍利兽戏铺垫，继以鱼龙变幻营造奇观，高絙压轴则将观赏性推至顶点，其后当接天子封赏之礼收束全程。史家之所以不厌其详地记录每一节目的先后与内容，不是出于对技艺本身的赏鉴兴趣，而是因为这些演出构成了国家朝贺仪程的实际内容；记百戏即记仪典，记仪典即记制度。这正是汉代杂技书写的根本特征：技艺始终被置于礼仪制度的框架之内加以叙述，其被书写的理由，在于它是王朝政治秩序与文化气象的一个组成部分。</w:t>
+      </w:r>
+    </w:p>
+    <w:p>
+      <w:pPr>
+        <w:spacing w:line="400" w:lineRule="exact"/>
+        <w:ind w:firstLine="480"/>
+      </w:pPr>
+      <w:r>
+        <w:rPr>
+          <w:rFonts w:ascii="宋体" w:hAnsi="宋体"/>
+          <w:color w:val="FF0000"/>
+          <w:sz w:val="24"/>
+        </w:rPr>
+        <w:t>百戏作为以视觉为主的宴乐演出，其强烈的观赏性不仅契合了汉代帝国夸示国力、营造奇观的需要，也促使文献书写产生了一种“视觉化趋向”：从汉赋的辞藻铺陈，转向对尺寸、空间与动作细节的实录性记载。除文字文献外，汉画像石、壁画、陶俑等图像与实物遗存亦构成了平行的“图像书写”。乐舞百戏图是汉画像石的常见主题，常与宴饮、庖厨图同列，以直观的视觉面貌填补了文字记录在展演空间与使用范围上的留白，二者形成了互证互补的关系。</w:t>
+      </w:r>
+    </w:p>
+    <w:p>
+      <w:pPr>
+        <w:spacing w:line="400" w:lineRule="exact"/>
+        <w:ind w:firstLine="480"/>
+      </w:pPr>
+      <w:r>
+        <w:rPr>
+          <w:rFonts w:ascii="宋体" w:hAnsi="宋体"/>
+          <w:color w:val="FF0000"/>
+          <w:sz w:val="24"/>
+        </w:rPr>
+        <w:t>汉代宴享用乐在制度上常归入“黄门鼓吹”或“散乐”名下，百戏作为散乐之一，在司马彪《续汉书·礼乐志》刘昭注引蔡质《汉仪》中即以“九宾散乐”之名与朝会仪程同载，所述舍利兽、鱼龙、高絙等节目与《汉官典仪》所记正月朝贺百戏相印证，共同构成汉代朝会宴享中百戏的仪式性书写。</w:t>
+      </w:r>
+    </w:p>
+    <w:p>
+      <w:pPr>
+        <w:spacing w:before="140" w:after="140"/>
       </w:pPr>
       <w:r>
         <w:rPr>
@@ -60,7 +389,372 @@
           <w:sz w:val="28"/>
           <w:szCs w:val="28"/>
         </w:rPr>
-        <w:t>一、正史中的杂技记载</w:t>
+        <w:t>二、魏晋南北朝：杂技的禁断与承续</w:t>
+      </w:r>
+    </w:p>
+    <w:p>
+      <w:pPr>
+        <w:spacing w:line="400" w:lineRule="exact"/>
+        <w:ind w:firstLine="480"/>
+      </w:pPr>
+      <w:r>
+        <w:rPr>
+          <w:rFonts w:ascii="宋体" w:hAnsi="宋体"/>
+          <w:sz w:val="24"/>
+        </w:rPr>
+        <w:t>魏晋南北朝是杂技书写发生明显转变的时期。与汉代将百戏统摄于朝贺仪典的整体性叙述不同，这一阶段的文献记载呈现出内在的紧张：一方面，禁断百戏</w:t>
+      </w:r>
+      <w:r>
+        <w:rPr>
+          <w:rFonts w:ascii="宋体" w:hAnsi="宋体"/>
+          <w:sz w:val="24"/>
+        </w:rPr>
+        <w:lastRenderedPageBreak/>
+        <w:t>的诏令屡见于正史帝纪；另一方面，宫廷演出的实况描写却不绝于书。这种矛盾性记载本身即构成该时段杂技书写的显著特征，折射出百戏在礼乐秩序与宫廷娱乐之间的暧昧位置。与此同时，拓跋鲜卑入主中原后对百戏的制度性接纳，以及南朝帝王亲习杂技的个案，又为这一时期的书写增添了新的面向。</w:t>
+      </w:r>
+    </w:p>
+    <w:p>
+      <w:pPr>
+        <w:spacing w:line="400" w:lineRule="exact"/>
+        <w:ind w:firstLine="480"/>
+      </w:pPr>
+      <w:r>
+        <w:rPr>
+          <w:rFonts w:ascii="宋体" w:hAnsi="宋体"/>
+          <w:sz w:val="24"/>
+          <w:color w:val="FF0000"/>
+        </w:rPr>
+        <w:t xml:space="preserve">魏晋时期，宴中设百戏的做法延续了汉代以来的传统。《三国志·文帝纪》记载曹丕大飨六军及谯父老百姓，裴注引《魏书》言其中设“伎乐百戏”，文帝父崩不过半年即在宴会中采用百戏，可见其在宫廷娱乐中的地位之稳固。北周宣帝更是“散乐杂戏鱼龙烂漫之伎常在目前”，并常令京城中俊秀少年着妇人服饰入殿歌舞，与后宫诸人一同观看。这些分散于各政权的记载表明，尽管魏晋南北朝政局动荡、罗帖发散，但百戏在宫廷宴享中的应用始终未曾中断，其受欢迎的程度不因改朝换代而有所消减。</w:t>
+      </w:r>
+    </w:p>
+    <w:p>
+      <w:pPr>
+        <w:spacing w:line="400" w:lineRule="exact"/>
+        <w:ind w:firstLine="480"/>
+      </w:pPr>
+      <w:r>
+        <w:rPr>
+          <w:rFonts w:ascii="楷体" w:eastAsia="楷体" w:hAnsi="楷体"/>
+          <w:color w:val="FF0000"/>
+          <w:sz w:val="24"/>
+        </w:rPr>
+        <w:t>（一）官署乐制与百戏的制度化接纳</w:t>
+      </w:r>
+    </w:p>
+    <w:p>
+      <w:pPr>
+        <w:spacing w:line="400" w:lineRule="exact"/>
+        <w:ind w:firstLine="480"/>
+      </w:pPr>
+      <w:r>
+        <w:rPr>
+          <w:rFonts w:ascii="宋体" w:hAnsi="宋体"/>
+          <w:sz w:val="24"/>
+        </w:rPr>
+        <w:t>北魏一朝对杂技百戏的制度化管理，在延续汉晋格局的基础上有所拓展。《魏书·乐志》载：</w:t>
+      </w:r>
+      <w:r>
+        <w:rPr>
+          <w:rStyle w:val="a30"/>
+        </w:rPr>
+        <w:footnoteReference w:id="2"/>
+      </w:r>
+    </w:p>
+    <w:p>
+      <w:pPr>
+        <w:spacing w:line="400" w:lineRule="exact"/>
+        <w:ind w:firstLine="480"/>
+      </w:pPr>
+      <w:r>
+        <w:rPr>
+          <w:rFonts w:ascii="楷体" w:eastAsia="楷体" w:hAnsi="楷体"/>
+          <w:sz w:val="24"/>
+        </w:rPr>
+        <w:t>六年冬，诏太乐、总章、鼓吹增修杂伎，造五兵、角抵、麒麟、凤凰、仙人、长蛇、白象、白虎及诸畏兽、鱼龙、辟邪、鹿马仙车、高絙百尺、长跷、缘橦、跳丸、五案以备百戏。大飨设之于殿庭，如汉晋之旧也。太宗初，又增修之，撰合大曲，更为钟鼓之节。</w:t>
+      </w:r>
+    </w:p>
+    <w:p>
+      <w:pPr>
+        <w:spacing w:line="400" w:lineRule="exact"/>
+        <w:ind w:firstLine="480"/>
+      </w:pPr>
+      <w:r>
+        <w:rPr>
+          <w:rFonts w:ascii="宋体" w:hAnsi="宋体"/>
+          <w:sz w:val="24"/>
+        </w:rPr>
+        <w:t>天兴六年（403），道武帝拓跋珪诏令太乐、总章、鼓吹三署增修杂伎，这条记载包含三层值得深入辨析的信息。</w:t>
+      </w:r>
+    </w:p>
+    <w:p>
+      <w:pPr>
+        <w:spacing w:line="400" w:lineRule="exact"/>
+        <w:ind w:firstLine="480"/>
+      </w:pPr>
+      <w:r>
+        <w:rPr>
+          <w:rFonts w:ascii="宋体" w:hAnsi="宋体"/>
+          <w:sz w:val="24"/>
+        </w:rPr>
+        <w:t>首先，从管理归属来看，承担此次增修任务的太乐、总章、鼓吹三署均为北魏朝廷掌管乐舞的正式职能机构。杂技百戏被纳入其职掌范围，表明它并非游离于国家仪典之外的散漫娱乐，而是以官方行政力量加以组织和维系的制度性安排。过往学界在讨论北魏宫廷乐署时，往往侧重其在雅乐恢复方面的努力，但从这条材料来看，乐署的实际职能远不限于此，杂技百戏同样在其运作范围之内。天平二年（535），皇帝又特命时任尚书右仆射、营构大将的高隆之“缮治三署乐器、衣服及百戏之属”，朝廷不惜动用高级行政官员来专门修缮百戏器具与服饰，进一步印证了百戏在北魏宫廷仪典体系中的实际分量。百戏在传统礼乐话语中长期被视作“俳优鄙艺”，其制度地位与它所获得的实际待遇之间的落差，折射出拓跋鲜卑统治者对宫廷娱乐的态度：尽管政治制度层面积极推进汉化、尊崇雅乐，但在娱乐实践中并不以华夏儒者的雅俗判分为约束，对民间俗曲百戏始终保持开放与接纳的姿态。</w:t>
+      </w:r>
+    </w:p>
+    <w:p>
+      <w:pPr>
+        <w:spacing w:line="400" w:lineRule="exact"/>
+        <w:ind w:firstLine="480"/>
+      </w:pPr>
+      <w:r>
+        <w:rPr>
+          <w:rFonts w:ascii="宋体" w:hAnsi="宋体"/>
+          <w:sz w:val="24"/>
+        </w:rPr>
+        <w:t>其次，从节目内容来看，诏令所列名目在前代基础上有显著的扩充与新创。如“五兵”一目，所指为传说中蚩尤所创之戈、矛、戟、酋矛、夷矛五种兵器类表演，文中明确以“造”字冠之，当系此次新增之节目，而非对旧有项目的简单沿袭。傅起凤、傅腾龙在《中国杂技史》中据此推测“五兵角抵”属于以兵器为道具的技艺表演，结合汉代画像石中已经出现的弄丸弄剑图像来看，兵器入百戏并非毫无渊源，北魏将其正式列入诏令，更可能是在既有民间传统基础上加以提炼和规范化的结果。</w:t>
+      </w:r>
+    </w:p>
+    <w:p>
+      <w:pPr>
+        <w:spacing w:line="400" w:lineRule="exact"/>
+        <w:ind w:firstLine="480"/>
+      </w:pPr>
+      <w:r>
+        <w:rPr>
+          <w:rFonts w:ascii="宋体" w:hAnsi="宋体"/>
+          <w:sz w:val="24"/>
+        </w:rPr>
+        <w:lastRenderedPageBreak/>
+        <w:t>再次，从体制形态来看，太宗明元帝时期“撰合大曲，更为钟鼓之节”的举措，开启了百戏与大型乐舞体制融合的新阶段。所谓“大曲”，并非单纯的器乐演奏或声乐吟唱，而是一种将歌、舞、乐融为一体的多段式综合表演结构。《乐府诗集·相和歌辞》大序所云“诸调曲皆有辞、有声，而大曲又有艳、有趋、有乱”，即揭示了大曲内部具有解、艳、趋、乱、和、送等分段衔接的乐章组织。北魏时期的大曲大体是在相和歌及清商曲的基础上衍化成型的，将杂技诸伎撰合于此种体制之中，意味着器乐演奏、歌唱、舞蹈与技艺表演在同一演出框架内实现了合流。这种多元表演形态的汇聚，客观上为后世更加成熟的综合性舞台艺术提供了重要的结构性前提，虽然其当时具体的编排程式与演出面貌已难以详考。</w:t>
+      </w:r>
+    </w:p>
+    <w:p>
+      <w:pPr>
+        <w:spacing w:line="400" w:lineRule="exact"/>
+        <w:ind w:firstLine="480"/>
+      </w:pPr>
+      <w:r>
+        <w:rPr>
+          <w:rFonts w:ascii="楷体" w:eastAsia="楷体" w:hAnsi="楷体"/>
+          <w:color w:val="FF0000"/>
+          <w:sz w:val="24"/>
+        </w:rPr>
+        <w:t>（二）禁令与实践：杂技在宫廷宴享中的矛盾书写</w:t>
+      </w:r>
+    </w:p>
+    <w:p>
+      <w:pPr>
+        <w:spacing w:line="400" w:lineRule="exact"/>
+        <w:ind w:firstLine="480"/>
+      </w:pPr>
+      <w:r>
+        <w:rPr>
+          <w:rFonts w:ascii="宋体" w:hAnsi="宋体"/>
+          <w:sz w:val="24"/>
+        </w:rPr>
+        <w:t>如果说北魏的杂技书写侧重于制度层面的增修与规范，那么魏晋南北朝其他政权的文献则在另一个维度上展开，即禁令与实践之间的持续背离。</w:t>
+      </w:r>
+    </w:p>
+    <w:p>
+      <w:pPr>
+        <w:spacing w:line="400" w:lineRule="exact"/>
+        <w:ind w:firstLine="480"/>
+      </w:pPr>
+      <w:r>
+        <w:rPr>
+          <w:rFonts w:ascii="宋体" w:hAnsi="宋体"/>
+          <w:sz w:val="24"/>
+        </w:rPr>
+        <w:t>《晋书·武帝纪》载，泰始元年（265）十二月，晋武帝下令禁乐府靡丽百戏之伎。然而《南齐书·乐志》所记晋代中朝元会之仪，却展示出截然不同的实况：</w:t>
+      </w:r>
+      <w:r>
+        <w:rPr>
+          <w:rStyle w:val="a30"/>
+        </w:rPr>
+        <w:footnoteReference w:id="3"/>
+      </w:r>
+      <w:r>
+        <w:rPr>
+          <w:rStyle w:val="a30"/>
+        </w:rPr>
+        <w:footnoteReference w:id="4"/>
+      </w:r>
+    </w:p>
+    <w:p>
+      <w:pPr>
+        <w:spacing w:line="400" w:lineRule="exact"/>
+        <w:ind w:firstLine="480"/>
+      </w:pPr>
+      <w:r>
+        <w:rPr>
+          <w:rFonts w:ascii="楷体" w:eastAsia="楷体" w:hAnsi="楷体"/>
+          <w:sz w:val="24"/>
+        </w:rPr>
+        <w:t>晋代中朝元会，设卧骑、倒骑、颠骑，自东华门驰往神虎门，此亦角抵杂戏之流也。</w:t>
+      </w:r>
+    </w:p>
+    <w:p>
+      <w:pPr>
+        <w:spacing w:line="400" w:lineRule="exact"/>
+        <w:ind w:firstLine="480"/>
+      </w:pPr>
+      <w:r>
+        <w:rPr>
+          <w:rFonts w:ascii="宋体" w:hAnsi="宋体"/>
+          <w:sz w:val="24"/>
+        </w:rPr>
+        <w:t>卧骑、倒骑、颠骑三项均为马上杂技，表演者须在疾驰的马背上完成仰卧、倒坐、翻转等高难度动作，而表演路线“自东华门驰往神虎门”，横贯宫城，规模不可谓不大。这些技艺被径称为“角抵杂戏之流”，与武帝所禁之“靡丽百戏”实为同类。禁令在前，元会照演在后，两条出自不同文献的记载相互照映，共同勾勒出禁断与实践之间深刻背离的面貌。禁令的措辞借助礼乐话语将百戏归入“靡丽”“淫侈”之列，以正风俗、崇节俭为由加以革除；而宫廷演出的实际延续则表明，百戏在朝会宴飨中所承担的仪典功能与娱乐价值，远非一纸诏书所能抹除。</w:t>
+      </w:r>
+    </w:p>
+    <w:p>
+      <w:pPr>
+        <w:spacing w:line="400" w:lineRule="exact"/>
+        <w:ind w:firstLine="480"/>
+      </w:pPr>
+      <w:r>
+        <w:rPr>
+          <w:rFonts w:ascii="宋体" w:hAnsi="宋体"/>
+          <w:sz w:val="24"/>
+          <w:color w:val="FF0000"/>
+        </w:rPr>
+        <w:t xml:space="preserve">《太平御览》引石虎《邺中记》曰：“虎正会，殿前作乐，高絬、鱼龙、凤凰、安息五案之属，莫不毕备。有额上缘橦，至上鸟飞，左回右转，又以橦着口齿上，亦如之。设马车，立木橦其车上，长二丈，橦头安橦木，两伎儿各坐木一头，或鸟飞，或倒挂。”</w:t>
+      </w:r>
+    </w:p>
+    <w:p>
+      <w:pPr>
+        <w:spacing w:line="400" w:lineRule="exact"/>
+        <w:ind w:firstLine="480"/>
+      </w:pPr>
+      <w:r>
+        <w:rPr>
+          <w:rFonts w:ascii="宋体" w:hAnsi="宋体"/>
+          <w:sz w:val="24"/>
+          <w:color w:val="FF0000"/>
+        </w:rPr>
+        <w:t xml:space="preserve">这条记载的信息量极为丰富。其一，石虎正会百戏的节目配置与北魏诏令所列“高絬、鱼龙、凤凰、安息五案”高度重合，表明十六国时期的百戏体系与汉代一脉相承，并直接为北魏的制度化增修提供了基础。其二，“额上缘橦，至上鸟飞，左回右转”记录了以额头顶竿、竿上之人如鸟飞旋的技艺细节，而“又以橦着口齿上”则记录了以口齿咬持长竿的技法，这与南齐萧宝卷“齿上担幢”的记载遥相呼应，说明口部支撑的技法在十六国时期已有实践，并非萧宝卷的独创。其三，“设马车，立木橦其车上”是将竿技与车马结合的复合型演出，两名伎儿分坐橦木两端，在行进的车上完成“鸟飞”“倒挂”等动作，其难度与视觉冲击力远超静态的地面竿技。这条材料表明，十六国时期的百戏并非对汉代旧例的简单重复，而是在技艺形式上有所创新与发展。</w:t>
+      </w:r>
+    </w:p>
+    <w:p>
+      <w:pPr>
+        <w:spacing w:line="400" w:lineRule="exact"/>
+        <w:ind w:firstLine="480"/>
+      </w:pPr>
+      <w:r>
+        <w:rPr>
+          <w:rFonts w:ascii="宋体" w:hAnsi="宋体"/>
+          <w:sz w:val="24"/>
+        </w:rPr>
+        <w:t>这种禁而不止的格局，在南朝帝王身上表现得更为极端。南齐末帝萧宝卷对杂技的痴迷几乎到了不顾身体的程度。他不仅日常观赏百戏，更亲身习练竿木类高难技艺。据《南史》所载：</w:t>
+      </w:r>
+      <w:r>
+        <w:rPr>
+          <w:rStyle w:val="a30"/>
+        </w:rPr>
+        <w:footnoteReference w:id="5"/>
+      </w:r>
+    </w:p>
+    <w:p>
+      <w:pPr>
+        <w:spacing w:line="400" w:lineRule="exact"/>
+        <w:ind w:firstLine="480"/>
+      </w:pPr>
+      <w:r>
+        <w:rPr>
+          <w:rFonts w:ascii="楷体" w:eastAsia="楷体" w:hAnsi="楷体"/>
+          <w:sz w:val="24"/>
+        </w:rPr>
+        <w:t>能担幢，初学担幢，每倾倒，在幢杪者，必致踠伤。其后，白虎幢七丈五尺，齿上担之，折齿不倦。</w:t>
+      </w:r>
+    </w:p>
+    <w:p>
+      <w:pPr>
+        <w:spacing w:line="400" w:lineRule="exact"/>
+        <w:ind w:firstLine="480"/>
+      </w:pPr>
+      <w:r>
+        <w:rPr>
+          <w:rFonts w:ascii="宋体" w:hAnsi="宋体"/>
+          <w:sz w:val="24"/>
+        </w:rPr>
+        <w:t>“担幢”即肩扛或手持长竿，由体态轻盈且有舞蹈功底者攀援其上翻腾跳跃，持竿者须同时驾驭力量与平衡，方能保竿不坠，此技后世又称“缘橦”或“顶</w:t>
+      </w:r>
+      <w:r>
+        <w:rPr>
+          <w:rFonts w:ascii="宋体" w:hAnsi="宋体"/>
+          <w:sz w:val="24"/>
+        </w:rPr>
+        <w:lastRenderedPageBreak/>
+        <w:t>竿”，属杂技中难度极高的一类。萧宝卷初学时技法尚未纯熟，竿上之人常因倾倒而遭踠伤；其后日渐精进，竟在传统肩扛手持之外另辟新径，以口齿咬持七丈五尺的白虎幢木，大幅提升了平衡与力量的双重难度，弄得齿牙折损、口中流血仍乐此不疲。从技艺演进的角度观之，“齿上担幢”是对既有“担幢”技法的一次显著改进，以口部支撑替代肩臂承力，表演的惊险性与视觉冲击力随之陡增。《南史》的书写本意在于讽谏荒主、为亡国张本，然而史家无意间保存了一则从初学到精熟再到创新的完整习艺过程，为杂技史研究留下了极为罕见的帝王亲操实录。</w:t>
+      </w:r>
+      <w:r>
+        <w:rPr>
+          <w:rStyle w:val="a30"/>
+        </w:rPr>
+        <w:footnoteReference w:id="6"/>
+      </w:r>
+    </w:p>
+    <w:p>
+      <w:pPr>
+        <w:spacing w:line="400" w:lineRule="exact"/>
+        <w:ind w:firstLine="480"/>
+      </w:pPr>
+      <w:r>
+        <w:rPr>
+          <w:rFonts w:ascii="楷体" w:eastAsia="楷体" w:hAnsi="楷体"/>
+          <w:color w:val="FF0000"/>
+          <w:sz w:val="24"/>
+        </w:rPr>
+        <w:t>（三）物质文化视角下的百戏衣饰书写</w:t>
+      </w:r>
+    </w:p>
+    <w:p>
+      <w:pPr>
+        <w:spacing w:line="400" w:lineRule="exact"/>
+        <w:ind w:firstLine="480"/>
+      </w:pPr>
+      <w:r>
+        <w:rPr>
+          <w:rFonts w:ascii="宋体" w:hAnsi="宋体"/>
+          <w:sz w:val="24"/>
+        </w:rPr>
+        <w:t>值得注意的是，魏晋南北朝时期的杂技书写并未止步于制度沿革与演出实况，而是进一步触及了百戏的物质形态，尤其是服饰。这一维度在汉代文献中几乎完全缺席，至此时期方始露出端倪。《魏书》中一则宗室逾制的轶事，无意间保留了关于“百戏衣”的珍贵信息：</w:t>
+      </w:r>
+    </w:p>
+    <w:p>
+      <w:pPr>
+        <w:spacing w:line="400" w:lineRule="exact"/>
+        <w:ind w:firstLine="480"/>
+      </w:pPr>
+      <w:r>
+        <w:rPr>
+          <w:rFonts w:ascii="楷体" w:eastAsia="楷体" w:hAnsi="楷体"/>
+          <w:sz w:val="24"/>
+        </w:rPr>
+        <w:t>（乐浪王万寿）子忠，肃宗时，复前爵，位太常少卿。出帝泛舟天渊池，命宗室诸王陪宴。忠愚而无智，性好衣服，遂著红罗襦，绣作领，碧细，锦为缘。帝谓曰：“朝廷衣冠，应有常式，何为著百戏衣？”忠曰：“臣少来所爱，情存绮罗，歌衣舞服，是臣所愿。”帝曰：“人之无良，乃至此乎！”</w:t>
+      </w:r>
+    </w:p>
+    <w:p>
+      <w:pPr>
+        <w:spacing w:line="400" w:lineRule="exact"/>
+        <w:ind w:firstLine="480"/>
+      </w:pPr>
+      <w:r>
+        <w:rPr>
+          <w:rFonts w:ascii="宋体" w:hAnsi="宋体"/>
+          <w:sz w:val="24"/>
+        </w:rPr>
+        <w:t>出帝一望即辨出忠所穿为“百戏衣”，可知百戏服饰在当时已形成相对固定且辨识度极高的形制特征，与日常冠服迥然有别。据文中所述，忠身上所穿为红罗短襦、绣花衣领、碧色细布、锦缎滚边，红与碧大胆并置，锦、绣、罗等不同质地的面料拼合使用，整体效果浓艳纷繁、华丽夺目。这与朝廷冠服强调等级有序、色彩节制的规制截然不同。出帝斥之以“朝廷衣冠，应有常式”，恰好从反面勾勒出百戏衣的特殊定位：它自外于朝廷服制的等级序列，遵循的是另一套以色彩张力和视觉效果为导向的审美逻辑，服务于舞台表演中远距离观赏的需要。忠以“歌衣舞服，是臣所愿”作答，语虽戏谑，却也折射出百戏服饰在当时社会中的某种感染力，其绮丽绚烂的视觉效果足以令人心生向往，甚至不惜逾越服制。</w:t>
+      </w:r>
+    </w:p>
+    <w:p>
+      <w:pPr>
+        <w:spacing w:line="400" w:lineRule="exact"/>
+        <w:ind w:firstLine="480"/>
+      </w:pPr>
+      <w:r>
+        <w:rPr>
+          <w:rFonts w:ascii="宋体" w:hAnsi="宋体"/>
+          <w:sz w:val="24"/>
+        </w:rPr>
+        <w:t>这条材料虽不过寥寥数行，却将杂技百戏的文献书写从仪典程序和技艺名目，推进到了演出者着装与物质文化的层面。汉代百戏记载大多着眼于宏观的制度安排与节目陈列，对表演者个体的装束面貌几乎不著一字；而北魏此条轶闻的出现，标志着杂技书写开始触及更为具象、更为生活化的细节，为后人复原百戏演出的完整面貌提供了一重此前未曾显露的维度。</w:t>
       </w:r>
     </w:p>
     <w:p>
@@ -74,20 +768,49 @@
           <w:sz w:val="28"/>
           <w:szCs w:val="28"/>
         </w:rPr>
-        <w:t>一、汉代：杂技的制度化书写</w:t>
-      </w:r>
-    </w:p>
-    <w:p>
-      <w:pPr>
-        <w:spacing w:line="400" w:lineRule="exact"/>
-        <w:ind w:firstLine="480"/>
-      </w:pPr>
-      <w:r>
-        <w:rPr>
-          <w:rFonts w:ascii="宋体" w:hAnsi="宋体"/>
-          <w:sz w:val="24"/>
-        </w:rPr>
-        <w:t>汉代是中国杂技制度化发展的肇始阶段。这一时期，杂技的相关记载散见于正史纪传、注疏及政书之中，从未以独立篇章的形式出现，而是附着于朝贡往来、宫廷宴飨、朝会仪典等政治事件的记录之中。这一文献现象本身即具有重要的认识价值，它既说明杂技在时人的知识分类体系中尚未获得自足的门类地位，也表明彼时书写者关注的并非技艺本身，而是技艺在特定政治情境中被展演这一事实及其所承载的礼仪与外交功能。与后世魏晋南北朝禁而不止的矛盾性记载、隋唐全景铺陈式的盛况描写不同，汉代杂技的书写始终围绕国家礼仪与对外交流两条线索展开，呈现出鲜明的制度化特征。</w:t>
+        <w:t>三、隋唐：杂技记载的丰富与细化</w:t>
+      </w:r>
+    </w:p>
+    <w:p>
+      <w:pPr>
+        <w:spacing w:line="400" w:lineRule="exact"/>
+        <w:ind w:firstLine="480"/>
+      </w:pPr>
+      <w:r>
+        <w:rPr>
+          <w:rFonts w:ascii="宋体" w:hAnsi="宋体"/>
+          <w:sz w:val="24"/>
+        </w:rPr>
+        <w:lastRenderedPageBreak/>
+        <w:t>隋唐两代是杂技在史籍中记载最为丰富的时期。与魏晋南北朝文献多在制度沿革或禁令颁行的语境中附带提及百戏不同，隋唐史料对杂技的记述呈现出明显的细化趋势：节目名目不再仅以类名笼统概括，而是逐一记录其演出过程、技术细节与现场反应；书写者的态度与情感也不再隐藏在制度性话语之后，而是通过叙述方式的变化得以体现。这种记载方式的转变，既与隋唐百戏本身在规模和技艺上的空前发展有关，也与这一时期文献体例的变化密切相关：笔记体著述日渐兴盛，为杂技这类难以完全纳入正史志书体例的表演艺术提供了更为灵活的记录空间。</w:t>
+      </w:r>
+    </w:p>
+    <w:p>
+      <w:pPr>
+        <w:spacing w:line="400" w:lineRule="exact"/>
+        <w:ind w:firstLine="480"/>
+      </w:pPr>
+      <w:r>
+        <w:rPr>
+          <w:rFonts w:ascii="宋体" w:hAnsi="宋体"/>
+          <w:color w:val="FF0000"/>
+          <w:sz w:val="24"/>
+        </w:rPr>
+        <w:t>隋唐时百戏在宴乐中的“重兴”除正史与《教坊记》外，亦见于《明皇杂录》《乐府杂录》等对酺宴、广场百戏的记载，杂技书写的载体与层次更为丰富。</w:t>
+      </w:r>
+    </w:p>
+    <w:p>
+      <w:pPr>
+        <w:spacing w:line="400" w:lineRule="exact"/>
+        <w:ind w:firstLine="480"/>
+      </w:pPr>
+      <w:r>
+        <w:rPr>
+          <w:rFonts w:ascii="宋体" w:hAnsi="宋体"/>
+          <w:color w:val="FF0000"/>
+          <w:sz w:val="24"/>
+        </w:rPr>
+        <w:t xml:space="preserve">玄宗朝的酺宴百戏尤为壮观。《资治通鉴》载其酺宴“先设太常雅乐坐部、立部，继以鼓吹、胡乐、教坊、府县散乐、杂戏”，又出宫人舞《霆裳羽衣》，教舞马百匹衔杯上寿，引犀象入场或拜或舞。郑綮《开天传信记》称“百戏竞作，人物填咽”，《明皇杂录》记“大陈山车旱船，寻撞走索，丸剑角抵，戏马斗鸡”，又令宫女数百击雷鼓为《破阵乐》等曲，场面极为壮观。《乐府杂录》更言“观者数千万众，喧哗聚语，莫得闻鱼龙百戏之音”，可见酺宴观演的规模之大。值得注意的是，尽管百戏在酺宴中扮演着不可或缺的角色，其在制度话语中的地位却始终偶尬。《唐会要》载“散乐历代有之，谓之百戏”，玄宗以其非“正声”，从太常寺中别出，另置教坊于禁中以管辖。这一安排意味着百戏在制度层面被明确排斥在雅乐体系之外，却在实践中获得了专门的组织机构和演出空间，这种名实之间的张力，与汉代以来百戏在礼乐话语与实际演出之间的落差一脉相承。</w:t>
       </w:r>
     </w:p>
     <w:p>
@@ -101,52 +824,65 @@
           <w:color w:val="FF0000"/>
           <w:sz w:val="24"/>
         </w:rPr>
-        <w:t>（一）政治仪轨与杂技书写的依附性</w:t>
-      </w:r>
-    </w:p>
-    <w:p>
-      <w:pPr>
-        <w:spacing w:line="400" w:lineRule="exact"/>
-        <w:ind w:firstLine="480"/>
-      </w:pPr>
-      <w:r>
-        <w:rPr>
-          <w:rFonts w:ascii="宋体" w:hAnsi="宋体"/>
-          <w:sz w:val="24"/>
-        </w:rPr>
-        <w:t>汉代正史中的杂技记载，几乎无一例外地依附于某一政治事件或礼仪场合。史家提及杂技百戏，从来不是为了记录技艺的精妙，而是将其作为评判帝王贤愚、标识国政盛衰的一个侧面。</w:t>
-      </w:r>
-    </w:p>
-    <w:p>
-      <w:pPr>
-        <w:spacing w:line="400" w:lineRule="exact"/>
-        <w:ind w:firstLine="480"/>
-      </w:pPr>
-      <w:r>
-        <w:rPr>
-          <w:rFonts w:ascii="宋体" w:hAnsi="宋体"/>
-          <w:sz w:val="24"/>
-        </w:rPr>
-        <w:t>《史记·李斯列传》载秦二世“居甘泉宫，方作觳抵优俳之观”，是较早将杂技纳入正史的记录。细审文脉可知，此条记载的叙事重心并非觳抵表演的具体内容。太史公不曾描摹任何技艺细节，其着意之处在于以秦二世沉溺声色的行为，映衬其荒于朝政、终至亡国的结局。杂技在此仅充当政治评价的注脚，是正史借艺言政笔法的早期范例。</w:t>
+        <w:t>（一）节庆宴享与百戏的宏大叙事</w:t>
+      </w:r>
+    </w:p>
+    <w:p>
+      <w:pPr>
+        <w:spacing w:line="400" w:lineRule="exact"/>
+        <w:ind w:firstLine="480"/>
+      </w:pPr>
+      <w:r>
+        <w:rPr>
+          <w:rFonts w:ascii="宋体" w:hAnsi="宋体"/>
+          <w:sz w:val="24"/>
+        </w:rPr>
+        <w:t>隋炀帝大业年间的百戏盛会，是杂技记载由简略走向详细的一个重要节点。《隋书·音乐下》详载大业二年（606）突厥启民可汗（染干）来朝时的演出情况：</w:t>
       </w:r>
       <w:r>
         <w:rPr>
           <w:rStyle w:val="a30"/>
         </w:rPr>
-        <w:footnoteReference w:id="1"/>
-      </w:r>
-    </w:p>
-    <w:p>
-      <w:pPr>
-        <w:spacing w:line="400" w:lineRule="exact"/>
-        <w:ind w:firstLine="480"/>
-      </w:pPr>
-      <w:r>
-        <w:rPr>
-          <w:rFonts w:ascii="宋体" w:hAnsi="宋体"/>
-          <w:sz w:val="24"/>
-        </w:rPr>
-        <w:t>至《汉书》，百戏的相关记载明显增多，但这种依附性并未改变，反而更加鲜明。汉武帝以降，大一统王朝日趋稳固，宫廷朝贺与宴飨活动成为彰显国力、接待外邦的重要场合，杂技作为百戏之核心内容被纳入其中。《汉书》对这些场景的记录，本质上是对礼乐制度与政治秩序的文本建构，史家之所以提及百戏，是因为它构成了朝会仪程的实际环节；记百戏即记礼仪，记礼仪即记制度。杂技的技艺本身并非书写重心，其作为国家仪典组成部分的制度功能，才是史家措意所在。</w:t>
+        <w:footnoteReference w:id="7"/>
+      </w:r>
+    </w:p>
+    <w:p>
+      <w:pPr>
+        <w:spacing w:line="400" w:lineRule="exact"/>
+        <w:ind w:firstLine="480"/>
+      </w:pPr>
+      <w:r>
+        <w:rPr>
+          <w:rFonts w:ascii="楷体" w:eastAsia="楷体" w:hAnsi="楷体"/>
+          <w:sz w:val="24"/>
+        </w:rPr>
+        <w:t>及大业二年，突厥染干来朝，炀帝欲夸之，总追四方散乐，大集东都。初于芳华苑积翠池侧，帝帷宫女观之。有舍利先来，戏于场内，须臾跳跃，激水满衢，鼋鼍龟鳖，水人虫鱼，遍覆于地。又有大鲸鱼，喷雾翳日，倏忽化成黄龙，长七八丈，耸踊而出，名曰黄龙变。又以绳系两柱，相去十丈，遣二倡女对舞绳上，相逢切肩而过，歌舞不辍。又为夏育扛鼎，取车轮石臼大瓮器等，各于掌上而跳弄之。并二人戴竿，其上有舞，忽然腾透而换易之。又有神鳌负山，幻人吐火，千变万化，旷古莫俦。染干大骇之，自是皆于太常教习。每岁正月，万国来朝，留至十五日，于端门外，建国门内，绵亘八里，列为戏场。</w:t>
+      </w:r>
+    </w:p>
+    <w:p>
+      <w:pPr>
+        <w:spacing w:line="400" w:lineRule="exact"/>
+        <w:ind w:firstLine="480"/>
+      </w:pPr>
+      <w:r>
+        <w:rPr>
+          <w:rFonts w:ascii="宋体" w:hAnsi="宋体"/>
+          <w:sz w:val="24"/>
+        </w:rPr>
+        <w:t>这段文字是现存史籍中对单次百戏演出描写最为完整的段落之一，其叙述方式和包含的信息值得从多个层面加以分析。</w:t>
+      </w:r>
+    </w:p>
+    <w:p>
+      <w:pPr>
+        <w:spacing w:line="400" w:lineRule="exact"/>
+        <w:ind w:firstLine="480"/>
+      </w:pPr>
+      <w:r>
+        <w:rPr>
+          <w:rFonts w:ascii="宋体" w:hAnsi="宋体"/>
+          <w:sz w:val="24"/>
+        </w:rPr>
+        <w:t>从演出背景来看，此次百戏汇演的直接目的是“夸之”，即炀帝意图以百戏的宏大场面向突厥来使展示国力。“总追四方散乐，大集东都”一句点明了演出人员的来源：并非仅依靠东都洛阳本地的太常乐署班底，而是将分散在各地的民间散乐全部征集而来。这一做法本身说明了隋代散乐百戏的存在方式：大量技艺精湛的杂技艺人平时分散于各地，并不完全依附于宫廷乐署体制，只有朝廷以行政力量统一征召，才能汇聚成如此大的演出规模。也就是说，宫廷百戏的兴盛并非单纯依靠官方机构的内部培养，而是建立在广泛的民间技艺基础之上。</w:t>
       </w:r>
     </w:p>
     <w:p>
@@ -160,7 +896,60 @@
           <w:sz w:val="24"/>
           <w:color w:val="FF0000"/>
         </w:rPr>
-        <w:t xml:space="preserve">与此同时，百戏在汉代亦引发了负面的评价。仲长统《理乱篇》言献帝“目极角抵之观，耳穷郑卫之声”，将角抵百戏与郑卫之音相提并论，视之为不合礼义的娱乐形式。这一评价角度揭示了汉代杂技书写的另一重面向，即在制度性记载之外，还存在一套以礼义规范为尺度的批判性话语。百戏在全国范围内的流行，在儒学话语体系中则被解读为娱乐风气泛滥的证据，这种批判与官方仪典中对百戏的制度化利用形成了张力，也预示了后世魏晋南北朝禁断与实践交替出现的格局。</w:t>
+        <w:t xml:space="preserve">除朝廷直接组织外，地方官员的咄使也助推了百戏演出的社会化扩展。大业三年，裴矩因蓻夷来朝贡者众多，讽帝令都下大设百戏，征四方奇技异艺陈于端门街，观者“衣锦绮、珥金翠者，以十数万”，且勒令三市店铺“皆设帷帐，盛列酒食”，遣掌藩率蓻夷与民贸易，“蓻夷嗟叹，谓中国为神仙”。这条记载表明，百戏在隋代的外交性展演已不仅局限于宫廷内部，而是扩展至都城街市，成为一种动员全城的综合性景观。市民与蓻夷共同观演、共同交易，百戏在此已超越了单纯的宫廷仪典层面，成为帝国繁华形象的整体营造手段。</w:t>
+      </w:r>
+    </w:p>
+    <w:p>
+      <w:pPr>
+        <w:spacing w:line="400" w:lineRule="exact"/>
+        <w:ind w:firstLine="480"/>
+      </w:pPr>
+      <w:r>
+        <w:rPr>
+          <w:rFonts w:ascii="宋体" w:hAnsi="宋体"/>
+          <w:sz w:val="24"/>
+        </w:rPr>
+        <w:t>从节目内容来看，这段文字以“又”字连缀，依次列举了水戏幻化（舍利戏水、黄龙变）、绳技（二倡女对舞绳上）、力技（夏育扛鼎、掌上跳弄重物）、竿</w:t>
+      </w:r>
+      <w:r>
+        <w:rPr>
+          <w:rFonts w:ascii="宋体" w:hAnsi="宋体"/>
+          <w:sz w:val="24"/>
+        </w:rPr>
+        <w:lastRenderedPageBreak/>
+        <w:t>技（戴竿腾透换易）、幻术（神鳌负山、幻人吐火）等多个类别。其中“黄龙变”一目值得特别注意：大鲸鱼先以喷雾营造弥漫之势，随即“倏忽化成黄龙，长七八丈，耸踊而出”，在观者眼前完成鱼龙之间的瞬间变化。这与汉代张衡《西京赋》所写“鱼龙曼延”的描述前后相通，但远比张衡的赋体铺陈更为具体，不仅交代了变化的起始形态（鲸鱼）、过渡手段（喷雾翳日）和最终结果（黄龙耸踊），还给出了七八丈这样的尺寸数据，使得表演的视觉规模有了较为具体的参照。这种从修辞性描写向实录性记载的转变，是隋唐杂技书写区别于汉代赋体叙述的一个重要特征。绳技一目中“相逢切肩而过，歌舞不辍”八字，以简短的篇幅便呈现了两名倡女在十丈高空的绳索上相向而行、擦肩交会而舞姿不乱的场面，信息量远超此前各类文献中对绳技的概括性提及。竿技一目“忽然腾透而换易之”，则以极简的笔墨记录了竿上舞者在两根竿之间凌空飞换的动作，较之北魏文献中仅以“缘橦”二字概括的写法，描写的精细程度已有明显提升。</w:t>
+      </w:r>
+    </w:p>
+    <w:p>
+      <w:pPr>
+        <w:spacing w:line="400" w:lineRule="exact"/>
+        <w:ind w:firstLine="480"/>
+      </w:pPr>
+      <w:r>
+        <w:rPr>
+          <w:rFonts w:ascii="宋体" w:hAnsi="宋体"/>
+          <w:sz w:val="24"/>
+        </w:rPr>
+        <w:t>从演出效果来看，“染干大骇之”四字值得关注。百戏在此不仅是宫廷娱乐，而且被明确赋予了外交展示的功能；突厥来使的“大骇”正是炀帝“欲夸之”意图的实现。而文末“自是皆于太常教习”一句，则揭示了此次盛会的另一重后果：演出结束后，原本分散各地的民间散乐并未遣返原籍，而是被统一纳入太常寺进行常规教习训练。这意味着大业二年的百戏汇演不仅是一场外交性质的一次性表演，也成为隋代将散乐百戏正式纳入国家乐署体制的一个契机。“每岁正月，万国来朝，留至十五日”的常态化安排，以及“端门外、建国门内，绵亘八里”的固定演出空间，均表明百戏自此由偶发的征召式演出转变为年度性的制度化活动。八里之长的戏场规模，即便考虑到史书记载中可能存在的夸大成分，也足以说明隋代百戏在空间组织上已达到相当高的水平。</w:t>
+      </w:r>
+    </w:p>
+    <w:p>
+      <w:pPr>
+        <w:spacing w:line="400" w:lineRule="exact"/>
+        <w:ind w:firstLine="480"/>
+      </w:pPr>
+      <w:r>
+        <w:rPr>
+          <w:rFonts w:ascii="宋体" w:hAnsi="宋体"/>
+          <w:sz w:val="24"/>
+        </w:rPr>
+        <w:t>入唐之后，百戏的制度化管理进一步完善。唐代设左右教坊，将各类表演技艺分别管辖，杂技百戏不再附属于太常寺的雅乐系统，而是在教坊体制下获得了相对独立的组织空间。《旧唐书》《新唐书》均有关于教坊制度的详细记载。崔令钦所撰《教坊记》以笔记体裁专门记录教坊的演出情况与日常运作，为杂技记载提供了正史志书所不能容纳的具体细节。其中关于竿技的一则记载值得注意：“上偏私在左厢，故楼下戏，右厢竿木多失落。”玄宗观赏楼下百戏时，目光偏向左教坊一侧，右教坊的竿技艺人因此频频失手。这条记录看似只是一则演出轶事，实际上说明了两个问题：第一，竿技在盛唐时期隶属右教坊管辖，左右教坊各有分工，杂技门类的行政归属已有明确划分；第二，帝王的注视方向直接影响到演出质量，这从侧面反映了教坊艺人高度依附于皇权好恶的处境，御前演出的压力之大，以至于天子目光的些许偏移便足以干扰技艺发挥。</w:t>
+      </w:r>
+      <w:r>
+        <w:rPr>
+          <w:rStyle w:val="a30"/>
+        </w:rPr>
+        <w:footnoteReference w:id="8"/>
       </w:r>
     </w:p>
     <w:p>
@@ -174,21 +963,100 @@
           <w:sz w:val="24"/>
           <w:color w:val="FF0000"/>
         </w:rPr>
-        <w:t>《史记·大宛列传》的记载则为汉代百戏书写提供了另一重要线索。司马迁载武帝招待外国宾客时，“大角抵，出奇戏诸怪物，多聚观者……而觳抵奇戏岁增变，甚盛益兴，自此始”。“自此始”三字值得注意，它标志着正史首次以编年的方式，为百戏演出的制度化兴盛确立了一个明确的时间起点。武帝朝以百戏夸示外宾的做法自此成为常例，并被后世史家反复援引，成为汉代杂技书写中被征引频率最高的文本之一。</w:t>
-      </w:r>
-    </w:p>
-    <w:p>
-      <w:pPr>
-        <w:spacing w:line="400" w:lineRule="exact"/>
-        <w:ind w:firstLine="480"/>
-      </w:pPr>
-      <w:r>
-        <w:rPr>
-          <w:rFonts w:ascii="宋体" w:hAnsi="宋体"/>
-          <w:sz w:val="24"/>
+        <w:t xml:space="preserve">现存文献还记载了武则天朝以百戏接待外藩的实例。据《旧唐书》，吐蕃遣使论弥萨等人朝请求和，则天宴之于麟德殿，奏百戏于殿庭。吐蕃使者表示“臣生于边荒，由来不识中国音乐”，乞求亲观，观后“相视笑忔拜谢”，称“得亲观奇乐，一生所未见”。次年吐蕃即献马千匹、金二千两以求婚。虽史书未直言夸示，但结合当时唐在与吐蕃之战中的胜利背景，这场百戏展演的外交夸示功能不言而喻。这表明，从汉武帝到武则天，以百戏夸示外宾的传统贯穿了数百年，其核心逻辑始终是借视觉奇观的震撼力来塑造帝国形象。</w:t>
+      </w:r>
+    </w:p>
+    <w:p>
+      <w:pPr>
+        <w:spacing w:line="400" w:lineRule="exact"/>
+        <w:ind w:firstLine="480"/>
+      </w:pPr>
+      <w:r>
+        <w:rPr>
+          <w:rFonts w:ascii="宋体" w:hAnsi="宋体"/>
+          <w:sz w:val="24"/>
+        </w:rPr>
+        <w:lastRenderedPageBreak/>
+        <w:t>《教坊记》中关于小儿竿技的一段记述，更是将盛唐杂技记载的细致程度推到了一个新的高度：</w:t>
+      </w:r>
+      <w:r>
+        <w:rPr>
+          <w:rStyle w:val="a30"/>
+        </w:rPr>
+        <w:footnoteReference w:id="9"/>
+      </w:r>
+    </w:p>
+    <w:p>
+      <w:pPr>
+        <w:spacing w:line="400" w:lineRule="exact"/>
+        <w:ind w:firstLine="480"/>
+      </w:pPr>
+      <w:r>
+        <w:rPr>
+          <w:rFonts w:ascii="楷体" w:eastAsia="楷体" w:hAnsi="楷体"/>
+          <w:sz w:val="24"/>
+        </w:rPr>
+        <w:t>上于天津桥南设帐殿，酺三日。教坊一小儿，筋斗绝伦，乃衣以彩缯，梳洗，杂于内妓中。少顷，缘长竿上，倒立，寻复去手。久之，垂手抱竿，翻身而下。乐人等皆舍所执，宛转于地，大呼万岁，百官拜庆。中使宣旨云：“此技尤难，近教坊教成。”其实乃小儿也。</w:t>
+      </w:r>
+    </w:p>
+    <w:p>
+      <w:pPr>
+        <w:spacing w:line="400" w:lineRule="exact"/>
+        <w:ind w:firstLine="480"/>
+      </w:pPr>
+      <w:r>
+        <w:rPr>
+          <w:rFonts w:ascii="宋体" w:hAnsi="宋体"/>
+          <w:sz w:val="24"/>
+        </w:rPr>
+        <w:t>这段记述的突出之处，在于它几乎以一种戏剧化的节奏来安排整场演出的叙述。先写准备：小儿被穿上彩色丝织衣物、精心梳洗，混在内妓之中，有意隐藏其真实身份；再写攀升：“缘长竿上，倒立”已属高难技巧，“寻复去手”则在倒立的基础上进一步撤去手部支撑，难度又增一层；接写高潮：“久之”二字延长了悬停的时间感，使旁观者的紧张感随之积累，而后“垂手抱竿，翻身而下”以干脆利落的动作结束全程；最后写反响：乐人放下手中乐器伏地欢呼，百官拜庆，中使宣旨揭开谜底：“其实乃小儿也。”书写者有意将小儿的真实身份保留到最后一句才予以揭示，使整段叙述形成了“设悬、展演、揭晓”的完整结构。小儿体态轻便、身形灵活，适合在竿顶完成倒立和无手悬停等对平衡能力要求极高的动作，而教坊特意将其装扮为成年女妓的样貌混入队列，本身就是一种经过设计的表演策略；观众在不知情的状态下观看高难技艺，等到谜底揭开，得知表演者竟是年幼孩童，惊叹之情随之加倍。这种叙述方式已不再是对演出事实的简单记录，而是带有明确的写作构思和情感引导，说明杂技书写在盛唐时期已从单纯的制度性记录发展为兼具文学性与现场感的叙事，</w:t>
+      </w:r>
+      <w:r>
+        <w:rPr>
+          <w:rFonts w:ascii="宋体" w:hAnsi="宋体"/>
           <w:color w:val="FF0000"/>
-        </w:rPr>
-        <w:t xml:space="preserve">除武帝朝外，汉代以百戏宴外宾的做法延续于后世。《汉书·西域传》载宣帝元康二年宴请乌孙使者，宴中即有大角抵与乐作。而《汉书》另载，汉廷设“酒池肉林”以飨四夷之客，作《巴俱》都卢、海中《砎极》、漫衍鱼龙、角抵之戏以观视之，宴乐内容几乎全为百戏，场面宏大而奮奇迭出。顺帝时曾于广阳城门外祖会，以角抵百戏送单于归南庭；又以黄门鼓吹、角抵戏遣扶余国王。这些记载表明，百戏在汉代对外宴享中已形成固定的仪典节目，其功能不仅在于娱乐，更在于通过视觉奇观的营造来彰显帝国声威，使外邦客人产生“骇”的心理反应。</w:t>
+          <w:sz w:val="24"/>
+        </w:rPr>
+        <w:t>这种带有明确写作构思与情感引导的记述表明，盛唐时期的杂技书写已深刻介入了观演双方的心理互动，从单纯的制度性记录蜕变为兼具文学性与现场感的叙事。</w:t>
+      </w:r>
+    </w:p>
+    <w:p>
+      <w:pPr>
+        <w:spacing w:line="400" w:lineRule="exact"/>
+        <w:ind w:firstLine="480"/>
+      </w:pPr>
+      <w:r>
+        <w:rPr>
+          <w:rFonts w:ascii="宋体" w:hAnsi="宋体"/>
+          <w:sz w:val="24"/>
+        </w:rPr>
+        <w:t>此外，《封氏闻见记》《朝野佥载》等唐代笔记亦保存了不少杂技表演的第一手材料。《尚书故实》载有一则故事：</w:t>
+      </w:r>
+    </w:p>
+    <w:p>
+      <w:pPr>
+        <w:spacing w:line="400" w:lineRule="exact"/>
+        <w:ind w:firstLine="480"/>
+      </w:pPr>
+      <w:r>
+        <w:rPr>
+          <w:rFonts w:ascii="楷体" w:eastAsia="楷体" w:hAnsi="楷体"/>
+          <w:sz w:val="24"/>
+        </w:rPr>
+        <w:t>章仇兼琼镇蜀日，佛寺设大会，百戏在庭。有十岁童儿（一作女童）舞于竿杪。忽有物状如雕鹗，掠之而去。群众大骇，因而罢乐。后数日，其父母见在高塔之上，梯而取之，则神如痴，久之方语，云：‘见如壁画飞天夜叉者将入塔由，日饲果实饮馔之味，亦不知其所自。’旬日方精神如初。</w:t>
+      </w:r>
+    </w:p>
+    <w:p>
+      <w:pPr>
+        <w:spacing w:line="400" w:lineRule="exact"/>
+        <w:ind w:firstLine="480"/>
+      </w:pPr>
+      <w:r>
+        <w:rPr>
+          <w:rFonts w:ascii="宋体" w:hAnsi="宋体"/>
+          <w:sz w:val="24"/>
+        </w:rPr>
+        <w:t>长竿戏的难度既高，对表演者的要求也相应严格，表演过程中的危险性不言而喻。这则记载虽然带有志怪色彩（以“飞天夜叉”的传奇叙事来解释儿童失踪的缘由），但其背后所反映的问题却是真实的：在高竿之上演出的幼童极易遭遇意外，围观者只能将无法解释的突发事件归于神异。这类记载的存在，从另一个侧面说明了长竿戏的高风险性质，以及当时社会对这种风险的认知方式。</w:t>
       </w:r>
     </w:p>
     <w:p>
@@ -202,33 +1070,27 @@
           <w:color w:val="FF0000"/>
           <w:sz w:val="24"/>
         </w:rPr>
-        <w:t>（二）朝贡语境与域外技艺的政治化书写</w:t>
-      </w:r>
-    </w:p>
-    <w:p>
-      <w:pPr>
-        <w:spacing w:line="400" w:lineRule="exact"/>
-        <w:ind w:firstLine="480"/>
-      </w:pPr>
-      <w:r>
-        <w:rPr>
-          <w:rFonts w:ascii="宋体" w:hAnsi="宋体"/>
-          <w:sz w:val="24"/>
-        </w:rPr>
-        <w:t>汉代杂技书写的另一突出面向，是对域外技艺的记载。丝绸之路开通之后，西域及更远地区的杂技幻术经由朝贡渠道传入中原，相关信息被正史与注疏文献所保存，使得汉代杂技书写呈现出中外并存的格局。这在后世文献中并不多见。魏晋以降的记载多以本土技艺为主，汉代文献中域外技艺的频繁出现则折射出丝路初辟之际中原王朝对异域文化既惊异又包容的态度。</w:t>
-      </w:r>
-    </w:p>
-    <w:p>
-      <w:pPr>
-        <w:spacing w:line="400" w:lineRule="exact"/>
-        <w:ind w:firstLine="480"/>
-      </w:pPr>
-      <w:r>
-        <w:rPr>
-          <w:rFonts w:ascii="宋体" w:hAnsi="宋体"/>
-          <w:sz w:val="24"/>
-        </w:rPr>
-        <w:t>《后汉书·西域传》注引鱼豢《魏略》云：</w:t>
+        <w:lastRenderedPageBreak/>
+        <w:t>（二）国家衰落与杂技书写的情感转向</w:t>
+      </w:r>
+    </w:p>
+    <w:p>
+      <w:pPr>
+        <w:spacing w:line="400" w:lineRule="exact"/>
+        <w:ind w:firstLine="480"/>
+      </w:pPr>
+      <w:r>
+        <w:rPr>
+          <w:rFonts w:ascii="宋体" w:hAnsi="宋体"/>
+          <w:sz w:val="24"/>
+        </w:rPr>
+        <w:t>安史之乱的爆发，使盛唐百戏的繁荣景象发生了根本性的转变。姚汝能《安禄山事迹》中的一段记载，集中呈现了这场战乱对宫廷杂技艺人的打击：</w:t>
+      </w:r>
+      <w:r>
+        <w:rPr>
+          <w:rStyle w:val="a30"/>
+        </w:rPr>
+        <w:footnoteReference w:id="10"/>
       </w:r>
     </w:p>
     <w:p>
@@ -241,20 +1103,33 @@
           <w:rFonts w:ascii="楷体" w:eastAsia="楷体" w:hAnsi="楷体"/>
           <w:sz w:val="24"/>
         </w:rPr>
-        <w:t>“大秦国俗多奇幻，口中吐火，自缚自解，跳十二丸，巧妙非常。”</w:t>
-      </w:r>
-    </w:p>
-    <w:p>
-      <w:pPr>
-        <w:spacing w:line="400" w:lineRule="exact"/>
-        <w:ind w:firstLine="480"/>
-      </w:pPr>
-      <w:r>
-        <w:rPr>
-          <w:rFonts w:ascii="宋体" w:hAnsi="宋体"/>
-          <w:sz w:val="24"/>
-        </w:rPr>
-        <w:t>此条虽出自三国人鱼豢之手，所述却是汉代已有流传的域外技艺。奇幻巧妙的措辞，体现了中原人对这类技艺的基本认知。而《后汉书·南蛮·西南夷列传第七十六》则提供了更为完整的史实：</w:t>
+        <w:t>其乐人本玄宗所赐，皆非人间之伎，转相教习，得五百余人。或一人肩负首戴二十四人，戴竿长百余尺，至于竿杪，人腾掷如猿狖、飞鸟之势，竟为奇绝，累日不惮，观者汗流目眩。于是此辈歼矣。</w:t>
+      </w:r>
+    </w:p>
+    <w:p>
+      <w:pPr>
+        <w:spacing w:line="400" w:lineRule="exact"/>
+        <w:ind w:firstLine="480"/>
+      </w:pPr>
+      <w:r>
+        <w:rPr>
+          <w:rFonts w:ascii="宋体" w:hAnsi="宋体"/>
+          <w:sz w:val="24"/>
+        </w:rPr>
+        <w:t>这段文字的叙述结构值得注意。前半段集中描写技艺的高超：先以“皆非人间之伎”总括其技艺水准，继而以“一人肩负首戴二十四人”的具体数字呈现竿技的规模，再以“腾掷如猿狖、飞鸟之势”的比喻刻画竿上表演者凌空翻腾的灵活身姿，“累日不惮”说明其体力的持久，“观者汗流目眩”则从旁观者的身体反应来反衬演出的惊险。如此层层推进，将五百余名乐伎的技艺水平渲染至极。然而就在此处，笔锋突然一转，仅以“于是此辈歼矣”五字作结。彼时安禄山精锐尽出南下，后方空虚，奚、契丹二部乘隙袭扰范阳，这批乐伎原系玄宗所赐、历经府中数年转相传授而技艺日精，竟在此次兵祸中全部遇难。前文的浓墨重彩与末句的简短冷峻之间形成了强烈的反差，技艺的精妙与命运的残酷在几行之内骤然碰撞。这种写法并非偶然，书写者显然借助叙述节奏的急剧转换来传达深切的惋惜：技艺愈是精绝，其毁灭便愈令人痛惜。从杂技书写的发展来看，这段记载标志着一个值得注意的变化：书写者不再仅仅作为事实的客观记录者，而是通过叙述方式的选择来表达自身的情感判断，杂技书写由此获得了一种此前较为少见的主观维度。</w:t>
+      </w:r>
+    </w:p>
+    <w:p>
+      <w:pPr>
+        <w:spacing w:line="400" w:lineRule="exact"/>
+        <w:ind w:firstLine="480"/>
+      </w:pPr>
+      <w:r>
+        <w:rPr>
+          <w:rFonts w:ascii="宋体" w:hAnsi="宋体"/>
+          <w:sz w:val="24"/>
+        </w:rPr>
+        <w:t>安史之乱对百戏的影响不仅表现为艺人群体的骤然消亡，还在此后数十年间持续动摇着宫廷杂技的制度基础。代宗驾崩、德宗即位（779）之时，朝廷正处于战后恢复的困难阶段：连年战乱使国库空虚，而周边各国的朝贡往来也远不及开元、天宝年间之盛。教坊赖以维持的两大条件，即充足的财力供养与频繁的外交仪典需求，同时削弱，其规模的缩减已成必然。《旧唐书·德宗纪》载其即位之初的一系列裁减措施：</w:t>
       </w:r>
     </w:p>
     <w:p>
@@ -267,932 +1142,34 @@
           <w:rFonts w:ascii="楷体" w:eastAsia="楷体" w:hAnsi="楷体"/>
           <w:sz w:val="24"/>
         </w:rPr>
-        <w:t>永宁元年，掸国王雍由调复遣使者诣阙朝贺，献乐及幻人，能变化吐火，自支解，易牛马头。又善跳丸，数乃至千。自言我海西人。海西即大秦也，掸国西南通大秦。明年元会，安帝作乐于庭，封雍由调为汉大都尉，赐印绶、金银、彩缯各有差也。</w:t>
-      </w:r>
-    </w:p>
-    <w:p>
-      <w:pPr>
-        <w:spacing w:line="400" w:lineRule="exact"/>
-        <w:ind w:firstLine="480"/>
-      </w:pPr>
-      <w:r>
-        <w:rPr>
-          <w:rFonts w:ascii="宋体" w:hAnsi="宋体"/>
-          <w:sz w:val="24"/>
-        </w:rPr>
-        <w:t>两处记载可以互证，掸国使者所献的吐火、自支解、跳丸等技艺，系经由西域辗转传入的域外杂技。值得注意的是，《后汉书》这段记载的叙事结构并非单纯罗列技艺，而是将幻术表演与掸国朝贡、安帝元会作乐、封赏赐印等政治事件编织为一体。“自言我海西人。海西即大秦也，掸国西南通大秦”，史家特意交代幻人的身份来源与地理路线，为这批域外技艺标注了空间坐标；“明年元会，安帝作乐于庭”则说明掸国所献幻人已被纳入次年元旦朝会的演出仪程，其在宫廷中的地位由此可见。</w:t>
-      </w:r>
-    </w:p>
-    <w:p>
-      <w:pPr>
-        <w:spacing w:line="400" w:lineRule="exact"/>
-        <w:ind w:firstLine="480"/>
-      </w:pPr>
-      <w:r>
-        <w:rPr>
-          <w:rFonts w:ascii="宋体" w:hAnsi="宋体"/>
-          <w:sz w:val="24"/>
-        </w:rPr>
-        <w:t>换言之，域外杂技在正史中并非作为奇闻逸事被记录，而是被置于朝贡与外交的叙事框架之下。幻人技艺越是奇幻巧妙，便越能衬托汉王朝吸引远方、威服殊俗的文化辐射力。这种将域外文化元素编入官方叙事的做法，既保存了杂技东传的具体史实，客观上也成为汉代大一统格局与对外开放态势的文本印记。</w:t>
-      </w:r>
-    </w:p>
-    <w:p>
-      <w:pPr>
-        <w:spacing w:line="400" w:lineRule="exact"/>
-        <w:ind w:firstLine="480"/>
-      </w:pPr>
-      <w:r>
-        <w:rPr>
-          <w:rFonts w:ascii="楷体" w:eastAsia="楷体" w:hAnsi="楷体"/>
-          <w:color w:val="FF0000"/>
-          <w:sz w:val="24"/>
-        </w:rPr>
-        <w:t>（三）宴享空间与仪典百戏的实录性记录</w:t>
-      </w:r>
-    </w:p>
-    <w:p>
-      <w:pPr>
-        <w:spacing w:line="400" w:lineRule="exact"/>
-        <w:ind w:firstLine="480"/>
-      </w:pPr>
-      <w:r>
-        <w:rPr>
-          <w:rFonts w:ascii="宋体" w:hAnsi="宋体"/>
-          <w:sz w:val="24"/>
-        </w:rPr>
-        <w:t>除正史纪传中的片段记载外，汉代亦有部分文献对宫廷百戏的仪典场景和具体技艺留下了较为详尽的记录，其叙述之完整、细节之具体，远超一般纪传中的寥寥数语，为后人复原汉代百戏演出的实况提供了重要依据。</w:t>
-      </w:r>
-    </w:p>
-    <w:p>
-      <w:pPr>
-        <w:spacing w:line="400" w:lineRule="exact"/>
-        <w:ind w:firstLine="480"/>
-      </w:pPr>
-      <w:r>
-        <w:rPr>
-          <w:rFonts w:ascii="宋体" w:hAnsi="宋体"/>
-          <w:sz w:val="24"/>
-        </w:rPr>
-        <w:t>以高絙（走绳）技艺为例，《文献通考》引蔡质《汉官典仪》载东汉正月朝贺大典的百戏演出：</w:t>
-      </w:r>
-    </w:p>
-    <w:p>
-      <w:pPr>
-        <w:spacing w:line="400" w:lineRule="exact"/>
-        <w:ind w:firstLine="480"/>
-      </w:pPr>
-      <w:r>
-        <w:rPr>
-          <w:rFonts w:ascii="楷体" w:eastAsia="楷体" w:hAnsi="楷体"/>
+        <w:t>德宗皇帝……去无名之费，罢不急之官，出永巷之嫔嫱，放文单之驯象，减太官之膳，戒服玩之奢，解鹰犬而放伶伦，止榷酤而绝贡奉。</w:t>
+      </w:r>
+      <w:r>
+        <w:rPr>
+          <w:rStyle w:val="a30"/>
+        </w:rPr>
+        <w:footnoteReference w:id="11"/>
+      </w:r>
+    </w:p>
+    <w:p>
+      <w:pPr>
+        <w:spacing w:line="400" w:lineRule="exact"/>
+        <w:ind w:firstLine="480"/>
+      </w:pPr>
+      <w:r>
+        <w:rPr>
+          <w:rFonts w:ascii="宋体" w:hAnsi="宋体"/>
+          <w:sz w:val="24"/>
+        </w:rPr>
+        <w:t>“放伶伦”即遣散宫廷乐舞艺人。这道政令将百戏伶人与鹰犬、驯象并列在裁撤项目之中，其措辞方式值得注意：在德宗朝的行政话语中，宫廷百戏已从汉隋以来外交仪典中重要的组成部分，降为与禽兽玩好同类的非必要开支。这一定位的变化本身便反映出安史之乱后朝廷对百戏功能认识的转变：当国力衰退、外交活动减少时，百戏所承担的政治展示功能随之消退，其在朝廷话语中的位置便</w:t>
+      </w:r>
+      <w:r>
+        <w:rPr>
+          <w:rFonts w:ascii="宋体" w:hAnsi="宋体"/>
           <w:sz w:val="24"/>
         </w:rPr>
         <w:lastRenderedPageBreak/>
-        <w:t>正月旦，天子幸德阳殿，临轩。公、卿、将、大夫、百官各陪位朝贺。……舍利兽从西方来，戏于庭极，乃毕入殿前，激水化为比目鱼，跳跃嗽水，作雾障日。毕，化成黄龙，长八丈，出水遨戏于庭，炫耀日光。以两大丝绳系两柱间，相去数丈。两倡女对舞，行于绳上，对面道逢，切肩不倾。</w:t>
-      </w:r>
-    </w:p>
-    <w:p>
-      <w:pPr>
-        <w:spacing w:line="400" w:lineRule="exact"/>
-        <w:ind w:firstLine="480"/>
-      </w:pPr>
-      <w:r>
-        <w:rPr>
-          <w:rFonts w:ascii="宋体" w:hAnsi="宋体"/>
-          <w:sz w:val="24"/>
-        </w:rPr>
-        <w:t>这段文献的价值在于它完整呈现了一次正月朝贺中百戏演出的先后流程。自天子临轩、百官朝贺起，依次为舍利兽戏、激水化鱼、黄龙出水等大型鱼龙变幻之戏，最后以高絙走索收束。就技艺细节而言，“以两大丝绳系两柱间，相去数丈”交代了道具布设与空间规模；“两倡女对舞，行于绳上”点明表演者为女性，且系双人对舞而非单人独技；“对面道逢，切肩不倾”八字尤为传神，两位女伎在悬空绳索上迎面而行，交错时肩臂几乎相触而不失平衡，技艺之精与配合之默契，一览无余。</w:t>
-      </w:r>
-    </w:p>
-    <w:p>
-      <w:pPr>
-        <w:spacing w:line="400" w:lineRule="exact"/>
-        <w:ind w:firstLine="480"/>
-      </w:pPr>
-      <w:r>
-        <w:rPr>
-          <w:rFonts w:ascii="宋体" w:hAnsi="宋体"/>
-          <w:sz w:val="24"/>
-        </w:rPr>
-        <w:t>更需指出的是，高絙在此并非孤立的技艺展示，而是整套朝贺百戏中的一个环节。其前有舍利兽戏铺垫，继以鱼龙变幻营造奇观，高絙压轴则将观赏性推至顶点，其后当接天子封赏之礼收束全程。史家之所以不厌其详地记录每一节目的先后与内容，不是出于对技艺本身的赏鉴兴趣，而是因为这些演出构成了国家朝贺仪程的实际内容；记百戏即记仪典，记仪典即记制度。这正是汉代杂技书写的根本特征，即技艺始终被置于礼仪制度的框架之内加以叙述，其被书写的理由，在于它是王朝政治秩序与文化气象的一个组成部分。</w:t>
-      </w:r>
-    </w:p>
-    <w:p>
-      <w:pPr>
-        <w:spacing w:line="400" w:lineRule="exact"/>
-        <w:ind w:firstLine="480"/>
-      </w:pPr>
-      <w:r>
-        <w:rPr>
-          <w:rFonts w:ascii="宋体" w:hAnsi="宋体"/>
-          <w:sz w:val="24"/>
-          <w:color w:val="FF0000"/>
-        </w:rPr>
-        <w:t>百戏作为以视觉为主的宴乐演出，其强烈的观赏性不仅契合了汉代帝国夸示国力、营造奇观的需要，也促使文献书写产生了一种视觉化趋向，从汉赋的辞藻铺陈，转向对尺寸、空间与动作细节的实录性记载。除文字文献外，汉画像石、壁画、陶俑等图像与实物遗存亦构成了平行的图像书写。乐舞百戏图是汉画像石的常见主题，常与宴饮、庖厨图同列，以直观的视觉面貌填补了文字记录在展演空间与使用范围上的留白，二者形成了互证互补的关系。</w:t>
-      </w:r>
-    </w:p>
-    <w:p>
-      <w:pPr>
-        <w:spacing w:line="400" w:lineRule="exact"/>
-        <w:ind w:firstLine="480"/>
-      </w:pPr>
-      <w:r>
-        <w:rPr>
-          <w:rFonts w:ascii="宋体" w:hAnsi="宋体"/>
-          <w:sz w:val="24"/>
-          <w:color w:val="FF0000"/>
-        </w:rPr>
-        <w:t xml:space="preserve">汉代宴享用乐在制度上常归入“黄门鼓吹”或“散乐”名下，百戏作为散乐之一，在司马彪《续汉书·礼乐志》刘昭注引蔡质《汉仪》中即以“九宾散乐”之名与朝会仪程同载，所述舍利兽、鱼龙、高絙等节目与《汉官典仪》所记正月朝贺百戏相印证，共同构成汉代朝会宴享中百戏的仪式性书写。</w:t>
-      </w:r>
-    </w:p>
-    <w:p>
-      <w:pPr>
-        <w:spacing w:before="140" w:after="140"/>
-      </w:pPr>
-      <w:r>
-        <w:rPr>
-          <w:rFonts w:ascii="黑体" w:eastAsia="黑体" w:hAnsi="黑体"/>
-          <w:color w:val="000000"/>
-          <w:sz w:val="28"/>
-          <w:szCs w:val="28"/>
-        </w:rPr>
-        <w:t>二、魏晋南北朝：杂技的禁断与承续</w:t>
-      </w:r>
-    </w:p>
-    <w:p>
-      <w:pPr>
-        <w:spacing w:line="400" w:lineRule="exact"/>
-        <w:ind w:firstLine="480"/>
-      </w:pPr>
-      <w:r>
-        <w:rPr>
-          <w:rFonts w:ascii="宋体" w:hAnsi="宋体"/>
-          <w:sz w:val="24"/>
-        </w:rPr>
-        <w:t>魏晋南北朝是杂技书写发生明显转变的时期。与汉代将百戏统摄于朝贺仪典的整体性叙述不同，这一阶段的文献记载呈现出内在的紧张。一方面，禁断百戏的诏令屡见于正史帝纪；另一方面，宫廷演出的实况描写却不绝于书。这种矛盾性记载本身即构成该时段杂技书写的显著特征，折射出百戏在礼乐秩序与宫廷娱乐之间的暧昧位置。与此同时，拓跋鲜卑入主中原后对百戏的制度性接纳，以及南朝帝王亲习杂技的个案，又为这一时期的书写增添了新的面向。</w:t>
-      </w:r>
-    </w:p>
-    <w:p>
-      <w:pPr>
-        <w:spacing w:line="400" w:lineRule="exact"/>
-        <w:ind w:firstLine="480"/>
-      </w:pPr>
-      <w:r>
-        <w:rPr>
-          <w:rFonts w:ascii="宋体" w:hAnsi="宋体"/>
-          <w:sz w:val="24"/>
-          <w:color w:val="FF0000"/>
-        </w:rPr>
-        <w:t xml:space="preserve">魏晋时期，宴中设百戏的做法延续了汉代以来的传统。《三国志·文帝纪》记载曹丕大飨六军及谯父老百姓，裴注引《魏书》言其中设“伎乐百戏”，文帝父崩不过半年即在宴会中采用百戏，可见其在宫廷娱乐中的地位之稳固。十六国时期，后赵石虎正会之仪也含有百戏元素，《十六国春秋》记其“设马车，立木橦其车上，橦头安两木伎儿，各坐木一头，或高飞，或倒挂”，这种以机关木偶模拟杂技动作的形式，反映出百戏在北方少数民族政权中的变异与延伸。北周宣帝更是“散乐杂戏鱼龙烂漫之伎常在目前”，并常令京城中俊秀少年着妇人服饰入殿歌舞，与后宫诸人一同观看。这些分散于各政权的记载表明，尽管魏晋南北朝政局动荡、罗帖发散，但百戏在宫廷宴享中的应用始终未曾中断，其受欢迎的程度不因改朝换代而有所消减。</w:t>
-      </w:r>
-    </w:p>
-    <w:p>
-      <w:pPr>
-        <w:spacing w:line="400" w:lineRule="exact"/>
-        <w:ind w:firstLine="480"/>
-      </w:pPr>
-      <w:r>
-        <w:rPr>
-          <w:rFonts w:ascii="楷体" w:eastAsia="楷体" w:hAnsi="楷体"/>
-          <w:color w:val="FF0000"/>
-          <w:sz w:val="24"/>
-        </w:rPr>
-        <w:t>（一）官署乐制与百戏的制度化接纳</w:t>
-      </w:r>
-    </w:p>
-    <w:p>
-      <w:pPr>
-        <w:spacing w:line="400" w:lineRule="exact"/>
-        <w:ind w:firstLine="480"/>
-      </w:pPr>
-      <w:r>
-        <w:rPr>
-          <w:rFonts w:ascii="宋体" w:hAnsi="宋体"/>
-          <w:sz w:val="24"/>
-        </w:rPr>
-        <w:t>北魏一朝对杂技百戏的制度化管理，在延续汉晋格局的基础上有所拓展。《魏书·乐志》载：</w:t>
-      </w:r>
-      <w:r>
-        <w:rPr>
-          <w:rStyle w:val="a30"/>
-        </w:rPr>
-        <w:footnoteReference w:id="2"/>
-      </w:r>
-    </w:p>
-    <w:p>
-      <w:pPr>
-        <w:spacing w:line="400" w:lineRule="exact"/>
-        <w:ind w:firstLine="480"/>
-      </w:pPr>
-      <w:r>
-        <w:rPr>
-          <w:rFonts w:ascii="楷体" w:eastAsia="楷体" w:hAnsi="楷体"/>
-          <w:sz w:val="24"/>
-        </w:rPr>
-        <w:t>六年冬，诏太乐、总章、鼓吹增修杂伎，造五兵、角抵、麒麟、凤凰、仙人、长蛇、白象、白虎及诸畏兽、鱼龙、辟邪、鹿马仙车、高絙百尺、长跷、缘橦、跳丸、五案以备百戏。大飨设之于殿庭，如汉晋之旧也。太宗初，又增修之，撰合大曲，更为钟鼓之节。</w:t>
-      </w:r>
-    </w:p>
-    <w:p>
-      <w:pPr>
-        <w:spacing w:line="400" w:lineRule="exact"/>
-        <w:ind w:firstLine="480"/>
-      </w:pPr>
-      <w:r>
-        <w:rPr>
-          <w:rFonts w:ascii="宋体" w:hAnsi="宋体"/>
-          <w:sz w:val="24"/>
-        </w:rPr>
-        <w:lastRenderedPageBreak/>
-        <w:t>天兴六年（403），道武帝拓跋珪诏令太乐、总章、鼓吹三署增修杂伎，这条记载包含三层值得深入辨析的信息。</w:t>
-      </w:r>
-    </w:p>
-    <w:p>
-      <w:pPr>
-        <w:spacing w:line="400" w:lineRule="exact"/>
-        <w:ind w:firstLine="480"/>
-      </w:pPr>
-      <w:r>
-        <w:rPr>
-          <w:rFonts w:ascii="宋体" w:hAnsi="宋体"/>
-          <w:sz w:val="24"/>
-        </w:rPr>
-        <w:t>首先，从管理归属来看，承担此次增修任务的太乐、总章、鼓吹三署均为北魏朝廷掌管乐舞的正式职能机构。杂技百戏被纳入其职掌范围，表明它并非游离于国家仪典之外的散漫娱乐，而是以官方行政力量加以组织和维系的制度性安排。过往学界在讨论北魏宫廷乐署时，往往侧重其在雅乐恢复方面的努力，但从这条材料来看，乐署的实际职能远不限于此，杂技百戏同样在其运作范围之内。天平二年（535），皇帝又特命时任尚书右仆射、营构大将的高隆之“缮治三署乐器、衣服及百戏之属”，朝廷不惜动用高级行政官员来专门修缮百戏器具与服饰，进一步印证了百戏在北魏宫廷仪典体系中的实际分量。百戏在传统礼乐话语中长期被视作俳优鄙艺，其制度地位与它所获得的实际待遇之间的落差，折射出拓跋鲜卑统治者对宫廷娱乐的态度，尽管政治制度层面积极推进汉化、尊崇雅乐，但在娱乐实践中并不以华夏儒者的雅俗判分为约束，对民间俗曲百戏始终保持开放与接纳的姿态。</w:t>
-      </w:r>
-    </w:p>
-    <w:p>
-      <w:pPr>
-        <w:spacing w:line="400" w:lineRule="exact"/>
-        <w:ind w:firstLine="480"/>
-      </w:pPr>
-      <w:r>
-        <w:rPr>
-          <w:rFonts w:ascii="宋体" w:hAnsi="宋体"/>
-          <w:sz w:val="24"/>
-        </w:rPr>
-        <w:t>其次，从节目内容来看，诏令所列名目在前代基础上有显著的扩充与新创。如“五兵”一目，所指为传说中蚩尤所创之戈、矛、戟、酋矛、夷矛五种兵器类表演，文中明确以“造”字冠之，当系此次新增之节目，而非对旧有项目的简单沿袭。傅起凤、傅腾龙在《中国杂技史》中据此推测“五兵角抵”属于以兵器为道具的技艺表演，结合汉代画像石中已经出现的弄丸弄剑图像来看，兵器入百戏并非毫无渊源，北魏将其正式列入诏令，更可能是在既有民间传统基础上加以提炼和规范化的结果。</w:t>
-      </w:r>
-    </w:p>
-    <w:p>
-      <w:pPr>
-        <w:spacing w:line="400" w:lineRule="exact"/>
-        <w:ind w:firstLine="480"/>
-      </w:pPr>
-      <w:r>
-        <w:rPr>
-          <w:rFonts w:ascii="宋体" w:hAnsi="宋体"/>
-          <w:sz w:val="24"/>
-        </w:rPr>
-        <w:t>再次，从体制形态来看，太宗明元帝时期“撰合大曲，更为钟鼓之节”的举措，开启了百戏与大型乐舞体制融合的新阶段。所谓“大曲”，并非单纯的器乐演奏或声乐吟唱，而是一种将歌、舞、乐融为一体的多段式综合表演结构。《乐府诗集·相和歌辞》大序所云“诸调曲皆有辞、有声，而大曲又有艳、有趋、有乱”，即揭示了大曲内部具有解、艳、趋、乱、和、送等分段衔接的乐章组织。北魏时期的大曲大体是在相和歌及清商曲的基础上衍化成型的，将杂技诸伎撰合于此种体制之中，意味着器乐演奏、歌唱、舞蹈与技艺表演在同一演出框架内实现了合流。这种多元表演形态的汇聚，客观上为后世更加成熟的综合性舞台艺术提供了重要的结构性前提，虽然其当时具体的编排程式与演出面貌已难以详考。</w:t>
-      </w:r>
-    </w:p>
-    <w:p>
-      <w:pPr>
-        <w:spacing w:line="400" w:lineRule="exact"/>
-        <w:ind w:firstLine="480"/>
-      </w:pPr>
-      <w:r>
-        <w:rPr>
-          <w:rFonts w:ascii="楷体" w:eastAsia="楷体" w:hAnsi="楷体"/>
-          <w:color w:val="FF0000"/>
-          <w:sz w:val="24"/>
-        </w:rPr>
-        <w:t>（二）禁令与实践之间的矛盾书写</w:t>
-      </w:r>
-    </w:p>
-    <w:p>
-      <w:pPr>
-        <w:spacing w:line="400" w:lineRule="exact"/>
-        <w:ind w:firstLine="480"/>
-      </w:pPr>
-      <w:r>
-        <w:rPr>
-          <w:rFonts w:ascii="宋体" w:hAnsi="宋体"/>
-          <w:sz w:val="24"/>
-        </w:rPr>
-        <w:t>如果说北魏的杂技书写侧重于制度层面的增修与规范，那么魏晋南北朝其他政权的文献则在另一个维度上展开，即禁令与实践之间的持续背离。</w:t>
-      </w:r>
-    </w:p>
-    <w:p>
-      <w:pPr>
-        <w:spacing w:line="400" w:lineRule="exact"/>
-        <w:ind w:firstLine="480"/>
-      </w:pPr>
-      <w:r>
-        <w:rPr>
-          <w:rFonts w:ascii="宋体" w:hAnsi="宋体"/>
-          <w:sz w:val="24"/>
-        </w:rPr>
-        <w:lastRenderedPageBreak/>
-        <w:t>《晋书·武帝纪》载，泰始元年（265）十二月，晋武帝下令禁乐府靡丽百戏之伎。然而《南齐书·乐志》所记晋代中朝元会之仪，却展示出截然不同的实况：</w:t>
-      </w:r>
-      <w:r>
-        <w:rPr>
-          <w:rStyle w:val="a30"/>
-        </w:rPr>
-        <w:footnoteReference w:id="3"/>
-      </w:r>
-      <w:r>
-        <w:rPr>
-          <w:rStyle w:val="a30"/>
-        </w:rPr>
-        <w:footnoteReference w:id="4"/>
-      </w:r>
-    </w:p>
-    <w:p>
-      <w:pPr>
-        <w:spacing w:line="400" w:lineRule="exact"/>
-        <w:ind w:firstLine="480"/>
-      </w:pPr>
-      <w:r>
-        <w:rPr>
-          <w:rFonts w:ascii="楷体" w:eastAsia="楷体" w:hAnsi="楷体"/>
-          <w:sz w:val="24"/>
-        </w:rPr>
-        <w:t>晋代中朝元会，设卧骑、倒骑、颠骑，自东华门驰往神虎门，此亦角抵杂戏之流也。</w:t>
-      </w:r>
-    </w:p>
-    <w:p>
-      <w:pPr>
-        <w:spacing w:line="400" w:lineRule="exact"/>
-        <w:ind w:firstLine="480"/>
-      </w:pPr>
-      <w:r>
-        <w:rPr>
-          <w:rFonts w:ascii="楷体" w:eastAsia="楷体" w:hAnsi="楷体"/>
-          <w:sz w:val="24"/>
-          <w:color w:val="FF0000"/>
-        </w:rPr>
-        <w:t>南梁武帝朝会宴的百戏曲目可为这种禁而不止提供更直接的佐证。据《隋书·音乐志》所载，梁元会宴乐除鞦、铎、拂、巾四种杂舞与白综外，其余演出项目几乎全为百戏，包括舞盘伎、舞轮伎、须弥山伎、跳铃伎、跳剑伎、掷倒伎、猕猴幢伎、缘高絘伎、变黄龙弄龟伎等三十余种，是现存文献中对单次朝会百戏节目记录最为完整的清单。这份清单的史料价值在于，它以条列的方式逐一标明每项伎艺的名目，使后人得以窥见南朝宫廷百戏在节目编排上已具有高度的组织性与多样性，其制度化程度远非零散的禁令所能遏止。</w:t>
-      </w:r>
-    </w:p>
-    <w:p>
-      <w:pPr>
-        <w:spacing w:line="400" w:lineRule="exact"/>
-        <w:ind w:firstLine="480"/>
-      </w:pPr>
-      <w:r>
-        <w:rPr>
-          <w:rFonts w:ascii="宋体" w:hAnsi="宋体"/>
-          <w:sz w:val="24"/>
-        </w:rPr>
-        <w:t>卧骑、倒骑、颠骑三项均为马上杂技，表演者须在疾驰的马背上完成仰卧、倒坐、翻转等高难度动作，而表演路线“自东华门驰往神虎门”，横贯宫城，规模不可谓不大。这些技艺被径称为角抵杂戏之流，与武帝所禁之靡丽百戏实为同类。禁令在前，元会照演在后，两条出自不同文献的记载相互照映，共同勾勒出禁断与实践之间深刻背离的面貌。禁令的措辞借助礼乐话语将百戏归入靡丽淫侈之列，以正风俗、崇节俭为由加以革除；而宫廷演出的实际延续则表明，百戏在朝会宴飨中所承担的仪典功能与娱乐价值，远非一纸诏书所能抹除。</w:t>
-      </w:r>
-    </w:p>
-    <w:p>
-      <w:pPr>
-        <w:spacing w:line="400" w:lineRule="exact"/>
-        <w:ind w:firstLine="480"/>
-      </w:pPr>
-      <w:r>
-        <w:rPr>
-          <w:rFonts w:ascii="宋体" w:hAnsi="宋体"/>
-          <w:sz w:val="24"/>
-        </w:rPr>
-        <w:t>这种禁而不止的格局，在南朝帝王身上表现得更为极端。南齐末帝萧宝卷对杂技的痴迷几乎到了不顾身体的程度。他不仅日常观赏百戏，更亲身习练竿木类高难技艺。据《南史》所载：</w:t>
-      </w:r>
-      <w:r>
-        <w:rPr>
-          <w:rStyle w:val="a30"/>
-        </w:rPr>
-        <w:footnoteReference w:id="5"/>
-      </w:r>
-    </w:p>
-    <w:p>
-      <w:pPr>
-        <w:spacing w:line="400" w:lineRule="exact"/>
-        <w:ind w:firstLine="480"/>
-      </w:pPr>
-      <w:r>
-        <w:rPr>
-          <w:rFonts w:ascii="楷体" w:eastAsia="楷体" w:hAnsi="楷体"/>
-          <w:sz w:val="24"/>
-        </w:rPr>
-        <w:t>能担幢，初学担幢，每倾倒，在幢杪者，必致踠伤。其后，白虎幢七丈五尺，齿上担之，折齿不倦。</w:t>
-      </w:r>
-    </w:p>
-    <w:p>
-      <w:pPr>
-        <w:spacing w:line="400" w:lineRule="exact"/>
-        <w:ind w:firstLine="480"/>
-      </w:pPr>
-      <w:r>
-        <w:rPr>
-          <w:rFonts w:ascii="宋体" w:hAnsi="宋体"/>
-          <w:sz w:val="24"/>
-        </w:rPr>
-        <w:t>“担幢”即肩扛或手持长竿，由体态轻盈且有舞蹈功底者攀援其上翻腾跳跃，持竿者须同时驾驭力量与平衡，方能保竿不坠，此技后世又称“缘橦”或“顶竿”，属杂技中难度极高的一类。萧宝卷初学时技法尚未纯熟，竿上之人常因倾倒而遭踠伤；其后日渐精进，竟在传统肩扛手持之外另辟新径，以口齿咬持七丈五尺的白虎幢木，大幅提升了平衡与力量的双重难度，弄得齿牙折损、口中流血仍乐此不疲。从技艺演进的角度观之，“齿上担幢”是对既有“担幢”技法的一次显著改进，以口部支撑替代肩臂承力，表演的惊险性与视觉冲击力随之陡增。《南史》的书写本意在于讽谏荒主、为亡国张本，然而史家无意间保存了一则从初学到精熟再到创新的完整习艺过程，为杂技史研究留下了极为罕见的帝王亲操实录。</w:t>
-      </w:r>
-      <w:r>
-        <w:rPr>
-          <w:rStyle w:val="a30"/>
-        </w:rPr>
-        <w:footnoteReference w:id="6"/>
-      </w:r>
-    </w:p>
-    <w:p>
-      <w:pPr>
-        <w:spacing w:line="400" w:lineRule="exact"/>
-        <w:ind w:firstLine="480"/>
-      </w:pPr>
-      <w:r>
-        <w:rPr>
-          <w:rFonts w:ascii="楷体" w:eastAsia="楷体" w:hAnsi="楷体"/>
-          <w:color w:val="FF0000"/>
-          <w:sz w:val="24"/>
-        </w:rPr>
-        <w:t>（三）物质文化视角下的百戏衣饰书写</w:t>
-      </w:r>
-    </w:p>
-    <w:p>
-      <w:pPr>
-        <w:spacing w:line="400" w:lineRule="exact"/>
-        <w:ind w:firstLine="480"/>
-      </w:pPr>
-      <w:r>
-        <w:rPr>
-          <w:rFonts w:ascii="宋体" w:hAnsi="宋体"/>
-          <w:sz w:val="24"/>
-        </w:rPr>
-        <w:t>值得注意的是，魏晋南北朝时期的杂技书写并未止步于制度沿革与演出实况，而是进一步触及了百戏的物质形态，尤其是服饰。这一维度在汉代文献中几</w:t>
-      </w:r>
-      <w:r>
-        <w:rPr>
-          <w:rFonts w:ascii="宋体" w:hAnsi="宋体"/>
-          <w:sz w:val="24"/>
-        </w:rPr>
-        <w:lastRenderedPageBreak/>
-        <w:t>乎完全缺席，至此时期方始露出端倪。《魏书》中一则宗室逾制的轶事，无意间保留了关于“百戏衣”的珍贵信息：</w:t>
-      </w:r>
-    </w:p>
-    <w:p>
-      <w:pPr>
-        <w:spacing w:line="400" w:lineRule="exact"/>
-        <w:ind w:firstLine="480"/>
-      </w:pPr>
-      <w:r>
-        <w:rPr>
-          <w:rFonts w:ascii="楷体" w:eastAsia="楷体" w:hAnsi="楷体"/>
-          <w:sz w:val="24"/>
-        </w:rPr>
-        <w:t>（乐浪王万寿）子忠，肃宗时，复前爵，位太常少卿。出帝泛舟天渊池，命宗室诸王陪宴。忠愚而无智，性好衣服，遂著红罗襦，绣作领，碧细，锦为缘。帝谓曰：“朝廷衣冠，应有常式，何为著百戏衣？”忠曰：“臣少来所爱，情存绮罗，歌衣舞服，是臣所愿。”帝曰：“人之无良，乃至此乎！”</w:t>
-      </w:r>
-    </w:p>
-    <w:p>
-      <w:pPr>
-        <w:spacing w:line="400" w:lineRule="exact"/>
-        <w:ind w:firstLine="480"/>
-      </w:pPr>
-      <w:r>
-        <w:rPr>
-          <w:rFonts w:ascii="宋体" w:hAnsi="宋体"/>
-          <w:sz w:val="24"/>
-        </w:rPr>
-        <w:t>出帝一望即辨出忠所穿为“百戏衣”，可知百戏服饰在当时已形成相对固定且辨识度极高的形制特征，与日常冠服迥然有别。据文中所述，忠身上所穿为红罗短襦、绣花衣领、碧色细布、锦缎滚边，红与碧大胆并置，锦、绣、罗等不同质地的面料拼合使用，整体效果浓艳纷繁、华丽夺目。这与朝廷冠服强调等级有序、色彩节制的规制截然不同。出帝斥之以“朝廷衣冠，应有常式”，恰好从反面勾勒出百戏衣的特殊定位，它自外于朝廷服制的等级序列，遵循的是另一套以色彩张力和视觉效果为导向的审美逻辑，服务于舞台表演中远距离观赏的需要。忠以“歌衣舞服，是臣所愿”作答，语虽戏谑，却也折射出百戏服饰在当时社会中的某种感染力，其绮丽绚烂的视觉效果足以令人心生向往，甚至不惜逾越服制。</w:t>
-      </w:r>
-    </w:p>
-    <w:p>
-      <w:pPr>
-        <w:spacing w:line="400" w:lineRule="exact"/>
-        <w:ind w:firstLine="480"/>
-      </w:pPr>
-      <w:r>
-        <w:rPr>
-          <w:rFonts w:ascii="宋体" w:hAnsi="宋体"/>
-          <w:sz w:val="24"/>
-        </w:rPr>
-        <w:t>这条材料虽不过寥寥数行，却将杂技百戏的文献书写从仪典程序和技艺名目，推进到了演出者着装与物质文化的层面。汉代百戏记载大多着眼于宏观的制度安排与节目陈列，对表演者个体的装束面貌几乎不著一字；而北魏此条轶闻的出现，标志着杂技书写开始触及更为具象、更为生活化的细节，为后人复原百戏演出的完整面貌提供了一重此前未曾显露的维度。</w:t>
-      </w:r>
-    </w:p>
-    <w:p>
-      <w:pPr>
-        <w:spacing w:before="140" w:after="140"/>
-      </w:pPr>
-      <w:r>
-        <w:rPr>
-          <w:rFonts w:ascii="黑体" w:eastAsia="黑体" w:hAnsi="黑体"/>
-          <w:color w:val="000000"/>
-          <w:sz w:val="28"/>
-          <w:szCs w:val="28"/>
-        </w:rPr>
-        <w:t>三、隋唐：杂技记载的丰富与细化</w:t>
-      </w:r>
-    </w:p>
-    <w:p>
-      <w:pPr>
-        <w:spacing w:line="400" w:lineRule="exact"/>
-        <w:ind w:firstLine="480"/>
-      </w:pPr>
-      <w:r>
-        <w:rPr>
-          <w:rFonts w:ascii="宋体" w:hAnsi="宋体"/>
-          <w:sz w:val="24"/>
-        </w:rPr>
-        <w:t>隋唐两代是杂技在史籍中记载最为丰富的时期。与魏晋南北朝文献多在制度沿革或禁令颁行的语境中附带提及百戏不同，隋唐史料对杂技的记述呈现出明显的细化趋势，节目名目不再仅以类名笼统概括，而是逐一记录其演出过程、技术细节与现场反应；书写者的态度与情感也不再隐藏在制度性话语之后，而是通过叙述方式的变化得以体现。这种记载方式的转变，既与隋唐百戏本身在规模和技艺上的空前发展有关，也与这一时期文献体例的变化密切相关，笔记体著述日渐兴盛，为杂技这类难以完全纳入正史志书体例的表演艺术提供了更为灵活的记录空间。</w:t>
-      </w:r>
-    </w:p>
-    <w:p>
-      <w:pPr>
-        <w:spacing w:line="400" w:lineRule="exact"/>
-        <w:ind w:firstLine="480"/>
-      </w:pPr>
-      <w:r>
-        <w:rPr>
-          <w:rFonts w:ascii="宋体" w:hAnsi="宋体"/>
-          <w:sz w:val="24"/>
-          <w:color w:val="FF0000"/>
-        </w:rPr>
-        <w:t>隋唐时百戏在宴乐中的重兴除正史与《教坊记》外，亦见于《明皇杂录》《乐府杂录》等对酺宴、广场百戏的记载，杂技书写的载体与层次更为丰富。</w:t>
-      </w:r>
-    </w:p>
-    <w:p>
-      <w:pPr>
-        <w:spacing w:line="400" w:lineRule="exact"/>
-        <w:ind w:firstLine="480"/>
-      </w:pPr>
-      <w:r>
-        <w:rPr>
-          <w:rFonts w:ascii="宋体" w:hAnsi="宋体"/>
-          <w:sz w:val="24"/>
-          <w:color w:val="FF0000"/>
-        </w:rPr>
-        <w:t xml:space="preserve">玄宗朝的酺宴百戏尤为壮观。《资治通鉴》载其酺宴“先设太常雅乐坐部、立部，继以鼓吹、胡乐、教坊、府县散乐、杂戏”，又出宫人舞《霆裳羽衣》，教舞马百匹衔杯上寿，引犀象入场或拜或舞。郑綮《开天传信记》称“百戏竞作，人物填咽”，《明皇杂录》记“大陈山车旱船，寻撞走索，丸剑角抵，戏马斗鸡”，又令宫女数百击雷鼓为《破阵乐》等曲，场面极为壮观。《乐府杂录》更言“观者数千万众，喧哗聚语，莫得闻鱼龙百戏之音”，可见酺宴观演的规模之大。值得注意的是，尽管百戏在酺宴中扮演着不可或缺的角色，其在制度话语中的地位却始终偶尬。《唐会要》载“散乐历代有之，谓之百戏”，玄宗以其非“正声”，从太常寺中别出，另置教坊于禁中以管辖。这一安排意味着百戏在制度层面被明确排斥在雅乐体系之外，却在实践中获得了专门的组织机构和演出空间，这种名实之间的张力，与汉代以来百戏在礼乐话语与实际演出之间的落差一脉相承。</w:t>
-      </w:r>
-    </w:p>
-    <w:p>
-      <w:pPr>
-        <w:spacing w:line="400" w:lineRule="exact"/>
-        <w:ind w:firstLine="480"/>
-      </w:pPr>
-      <w:r>
-        <w:rPr>
-          <w:rFonts w:ascii="楷体" w:eastAsia="楷体" w:hAnsi="楷体"/>
-          <w:color w:val="FF0000"/>
-          <w:sz w:val="24"/>
-        </w:rPr>
-        <w:t>（一）节庆宴享与百戏的宏大叙事</w:t>
-      </w:r>
-    </w:p>
-    <w:p>
-      <w:pPr>
-        <w:spacing w:line="400" w:lineRule="exact"/>
-        <w:ind w:firstLine="480"/>
-      </w:pPr>
-      <w:r>
-        <w:rPr>
-          <w:rFonts w:ascii="宋体" w:hAnsi="宋体"/>
-          <w:sz w:val="24"/>
-        </w:rPr>
-        <w:lastRenderedPageBreak/>
-        <w:t>隋炀帝大业年间的百戏盛会，是杂技记载由简略走向详细的一个重要节点。《隋书·音乐下》详载大业二年（606）突厥启民可汗（染干）来朝时的演出情况：</w:t>
-      </w:r>
-      <w:r>
-        <w:rPr>
-          <w:rStyle w:val="a30"/>
-        </w:rPr>
-        <w:footnoteReference w:id="7"/>
-      </w:r>
-    </w:p>
-    <w:p>
-      <w:pPr>
-        <w:spacing w:line="400" w:lineRule="exact"/>
-        <w:ind w:firstLine="480"/>
-      </w:pPr>
-      <w:r>
-        <w:rPr>
-          <w:rFonts w:ascii="楷体" w:eastAsia="楷体" w:hAnsi="楷体"/>
-          <w:sz w:val="24"/>
-        </w:rPr>
-        <w:t>及大业二年，突厥染干来朝，炀帝欲夸之，总追四方散乐，大集东都。初于芳华苑积翠池侧，帝帷宫女观之。有舍利先来，戏于场内，须臾跳跃，激水满衢，鼋鼍龟鳖，水人虫鱼，遍覆于地。又有大鲸鱼，喷雾翳日，倏忽化成黄龙，长七八丈，耸踊而出，名曰黄龙变。又以绳系两柱，相去十丈，遣二倡女对舞绳上，相逢切肩而过，歌舞不辍。又为夏育扛鼎，取车轮石臼大瓮器等，各于掌上而跳弄之。并二人戴竿，其上有舞，忽然腾透而换易之。又有神鳌负山，幻人吐火，千变万化，旷古莫俦。染干大骇之，自是皆于太常教习。每岁正月，万国来朝，留至十五日，于端门外，建国门内，绵亘八里，列为戏场。</w:t>
-      </w:r>
-    </w:p>
-    <w:p>
-      <w:pPr>
-        <w:spacing w:line="400" w:lineRule="exact"/>
-        <w:ind w:firstLine="480"/>
-      </w:pPr>
-      <w:r>
-        <w:rPr>
-          <w:rFonts w:ascii="宋体" w:hAnsi="宋体"/>
-          <w:sz w:val="24"/>
-        </w:rPr>
-        <w:t>这段文字是现存史籍中对单次百戏演出描写最为完整的段落之一，其叙述方式和包含的信息值得从多个层面加以分析。</w:t>
-      </w:r>
-    </w:p>
-    <w:p>
-      <w:pPr>
-        <w:spacing w:line="400" w:lineRule="exact"/>
-        <w:ind w:firstLine="480"/>
-      </w:pPr>
-      <w:r>
-        <w:rPr>
-          <w:rFonts w:ascii="宋体" w:hAnsi="宋体"/>
-          <w:sz w:val="24"/>
-        </w:rPr>
-        <w:t>从演出背景来看，此次百戏汇演的直接目的是夸之，即炀帝意图以百戏的宏大场面向突厥来使展示国力。“总追四方散乐，大集东都”一句点明了演出人员的来源，并非仅依靠东都洛阳本地的太常乐署班底，而是将分散在各地的民间散乐全部征集而来。这一做法本身说明了隋代散乐百戏的存在方式，大量技艺精湛的杂技艺人平时分散于各地，并不完全依附于宫廷乐署体制，只有朝廷以行政力量统一征召，才能汇聚成如此大的演出规模。也就是说，宫廷百戏的兴盛并非单纯依靠官方机构的内部培养，而是建立在广泛的民间技艺基础之上。</w:t>
-      </w:r>
-    </w:p>
-    <w:p>
-      <w:pPr>
-        <w:spacing w:line="400" w:lineRule="exact"/>
-        <w:ind w:firstLine="480"/>
-      </w:pPr>
-      <w:r>
-        <w:rPr>
-          <w:rFonts w:ascii="宋体" w:hAnsi="宋体"/>
-          <w:sz w:val="24"/>
-          <w:color w:val="FF0000"/>
-        </w:rPr>
-        <w:t xml:space="preserve">除朝廷直接组织外，地方官员的咄使也助推了百戏演出的社会化扩展。大业三年，裴矩因蓻夷来朝贡者众多，讽帝令都下大设百戏，征四方奇技异艺陈于端门街，观者“衣锦绮、珥金翠者，以十数万”，且勒令三市店铺“皆设帷帐，盛列酒食”，遣掌藩率蓻夷与民贸易，“蓻夷嗟叹，谓中国为神仙”。这条记载表明，百戏在隋代的外交性展演已不仅局限于宫廷内部，而是扩展至都城街市，成为一种动员全城的综合性景观。市民与蓻夷共同观演、共同交易，百戏在此已超越了单纯的宫廷仪典层面，成为帝国繁华形象的整体营造手段。</w:t>
-      </w:r>
-    </w:p>
-    <w:p>
-      <w:pPr>
-        <w:spacing w:line="400" w:lineRule="exact"/>
-        <w:ind w:firstLine="480"/>
-      </w:pPr>
-      <w:r>
-        <w:rPr>
-          <w:rFonts w:ascii="宋体" w:hAnsi="宋体"/>
-          <w:sz w:val="24"/>
-          <w:color w:val="FF0000"/>
-        </w:rPr>
-        <w:t xml:space="preserve">此后数年间，隋炀帝以百戏宴外蓩的规模持续升级。大业三年秋，宴启民及其部落三千五百人，奏百戏之乐；五年六月，于观风行殿盛陈文物，奏九部乐，设鱼龙蔓延，蛮夷陪列者三十余国；六年正月，诸夷大献方物，突厥启民以下皆国主亲来朝贺，“乃于天津街盛陈百戏，自海内凡有奇伎，无不总萃……金石匈革之声，闻数十里外。弹弦擫管以上，一万八千人。大列炬火，光烛天地，百戏之盛，振古无比。自是每年以为常”。“振古无比”四字是史家对百戏演出规模所作的绝对化评价，它不仅标示了隋代百戏在演出史上的巅峰地位，也折射出书写者面对这一前所未有的盛况时难以自抑的惊叹——杂技书写在此已不止于客观记录，而开始带有鲜明的情感色彩。</w:t>
-      </w:r>
-    </w:p>
-    <w:p>
-      <w:pPr>
-        <w:spacing w:line="400" w:lineRule="exact"/>
-        <w:ind w:firstLine="480"/>
-      </w:pPr>
-      <w:r>
-        <w:rPr>
-          <w:rFonts w:ascii="宋体" w:hAnsi="宋体"/>
-          <w:sz w:val="24"/>
-        </w:rPr>
-        <w:t>从节目内容来看，这段文字以又字连缀，依次列举了水戏幻化（舍利戏水、黄龙变）、绳技（二倡女对舞绳上）、力技（夏育扛鼎、掌上跳弄重物）、竿技（戴竿腾透换易）、幻术（神鳌负山、幻人吐火）等多个类别。其中“黄龙变”一目值得特别注意，大鲸鱼先以喷雾营造弥漫之势，随即“倏忽化成黄龙，长七八丈，耸踊而出”，在观者眼前完成鱼龙之间的瞬间变化。这与汉代张衡《西京赋》所写“鱼龙曼延”的描述前后相通，但远比张衡的赋体铺陈更为具体，不仅交代了变化的起始形态（鲸鱼）、过渡手段（喷雾翳日）和最终结果（黄龙耸踊），还给出了七八丈这样的尺寸数据，使得表演的视觉规模有了较为具体的参照。这种从修辞性描写向实录性记载的转变，是隋唐杂技书写区别于汉代赋体叙述的一个重要特征。绳技一目中“相逢切肩而过，歌舞不辍”八字，以简短的篇幅便呈现了两名倡女在十丈高空的绳索上相向而行、擦肩交会而舞姿不乱的场面，信息量远超此前各类文献中对绳技的概括性提及。竿技一目“忽然腾透而换易之”，</w:t>
-      </w:r>
-      <w:r>
-        <w:rPr>
-          <w:rFonts w:ascii="宋体" w:hAnsi="宋体"/>
-          <w:sz w:val="24"/>
-        </w:rPr>
-        <w:lastRenderedPageBreak/>
-        <w:t>则以极简的笔墨记录了竿上舞者在两根竿之间凌空飞换的动作，较之北魏文献中仅以“缘橦”二字概括的写法，描写的精细程度已有明显提升。</w:t>
-      </w:r>
-    </w:p>
-    <w:p>
-      <w:pPr>
-        <w:spacing w:line="400" w:lineRule="exact"/>
-        <w:ind w:firstLine="480"/>
-      </w:pPr>
-      <w:r>
-        <w:rPr>
-          <w:rFonts w:ascii="宋体" w:hAnsi="宋体"/>
-          <w:sz w:val="24"/>
-        </w:rPr>
-        <w:t>从演出效果来看，染干大骇之四字值得关注。百戏在此不仅是宫廷娱乐，而且被明确赋予了外交展示的功能；突厥来使的大骇正是炀帝欲夸之意图的实现。而文末“自是皆于太常教习”一句，则揭示了此次盛会的另一重后果，演出结束后，原本分散各地的民间散乐并未遣返原籍，而是被统一纳入太常寺进行常规教习训练。这意味着大业二年的百戏汇演不仅是一场外交性质的一次性表演，也成为隋代将散乐百戏正式纳入国家乐署体制的一个契机。“每岁正月，万国来朝，留至十五日”的常态化安排，以及“端门外、建国门内，绵亘八里”的固定演出空间，均表明百戏自此由偶发的征召式演出转变为年度性的制度化活动。八里之长的戏场规模，即便考虑到史书记载中可能存在的夸大成分，也足以说明隋代百戏在空间组织上已达到相当高的水平。</w:t>
-      </w:r>
-    </w:p>
-    <w:p>
-      <w:pPr>
-        <w:spacing w:line="400" w:lineRule="exact"/>
-        <w:ind w:firstLine="480"/>
-      </w:pPr>
-      <w:r>
-        <w:rPr>
-          <w:rFonts w:ascii="宋体" w:hAnsi="宋体"/>
-          <w:sz w:val="24"/>
-        </w:rPr>
-        <w:t>入唐之后，百戏的制度化管理进一步完善。唐代设左右教坊，将各类表演技艺分别管辖，杂技百戏不再附属于太常寺的雅乐系统，而是在教坊体制下获得了相对独立的组织空间。《旧唐书》《新唐书》均有关于教坊制度的详细记载。崔令钦所撰《教坊记》以笔记体裁专门记录教坊的演出情况与日常运作，为杂技记载提供了正史志书所不能容纳的具体细节。其中关于竿技的一则记载值得注意：“上偏私在左厢，故楼下戏，右厢竿木多失落。”玄宗观赏楼下百戏时，目光偏向左教坊一侧，右教坊的竿技艺人因此频频失手。这条记录看似只是一则演出轶事，实际上说明了两个问题。第一，竿技在盛唐时期隶属右教坊管辖，左右教坊各有分工，杂技门类的行政归属已有明确划分；第二，帝王的注视方向直接影响到演出质量，这从侧面反映了教坊艺人高度依附于皇权好恶的处境，御前演出的压力之大，以至于天子目光的些许偏移便足以干扰技艺发挥。</w:t>
-      </w:r>
-      <w:r>
-        <w:rPr>
-          <w:rStyle w:val="a30"/>
-        </w:rPr>
-        <w:footnoteReference w:id="8"/>
-      </w:r>
-    </w:p>
-    <w:p>
-      <w:pPr>
-        <w:spacing w:line="400" w:lineRule="exact"/>
-        <w:ind w:firstLine="480"/>
-      </w:pPr>
-      <w:r>
-        <w:rPr>
-          <w:rFonts w:ascii="宋体" w:hAnsi="宋体"/>
-          <w:sz w:val="24"/>
-          <w:color w:val="FF0000"/>
-        </w:rPr>
-        <w:t xml:space="preserve">现存文献还记载了武则天朝以百戏接待外藩的实例。据《旧唐书》，吐蕃遣使论弥萨等人朝请求和，则天宴之于麟德殿，奏百戏于殿庭。吐蕃使者表示“臣生于边荒，由来不识中国音乐”，乞求亲观，观后“相视笑忔拜谢”，称“得亲观奇乐，一生所未见”。次年吐蕃即献马千匹、金二千两以求婚。虽史书未直言夸示，但结合当时唐在与吐蕃之战中的胜利背景，这场百戏展演的外交夸示功能不言而喻。这表明，从汉武帝到武则天，以百戏夸示外宾的传统贯穿了数百年，其核心逻辑始终是借视觉奇观的震撼力来塑造帝国形象。</w:t>
-      </w:r>
-    </w:p>
-    <w:p>
-      <w:pPr>
-        <w:spacing w:line="400" w:lineRule="exact"/>
-        <w:ind w:firstLine="480"/>
-      </w:pPr>
-      <w:r>
-        <w:rPr>
-          <w:rFonts w:ascii="宋体" w:hAnsi="宋体"/>
-          <w:sz w:val="24"/>
-        </w:rPr>
-        <w:t>《教坊记》中关于小儿竿技的一段记述，更是将盛唐杂技记载的细致程度推到了一个新的高度：</w:t>
-      </w:r>
-      <w:r>
-        <w:rPr>
-          <w:rStyle w:val="a30"/>
-        </w:rPr>
-        <w:footnoteReference w:id="9"/>
-      </w:r>
-    </w:p>
-    <w:p>
-      <w:pPr>
-        <w:spacing w:line="400" w:lineRule="exact"/>
-        <w:ind w:firstLine="480"/>
-      </w:pPr>
-      <w:r>
-        <w:rPr>
-          <w:rFonts w:ascii="楷体" w:eastAsia="楷体" w:hAnsi="楷体"/>
-          <w:sz w:val="24"/>
-        </w:rPr>
-        <w:t>上于天津桥南设帐殿，酺三日。教坊一小儿，筋斗绝伦，乃衣以彩缯，梳洗，杂于内妓中。少顷，缘长竿上，倒立，寻复去手。久之，垂手抱竿，翻身而下。乐人等皆舍所执，宛转于地，大呼万岁，百官拜庆。中使宣旨云：“此技尤难，近教坊教成。”其实乃小儿也。</w:t>
-      </w:r>
-    </w:p>
-    <w:p>
-      <w:pPr>
-        <w:spacing w:line="400" w:lineRule="exact"/>
-        <w:ind w:firstLine="480"/>
-      </w:pPr>
-      <w:r>
-        <w:rPr>
-          <w:rFonts w:ascii="宋体" w:hAnsi="宋体"/>
-          <w:sz w:val="24"/>
-        </w:rPr>
-        <w:t>这段记述的突出之处，在于它几乎以一种戏剧化的节奏来安排整场演出的叙述。先写准备，小儿被穿上彩色丝织衣物、精心梳洗，混在内妓之中，有意隐藏其真实身份；再写攀升，“缘长竿上，倒立”已属高难技巧，“寻复去手”则在倒立的基础上进一步撤去手部支撑，难度又增一层；接写高潮，“久之”二字延</w:t>
-      </w:r>
-      <w:r>
-        <w:rPr>
-          <w:rFonts w:ascii="宋体" w:hAnsi="宋体"/>
-          <w:sz w:val="24"/>
-        </w:rPr>
-        <w:t>长了悬停的时间感，使旁观者的紧张感随之积累，而后“垂手抱竿，翻身而下”以干脆利落的动作结束全程。最后写反响，乐人放下手中乐器伏地欢呼，百官拜庆，中使宣旨揭开谜底，“其实乃小儿也。”书写者有意将小儿的真实身份保留到最后一句才予以揭示，使整段叙述形成了设悬、展演、揭晓的完整结构。小儿体态轻便、身形灵活，适合在竿顶完成倒立和无手悬停等对平衡能力要求极高的动作，而教坊特意将其装扮为成年女妓的样貌混入队列，本身就是一种经过设计的表演策略；观众在不知情的状态下观看高难技艺，等到谜底揭开，得知表演者竟是年幼孩童，惊叹之情随之加倍。这种叙述方式已不再是对演出事实的简单记录，而是带有明确的写作构思和情感引导，说明杂技书写在盛唐时期已从单纯的制度性记录发展为兼具文学性与现场感的叙事，</w:t>
-      </w:r>
-      <w:r>
-        <w:rPr>
-          <w:rFonts w:ascii="宋体" w:hAnsi="宋体"/>
-          <w:sz w:val="24"/>
-          <w:color w:val="FF0000"/>
-        </w:rPr>
-        <w:t xml:space="preserve">这种带有明确写作构思与情感引导的记述表明，盛唐时期的杂技书写已深刻介入了观演双方的心理互动，从单纯的制度性记录蜕变为兼具文学性与现场感的叙事。</w:t>
-      </w:r>
-    </w:p>
-    <w:p>
-      <w:pPr>
-        <w:spacing w:line="400" w:lineRule="exact"/>
-        <w:ind w:firstLine="480"/>
-      </w:pPr>
-      <w:r>
-        <w:rPr>
-          <w:rFonts w:ascii="宋体" w:hAnsi="宋体"/>
-          <w:sz w:val="24"/>
-        </w:rPr>
-        <w:t>此外，《封氏闻见记》《朝野佥载》等唐代笔记亦保存了不少杂技表演的第一手材料。《尚书故实》载有一则故事：</w:t>
-      </w:r>
-    </w:p>
-    <w:p>
-      <w:pPr>
-        <w:spacing w:line="400" w:lineRule="exact"/>
-        <w:ind w:firstLine="480"/>
-      </w:pPr>
-      <w:r>
-        <w:rPr>
-          <w:rFonts w:ascii="楷体" w:eastAsia="楷体" w:hAnsi="楷体"/>
-          <w:sz w:val="24"/>
-        </w:rPr>
-        <w:t>章仇兼琼镇蜀日，佛寺设大会，百戏在庭。有十岁童儿（一作女童）舞于竿杪。忽有物状如雕鹗，掠之而去。群众大骇，因而罢乐。后数日，其父母见在高塔之上，梯而取之，则神如痴，久之方语，云：‘见如壁画飞天夜叉者将入塔由，日饲果实饮馔之味，亦不知其所自。’旬日方精神如初。</w:t>
-      </w:r>
-    </w:p>
-    <w:p>
-      <w:pPr>
-        <w:spacing w:line="400" w:lineRule="exact"/>
-        <w:ind w:firstLine="480"/>
-      </w:pPr>
-      <w:r>
-        <w:rPr>
-          <w:rFonts w:ascii="宋体" w:hAnsi="宋体"/>
-          <w:sz w:val="24"/>
-        </w:rPr>
-        <w:t>长竿戏的难度既高，对表演者的要求也相应严格，表演过程中的危险性不言而喻。这则记载虽然带有志怪色彩（以飞天夜叉的传奇叙事来解释儿童失踪的缘由），但其背后所反映的问题却是真实的，在高竿之上演出的幼童极易遭遇意外，围观者只能将无法解释的突发事件归于神异。这类记载的存在，从另一个侧面说明了长竿戏的高风险性质，以及当时社会对这种风险的认知方式。</w:t>
-      </w:r>
-    </w:p>
-    <w:p>
-      <w:pPr>
-        <w:spacing w:line="400" w:lineRule="exact"/>
-        <w:ind w:firstLine="480"/>
-      </w:pPr>
-      <w:r>
-        <w:rPr>
-          <w:rFonts w:ascii="楷体" w:eastAsia="楷体" w:hAnsi="楷体"/>
-          <w:color w:val="FF0000"/>
-          <w:sz w:val="24"/>
-        </w:rPr>
-        <w:t>（二）国家衰落与杂技书写的情感转向</w:t>
-      </w:r>
-    </w:p>
-    <w:p>
-      <w:pPr>
-        <w:spacing w:line="400" w:lineRule="exact"/>
-        <w:ind w:firstLine="480"/>
-      </w:pPr>
-      <w:r>
-        <w:rPr>
-          <w:rFonts w:ascii="宋体" w:hAnsi="宋体"/>
-          <w:sz w:val="24"/>
-        </w:rPr>
-        <w:t>安史之乱的爆发，使盛唐百戏的繁荣景象发生了根本性的转变。姚汝能《安禄山事迹》中的一段记载，集中呈现了这场战乱对宫廷杂技艺人的打击：</w:t>
-      </w:r>
-      <w:r>
-        <w:rPr>
-          <w:rStyle w:val="a30"/>
-        </w:rPr>
-        <w:footnoteReference w:id="10"/>
-      </w:r>
-    </w:p>
-    <w:p>
-      <w:pPr>
-        <w:spacing w:line="400" w:lineRule="exact"/>
-        <w:ind w:firstLine="480"/>
-      </w:pPr>
-      <w:r>
-        <w:rPr>
-          <w:rFonts w:ascii="楷体" w:eastAsia="楷体" w:hAnsi="楷体"/>
-          <w:sz w:val="24"/>
-        </w:rPr>
-        <w:t>其乐人本玄宗所赐，皆非人间之伎，转相教习，得五百余人。或一人肩负首戴二十四人，戴竿长百余尺，至于竿杪，人腾掷如猿狖、飞鸟之势，竟为奇绝，累日不惮，观者汗流目眩。于是此辈歼矣。</w:t>
-      </w:r>
-    </w:p>
-    <w:p>
-      <w:pPr>
-        <w:spacing w:line="400" w:lineRule="exact"/>
-        <w:ind w:firstLine="480"/>
-      </w:pPr>
-      <w:r>
-        <w:rPr>
-          <w:rFonts w:ascii="宋体" w:hAnsi="宋体"/>
-          <w:sz w:val="24"/>
-        </w:rPr>
-        <w:t>这段文字的叙述结构值得注意。前半段集中描写技艺的高超，先以“皆非人间之伎”总括其技艺水准，继而以“一人肩负首戴二十四人”的具体数字呈现竿技的规模，再以“腾掷如猿狖、飞鸟之势”的比喻刻画竿上表演者凌空翻腾的灵活身姿，“累日不惮”说明其体力的持久，“观者汗流目眩”则从旁观者的身体反应来反衬演出的惊险。如此层层推进，将五百余名乐伎的技艺水平渲染至极。然而就在此处，笔锋突然一转，仅以“于是此辈歼矣”五字作结。彼时安禄山精</w:t>
-      </w:r>
-      <w:r>
-        <w:rPr>
-          <w:rFonts w:ascii="宋体" w:hAnsi="宋体"/>
-          <w:sz w:val="24"/>
-        </w:rPr>
-        <w:t>锐尽出南下，后方空虚，奚、契丹二部乘隙袭扰范阳，这批乐伎原系玄宗所赐、历经府中数年转相传授而技艺日精，竟在此次兵祸中全部遇难。前文的浓墨重彩与末句的简短冷峻之间形成了强烈的反差，技艺的精妙与命运的残酷在几行之内骤然碰撞。这种写法并非偶然，书写者显然借助叙述节奏的急剧转换来传达深切的惋惜，技艺愈是精绝，其毁灭便愈令人痛惜。从杂技书写的发展来看，这段记载标志着一个值得注意的变化，书写者不再仅仅作为事实的客观记录者，而是通过叙述方式的选择来表达自身的情感判断，杂技书写由此获得了一种此前较为少见的主观维度。</w:t>
-      </w:r>
-    </w:p>
-    <w:p>
-      <w:pPr>
-        <w:spacing w:line="400" w:lineRule="exact"/>
-        <w:ind w:firstLine="480"/>
-      </w:pPr>
-      <w:r>
-        <w:rPr>
-          <w:rFonts w:ascii="宋体" w:hAnsi="宋体"/>
-          <w:sz w:val="24"/>
-        </w:rPr>
-        <w:t>安史之乱对百戏的影响不仅表现为艺人群体的骤然消亡，还在此后数十年间持续动摇着宫廷杂技的制度基础。代宗驾崩、德宗即位（779）之时，朝廷正处于战后恢复的困难阶段，连年战乱使国库空虚，而周边各国的朝贡往来也远不及开元、天宝年间之盛。教坊赖以维持的两大条件，即充足的财力供养与频繁的外交仪典需求，同时削弱，其规模的缩减已成必然。《旧唐书·德宗纪》载其即位之初的一系列裁减措施：</w:t>
-      </w:r>
-    </w:p>
-    <w:p>
-      <w:pPr>
-        <w:spacing w:line="400" w:lineRule="exact"/>
-        <w:ind w:firstLine="480"/>
-      </w:pPr>
-      <w:r>
-        <w:rPr>
-          <w:rFonts w:ascii="楷体" w:eastAsia="楷体" w:hAnsi="楷体"/>
-          <w:sz w:val="24"/>
-        </w:rPr>
-        <w:t>德宗皇帝……去无名之费，罢不急之官，出永巷之嫔嫱，放文单之驯象，减太官之膳，戒服玩之奢，解鹰犬而放伶伦，止榷酤而绝贡奉。</w:t>
-      </w:r>
-      <w:r>
-        <w:rPr>
-          <w:rStyle w:val="a30"/>
-        </w:rPr>
-        <w:footnoteReference w:id="11"/>
-      </w:r>
-    </w:p>
-    <w:p>
-      <w:pPr>
-        <w:spacing w:line="400" w:lineRule="exact"/>
-        <w:ind w:firstLine="480"/>
-      </w:pPr>
-      <w:r>
-        <w:rPr>
-          <w:rFonts w:ascii="宋体" w:hAnsi="宋体"/>
-          <w:sz w:val="24"/>
-        </w:rPr>
-        <w:t>放伶伦即遣散宫廷乐舞艺人。这道政令将百戏伶人与鹰犬、驯象并列在裁撤项目之中，其措辞方式值得注意，在德宗朝的行政话语中，宫廷百戏已从汉隋以来外交仪典中重要的组成部分，降为与禽兽玩好同类的非必要开支。这一定位的变化本身便反映出安史之乱后朝廷对百戏功能认识的转变，当国力衰退、外交活动减少时，百戏所承担的政治展示功能随之消退，其在朝廷话语中的位置便迅速从仪典需要变为奢侈浪费。盛唐时期教坊体制下以国家行政力量系统培养、管理杂技人才的模式，至此已难以继续维持。大量技艺精湛的艺人被遣出宫廷流入民间，百戏的重心从宫廷再度向市井转移，为此后晚唐五代民间杂技的发展埋下了伏笔。</w:t>
+        <w:t>迅速从仪典需要变为奢侈浪费。盛唐时期教坊体制下以国家行政力量系统培养、管理杂技人才的模式，至此已难以继续维持。大量技艺精湛的艺人被遣出宫廷流入民间，百戏的重心从宫廷再度向市井转移，为此后晚唐五代民间杂技的发展埋下了伏笔。</w:t>
       </w:r>
     </w:p>
     <w:sectPr>

</xml_diff>